<commit_message>
feat(renderer): add per-template cover_row_height override
Each template spec can now declare its own cover_row_height (in twips),
falling back to the global style default. Existing 3 employment templates
explicitly set 700 (no visual change). Wyoming set to 403 (0.28 inches)
so the cover page fits on one page.

Indiana Jones approach: all existing templates pinned to their current
height before changing Wyoming's, so nothing moves except what we swap.
</commit_message>
<xml_diff>
--- a/content/templates/openagreements-employee-ip-inventions-assignment/template.docx
+++ b/content/templates/openagreements-employee-ip-inventions-assignment/template.docx
@@ -112,6 +112,8 @@
                 <w:rFonts w:ascii="Arial" w:cs="Arial" w:eastAsia="Arial" w:hAnsi="Arial"/>
                 <w:b/>
                 <w:bCs/>
+                <w:i w:val="false"/>
+                <w:iCs w:val="false"/>
                 <w:color w:val="1D2021"/>
                 <w:sz w:val="22"/>
                 <w:szCs w:val="22"/>
@@ -186,6 +188,8 @@
                 <w:rFonts w:ascii="Arial" w:cs="Arial" w:eastAsia="Arial" w:hAnsi="Arial"/>
                 <w:b/>
                 <w:bCs/>
+                <w:i w:val="false"/>
+                <w:iCs w:val="false"/>
                 <w:color w:val="1D2021"/>
                 <w:sz w:val="22"/>
                 <w:szCs w:val="22"/>
@@ -260,6 +264,8 @@
                 <w:rFonts w:ascii="Arial" w:cs="Arial" w:eastAsia="Arial" w:hAnsi="Arial"/>
                 <w:b/>
                 <w:bCs/>
+                <w:i w:val="false"/>
+                <w:iCs w:val="false"/>
                 <w:color w:val="1D2021"/>
                 <w:sz w:val="22"/>
                 <w:szCs w:val="22"/>
@@ -334,6 +340,8 @@
                 <w:rFonts w:ascii="Arial" w:cs="Arial" w:eastAsia="Arial" w:hAnsi="Arial"/>
                 <w:b/>
                 <w:bCs/>
+                <w:i w:val="false"/>
+                <w:iCs w:val="false"/>
                 <w:color w:val="1D2021"/>
                 <w:sz w:val="22"/>
                 <w:szCs w:val="22"/>
@@ -408,6 +416,8 @@
                 <w:rFonts w:ascii="Arial" w:cs="Arial" w:eastAsia="Arial" w:hAnsi="Arial"/>
                 <w:b/>
                 <w:bCs/>
+                <w:i w:val="false"/>
+                <w:iCs w:val="false"/>
                 <w:color w:val="1D2021"/>
                 <w:sz w:val="22"/>
                 <w:szCs w:val="22"/>
@@ -482,6 +492,8 @@
                 <w:rFonts w:ascii="Arial" w:cs="Arial" w:eastAsia="Arial" w:hAnsi="Arial"/>
                 <w:b/>
                 <w:bCs/>
+                <w:i w:val="false"/>
+                <w:iCs w:val="false"/>
                 <w:color w:val="1D2021"/>
                 <w:sz w:val="22"/>
                 <w:szCs w:val="22"/>
@@ -556,6 +568,8 @@
                 <w:rFonts w:ascii="Arial" w:cs="Arial" w:eastAsia="Arial" w:hAnsi="Arial"/>
                 <w:b/>
                 <w:bCs/>
+                <w:i w:val="false"/>
+                <w:iCs w:val="false"/>
                 <w:color w:val="1D2021"/>
                 <w:sz w:val="22"/>
                 <w:szCs w:val="22"/>
@@ -630,6 +644,8 @@
                 <w:rFonts w:ascii="Arial" w:cs="Arial" w:eastAsia="Arial" w:hAnsi="Arial"/>
                 <w:b/>
                 <w:bCs/>
+                <w:i w:val="false"/>
+                <w:iCs w:val="false"/>
                 <w:color w:val="1D2021"/>
                 <w:sz w:val="22"/>
                 <w:szCs w:val="22"/>
@@ -704,6 +720,8 @@
                 <w:rFonts w:ascii="Arial" w:cs="Arial" w:eastAsia="Arial" w:hAnsi="Arial"/>
                 <w:b/>
                 <w:bCs/>
+                <w:i w:val="false"/>
+                <w:iCs w:val="false"/>
                 <w:color w:val="1D2021"/>
                 <w:sz w:val="22"/>
                 <w:szCs w:val="22"/>
@@ -778,6 +796,8 @@
                 <w:rFonts w:ascii="Arial" w:cs="Arial" w:eastAsia="Arial" w:hAnsi="Arial"/>
                 <w:b/>
                 <w:bCs/>
+                <w:i w:val="false"/>
+                <w:iCs w:val="false"/>
                 <w:color w:val="1D2021"/>
                 <w:sz w:val="22"/>
                 <w:szCs w:val="22"/>

</xml_diff>

<commit_message>
fix(renderer): reduce cover term row height to 0.28 inches
Root cause: the row height property (403 twips) was an ATLEAST minimum,
but the actual row height was dominated by content — cell top/bottom
margins (144 twips each) + line spacing (340 twips) = 628 twips (0.44"),
far exceeding the minimum.

Fix: reduce cell margins from 144 to 32 twips. With 32 + 340 + 32 = 404
twips, rows now render at ~0.28 inches and the cover page fits on one
page. Global cover_row_height lowered from 700 to 403. All 3 existing
employment templates pinned to 700 via per-template override.
</commit_message>
<xml_diff>
--- a/content/templates/openagreements-employee-ip-inventions-assignment/template.docx
+++ b/content/templates/openagreements-employee-ip-inventions-assignment/template.docx
@@ -96,9 +96,9 @@
               <w:right w:val="nil" w:color="FFFFFF" w:sz="0"/>
             </w:tcBorders>
             <w:tcMar>
-              <w:top w:type="dxa" w:w="144"/>
+              <w:top w:type="dxa" w:w="32"/>
               <w:left w:type="dxa" w:w="115"/>
-              <w:bottom w:type="dxa" w:w="144"/>
+              <w:bottom w:type="dxa" w:w="32"/>
               <w:right w:type="dxa" w:w="115"/>
             </w:tcMar>
             <w:vAlign w:val="center"/>
@@ -131,9 +131,9 @@
               <w:right w:val="nil" w:color="FFFFFF" w:sz="0"/>
             </w:tcBorders>
             <w:tcMar>
-              <w:top w:type="dxa" w:w="144"/>
+              <w:top w:type="dxa" w:w="32"/>
               <w:left w:type="dxa" w:w="115"/>
-              <w:bottom w:type="dxa" w:w="144"/>
+              <w:bottom w:type="dxa" w:w="32"/>
               <w:right w:type="dxa" w:w="115"/>
             </w:tcMar>
             <w:vAlign w:val="center"/>
@@ -172,9 +172,9 @@
               <w:right w:val="nil" w:color="FFFFFF" w:sz="0"/>
             </w:tcBorders>
             <w:tcMar>
-              <w:top w:type="dxa" w:w="144"/>
+              <w:top w:type="dxa" w:w="32"/>
               <w:left w:type="dxa" w:w="115"/>
-              <w:bottom w:type="dxa" w:w="144"/>
+              <w:bottom w:type="dxa" w:w="32"/>
               <w:right w:type="dxa" w:w="115"/>
             </w:tcMar>
             <w:vAlign w:val="center"/>
@@ -207,9 +207,9 @@
               <w:right w:val="nil" w:color="FFFFFF" w:sz="0"/>
             </w:tcBorders>
             <w:tcMar>
-              <w:top w:type="dxa" w:w="144"/>
+              <w:top w:type="dxa" w:w="32"/>
               <w:left w:type="dxa" w:w="115"/>
-              <w:bottom w:type="dxa" w:w="144"/>
+              <w:bottom w:type="dxa" w:w="32"/>
               <w:right w:type="dxa" w:w="115"/>
             </w:tcMar>
             <w:vAlign w:val="center"/>
@@ -248,9 +248,9 @@
               <w:right w:val="nil" w:color="FFFFFF" w:sz="0"/>
             </w:tcBorders>
             <w:tcMar>
-              <w:top w:type="dxa" w:w="144"/>
+              <w:top w:type="dxa" w:w="32"/>
               <w:left w:type="dxa" w:w="115"/>
-              <w:bottom w:type="dxa" w:w="144"/>
+              <w:bottom w:type="dxa" w:w="32"/>
               <w:right w:type="dxa" w:w="115"/>
             </w:tcMar>
             <w:vAlign w:val="center"/>
@@ -283,9 +283,9 @@
               <w:right w:val="nil" w:color="FFFFFF" w:sz="0"/>
             </w:tcBorders>
             <w:tcMar>
-              <w:top w:type="dxa" w:w="144"/>
+              <w:top w:type="dxa" w:w="32"/>
               <w:left w:type="dxa" w:w="115"/>
-              <w:bottom w:type="dxa" w:w="144"/>
+              <w:bottom w:type="dxa" w:w="32"/>
               <w:right w:type="dxa" w:w="115"/>
             </w:tcMar>
             <w:vAlign w:val="center"/>
@@ -324,9 +324,9 @@
               <w:right w:val="nil" w:color="FFFFFF" w:sz="0"/>
             </w:tcBorders>
             <w:tcMar>
-              <w:top w:type="dxa" w:w="144"/>
+              <w:top w:type="dxa" w:w="32"/>
               <w:left w:type="dxa" w:w="115"/>
-              <w:bottom w:type="dxa" w:w="144"/>
+              <w:bottom w:type="dxa" w:w="32"/>
               <w:right w:type="dxa" w:w="115"/>
             </w:tcMar>
             <w:vAlign w:val="center"/>
@@ -359,9 +359,9 @@
               <w:right w:val="nil" w:color="FFFFFF" w:sz="0"/>
             </w:tcBorders>
             <w:tcMar>
-              <w:top w:type="dxa" w:w="144"/>
+              <w:top w:type="dxa" w:w="32"/>
               <w:left w:type="dxa" w:w="115"/>
-              <w:bottom w:type="dxa" w:w="144"/>
+              <w:bottom w:type="dxa" w:w="32"/>
               <w:right w:type="dxa" w:w="115"/>
             </w:tcMar>
             <w:vAlign w:val="center"/>
@@ -400,9 +400,9 @@
               <w:right w:val="nil" w:color="FFFFFF" w:sz="0"/>
             </w:tcBorders>
             <w:tcMar>
-              <w:top w:type="dxa" w:w="144"/>
+              <w:top w:type="dxa" w:w="32"/>
               <w:left w:type="dxa" w:w="115"/>
-              <w:bottom w:type="dxa" w:w="144"/>
+              <w:bottom w:type="dxa" w:w="32"/>
               <w:right w:type="dxa" w:w="115"/>
             </w:tcMar>
             <w:vAlign w:val="center"/>
@@ -435,9 +435,9 @@
               <w:right w:val="nil" w:color="FFFFFF" w:sz="0"/>
             </w:tcBorders>
             <w:tcMar>
-              <w:top w:type="dxa" w:w="144"/>
+              <w:top w:type="dxa" w:w="32"/>
               <w:left w:type="dxa" w:w="115"/>
-              <w:bottom w:type="dxa" w:w="144"/>
+              <w:bottom w:type="dxa" w:w="32"/>
               <w:right w:type="dxa" w:w="115"/>
             </w:tcMar>
             <w:vAlign w:val="center"/>
@@ -476,9 +476,9 @@
               <w:right w:val="nil" w:color="FFFFFF" w:sz="0"/>
             </w:tcBorders>
             <w:tcMar>
-              <w:top w:type="dxa" w:w="144"/>
+              <w:top w:type="dxa" w:w="32"/>
               <w:left w:type="dxa" w:w="115"/>
-              <w:bottom w:type="dxa" w:w="144"/>
+              <w:bottom w:type="dxa" w:w="32"/>
               <w:right w:type="dxa" w:w="115"/>
             </w:tcMar>
             <w:vAlign w:val="center"/>
@@ -511,9 +511,9 @@
               <w:right w:val="nil" w:color="FFFFFF" w:sz="0"/>
             </w:tcBorders>
             <w:tcMar>
-              <w:top w:type="dxa" w:w="144"/>
+              <w:top w:type="dxa" w:w="32"/>
               <w:left w:type="dxa" w:w="115"/>
-              <w:bottom w:type="dxa" w:w="144"/>
+              <w:bottom w:type="dxa" w:w="32"/>
               <w:right w:type="dxa" w:w="115"/>
             </w:tcMar>
             <w:vAlign w:val="center"/>
@@ -552,9 +552,9 @@
               <w:right w:val="nil" w:color="FFFFFF" w:sz="0"/>
             </w:tcBorders>
             <w:tcMar>
-              <w:top w:type="dxa" w:w="144"/>
+              <w:top w:type="dxa" w:w="32"/>
               <w:left w:type="dxa" w:w="115"/>
-              <w:bottom w:type="dxa" w:w="144"/>
+              <w:bottom w:type="dxa" w:w="32"/>
               <w:right w:type="dxa" w:w="115"/>
             </w:tcMar>
             <w:vAlign w:val="center"/>
@@ -587,9 +587,9 @@
               <w:right w:val="nil" w:color="FFFFFF" w:sz="0"/>
             </w:tcBorders>
             <w:tcMar>
-              <w:top w:type="dxa" w:w="144"/>
+              <w:top w:type="dxa" w:w="32"/>
               <w:left w:type="dxa" w:w="115"/>
-              <w:bottom w:type="dxa" w:w="144"/>
+              <w:bottom w:type="dxa" w:w="32"/>
               <w:right w:type="dxa" w:w="115"/>
             </w:tcMar>
             <w:vAlign w:val="center"/>
@@ -628,9 +628,9 @@
               <w:right w:val="nil" w:color="FFFFFF" w:sz="0"/>
             </w:tcBorders>
             <w:tcMar>
-              <w:top w:type="dxa" w:w="144"/>
+              <w:top w:type="dxa" w:w="32"/>
               <w:left w:type="dxa" w:w="115"/>
-              <w:bottom w:type="dxa" w:w="144"/>
+              <w:bottom w:type="dxa" w:w="32"/>
               <w:right w:type="dxa" w:w="115"/>
             </w:tcMar>
             <w:vAlign w:val="center"/>
@@ -663,9 +663,9 @@
               <w:right w:val="nil" w:color="FFFFFF" w:sz="0"/>
             </w:tcBorders>
             <w:tcMar>
-              <w:top w:type="dxa" w:w="144"/>
+              <w:top w:type="dxa" w:w="32"/>
               <w:left w:type="dxa" w:w="115"/>
-              <w:bottom w:type="dxa" w:w="144"/>
+              <w:bottom w:type="dxa" w:w="32"/>
               <w:right w:type="dxa" w:w="115"/>
             </w:tcMar>
             <w:vAlign w:val="center"/>
@@ -704,9 +704,9 @@
               <w:right w:val="nil" w:color="FFFFFF" w:sz="0"/>
             </w:tcBorders>
             <w:tcMar>
-              <w:top w:type="dxa" w:w="144"/>
+              <w:top w:type="dxa" w:w="32"/>
               <w:left w:type="dxa" w:w="115"/>
-              <w:bottom w:type="dxa" w:w="144"/>
+              <w:bottom w:type="dxa" w:w="32"/>
               <w:right w:type="dxa" w:w="115"/>
             </w:tcMar>
             <w:vAlign w:val="center"/>
@@ -739,9 +739,9 @@
               <w:right w:val="nil" w:color="FFFFFF" w:sz="0"/>
             </w:tcBorders>
             <w:tcMar>
-              <w:top w:type="dxa" w:w="144"/>
+              <w:top w:type="dxa" w:w="32"/>
               <w:left w:type="dxa" w:w="115"/>
-              <w:bottom w:type="dxa" w:w="144"/>
+              <w:bottom w:type="dxa" w:w="32"/>
               <w:right w:type="dxa" w:w="115"/>
             </w:tcMar>
             <w:vAlign w:val="center"/>
@@ -780,9 +780,9 @@
               <w:right w:val="nil" w:color="FFFFFF" w:sz="0"/>
             </w:tcBorders>
             <w:tcMar>
-              <w:top w:type="dxa" w:w="144"/>
+              <w:top w:type="dxa" w:w="32"/>
               <w:left w:type="dxa" w:w="115"/>
-              <w:bottom w:type="dxa" w:w="144"/>
+              <w:bottom w:type="dxa" w:w="32"/>
               <w:right w:type="dxa" w:w="115"/>
             </w:tcMar>
             <w:vAlign w:val="center"/>
@@ -815,9 +815,9 @@
               <w:right w:val="nil" w:color="FFFFFF" w:sz="0"/>
             </w:tcBorders>
             <w:tcMar>
-              <w:top w:type="dxa" w:w="144"/>
+              <w:top w:type="dxa" w:w="32"/>
               <w:left w:type="dxa" w:w="115"/>
-              <w:bottom w:type="dxa" w:w="144"/>
+              <w:bottom w:type="dxa" w:w="32"/>
               <w:right w:type="dxa" w:w="115"/>
             </w:tcMar>
             <w:vAlign w:val="center"/>

</xml_diff>

<commit_message>
fix(renderer): fit cover terms on one page with compact group headers
- Spacer paragraph: 2pt font, 120 twip line spacing (was 8pt/160)
- Group header label: before=0, single spacing (line: 240, was 340)
- Group header row height: 1.13x base (was 1.53x), ~358 twips
- Uniform 80/80 cell margins everywhere
- Row height: 317 twips base (global default)
- Title: removed "(Wyoming)" — state is in footer + Governing Law row
- Zero-width space in spacer survives empty-paragraph stripping

Saves ~0.62 inches across 7 headers. All covenants fit on page 1.
</commit_message>
<xml_diff>
--- a/content/templates/openagreements-employee-ip-inventions-assignment/template.docx
+++ b/content/templates/openagreements-employee-ip-inventions-assignment/template.docx
@@ -44,9 +44,9 @@
               <w:right w:val="nil" w:color="FFFFFF" w:sz="0"/>
             </w:tcBorders>
             <w:tcMar>
-              <w:top w:type="dxa" w:w="144"/>
+              <w:top w:type="dxa" w:w="80"/>
               <w:left w:type="dxa" w:w="115"/>
-              <w:bottom w:type="dxa" w:w="144"/>
+              <w:bottom w:type="dxa" w:w="80"/>
               <w:right w:type="dxa" w:w="115"/>
             </w:tcMar>
             <w:vAlign w:val="center"/>
@@ -96,16 +96,16 @@
               <w:right w:val="nil" w:color="FFFFFF" w:sz="0"/>
             </w:tcBorders>
             <w:tcMar>
-              <w:top w:type="dxa" w:w="32"/>
+              <w:top w:type="dxa" w:w="80"/>
               <w:left w:type="dxa" w:w="115"/>
-              <w:bottom w:type="dxa" w:w="32"/>
+              <w:bottom w:type="dxa" w:w="80"/>
               <w:right w:type="dxa" w:w="115"/>
             </w:tcMar>
             <w:vAlign w:val="center"/>
           </w:tcPr>
           <w:p>
             <w:pPr>
-              <w:spacing w:after="0" w:line="340"/>
+              <w:spacing w:before="0" w:after="0" w:line="340"/>
             </w:pPr>
             <w:r>
               <w:rPr>
@@ -131,9 +131,9 @@
               <w:right w:val="nil" w:color="FFFFFF" w:sz="0"/>
             </w:tcBorders>
             <w:tcMar>
-              <w:top w:type="dxa" w:w="32"/>
+              <w:top w:type="dxa" w:w="80"/>
               <w:left w:type="dxa" w:w="115"/>
-              <w:bottom w:type="dxa" w:w="32"/>
+              <w:bottom w:type="dxa" w:w="80"/>
               <w:right w:type="dxa" w:w="115"/>
             </w:tcMar>
             <w:vAlign w:val="center"/>
@@ -172,16 +172,16 @@
               <w:right w:val="nil" w:color="FFFFFF" w:sz="0"/>
             </w:tcBorders>
             <w:tcMar>
-              <w:top w:type="dxa" w:w="32"/>
+              <w:top w:type="dxa" w:w="80"/>
               <w:left w:type="dxa" w:w="115"/>
-              <w:bottom w:type="dxa" w:w="32"/>
+              <w:bottom w:type="dxa" w:w="80"/>
               <w:right w:type="dxa" w:w="115"/>
             </w:tcMar>
             <w:vAlign w:val="center"/>
           </w:tcPr>
           <w:p>
             <w:pPr>
-              <w:spacing w:after="0" w:line="340"/>
+              <w:spacing w:before="0" w:after="0" w:line="340"/>
             </w:pPr>
             <w:r>
               <w:rPr>
@@ -207,9 +207,9 @@
               <w:right w:val="nil" w:color="FFFFFF" w:sz="0"/>
             </w:tcBorders>
             <w:tcMar>
-              <w:top w:type="dxa" w:w="32"/>
+              <w:top w:type="dxa" w:w="80"/>
               <w:left w:type="dxa" w:w="115"/>
-              <w:bottom w:type="dxa" w:w="32"/>
+              <w:bottom w:type="dxa" w:w="80"/>
               <w:right w:type="dxa" w:w="115"/>
             </w:tcMar>
             <w:vAlign w:val="center"/>
@@ -248,16 +248,16 @@
               <w:right w:val="nil" w:color="FFFFFF" w:sz="0"/>
             </w:tcBorders>
             <w:tcMar>
-              <w:top w:type="dxa" w:w="32"/>
+              <w:top w:type="dxa" w:w="80"/>
               <w:left w:type="dxa" w:w="115"/>
-              <w:bottom w:type="dxa" w:w="32"/>
+              <w:bottom w:type="dxa" w:w="80"/>
               <w:right w:type="dxa" w:w="115"/>
             </w:tcMar>
             <w:vAlign w:val="center"/>
           </w:tcPr>
           <w:p>
             <w:pPr>
-              <w:spacing w:after="0" w:line="340"/>
+              <w:spacing w:before="0" w:after="0" w:line="340"/>
             </w:pPr>
             <w:r>
               <w:rPr>
@@ -283,9 +283,9 @@
               <w:right w:val="nil" w:color="FFFFFF" w:sz="0"/>
             </w:tcBorders>
             <w:tcMar>
-              <w:top w:type="dxa" w:w="32"/>
+              <w:top w:type="dxa" w:w="80"/>
               <w:left w:type="dxa" w:w="115"/>
-              <w:bottom w:type="dxa" w:w="32"/>
+              <w:bottom w:type="dxa" w:w="80"/>
               <w:right w:type="dxa" w:w="115"/>
             </w:tcMar>
             <w:vAlign w:val="center"/>
@@ -324,16 +324,16 @@
               <w:right w:val="nil" w:color="FFFFFF" w:sz="0"/>
             </w:tcBorders>
             <w:tcMar>
-              <w:top w:type="dxa" w:w="32"/>
+              <w:top w:type="dxa" w:w="80"/>
               <w:left w:type="dxa" w:w="115"/>
-              <w:bottom w:type="dxa" w:w="32"/>
+              <w:bottom w:type="dxa" w:w="80"/>
               <w:right w:type="dxa" w:w="115"/>
             </w:tcMar>
             <w:vAlign w:val="center"/>
           </w:tcPr>
           <w:p>
             <w:pPr>
-              <w:spacing w:after="0" w:line="340"/>
+              <w:spacing w:before="0" w:after="0" w:line="340"/>
             </w:pPr>
             <w:r>
               <w:rPr>
@@ -359,9 +359,9 @@
               <w:right w:val="nil" w:color="FFFFFF" w:sz="0"/>
             </w:tcBorders>
             <w:tcMar>
-              <w:top w:type="dxa" w:w="32"/>
+              <w:top w:type="dxa" w:w="80"/>
               <w:left w:type="dxa" w:w="115"/>
-              <w:bottom w:type="dxa" w:w="32"/>
+              <w:bottom w:type="dxa" w:w="80"/>
               <w:right w:type="dxa" w:w="115"/>
             </w:tcMar>
             <w:vAlign w:val="center"/>
@@ -400,16 +400,16 @@
               <w:right w:val="nil" w:color="FFFFFF" w:sz="0"/>
             </w:tcBorders>
             <w:tcMar>
-              <w:top w:type="dxa" w:w="32"/>
+              <w:top w:type="dxa" w:w="80"/>
               <w:left w:type="dxa" w:w="115"/>
-              <w:bottom w:type="dxa" w:w="32"/>
+              <w:bottom w:type="dxa" w:w="80"/>
               <w:right w:type="dxa" w:w="115"/>
             </w:tcMar>
             <w:vAlign w:val="center"/>
           </w:tcPr>
           <w:p>
             <w:pPr>
-              <w:spacing w:after="0" w:line="340"/>
+              <w:spacing w:before="0" w:after="0" w:line="340"/>
             </w:pPr>
             <w:r>
               <w:rPr>
@@ -435,9 +435,9 @@
               <w:right w:val="nil" w:color="FFFFFF" w:sz="0"/>
             </w:tcBorders>
             <w:tcMar>
-              <w:top w:type="dxa" w:w="32"/>
+              <w:top w:type="dxa" w:w="80"/>
               <w:left w:type="dxa" w:w="115"/>
-              <w:bottom w:type="dxa" w:w="32"/>
+              <w:bottom w:type="dxa" w:w="80"/>
               <w:right w:type="dxa" w:w="115"/>
             </w:tcMar>
             <w:vAlign w:val="center"/>
@@ -476,16 +476,16 @@
               <w:right w:val="nil" w:color="FFFFFF" w:sz="0"/>
             </w:tcBorders>
             <w:tcMar>
-              <w:top w:type="dxa" w:w="32"/>
+              <w:top w:type="dxa" w:w="80"/>
               <w:left w:type="dxa" w:w="115"/>
-              <w:bottom w:type="dxa" w:w="32"/>
+              <w:bottom w:type="dxa" w:w="80"/>
               <w:right w:type="dxa" w:w="115"/>
             </w:tcMar>
             <w:vAlign w:val="center"/>
           </w:tcPr>
           <w:p>
             <w:pPr>
-              <w:spacing w:after="0" w:line="340"/>
+              <w:spacing w:before="0" w:after="0" w:line="340"/>
             </w:pPr>
             <w:r>
               <w:rPr>
@@ -511,9 +511,9 @@
               <w:right w:val="nil" w:color="FFFFFF" w:sz="0"/>
             </w:tcBorders>
             <w:tcMar>
-              <w:top w:type="dxa" w:w="32"/>
+              <w:top w:type="dxa" w:w="80"/>
               <w:left w:type="dxa" w:w="115"/>
-              <w:bottom w:type="dxa" w:w="32"/>
+              <w:bottom w:type="dxa" w:w="80"/>
               <w:right w:type="dxa" w:w="115"/>
             </w:tcMar>
             <w:vAlign w:val="center"/>
@@ -552,16 +552,16 @@
               <w:right w:val="nil" w:color="FFFFFF" w:sz="0"/>
             </w:tcBorders>
             <w:tcMar>
-              <w:top w:type="dxa" w:w="32"/>
+              <w:top w:type="dxa" w:w="80"/>
               <w:left w:type="dxa" w:w="115"/>
-              <w:bottom w:type="dxa" w:w="32"/>
+              <w:bottom w:type="dxa" w:w="80"/>
               <w:right w:type="dxa" w:w="115"/>
             </w:tcMar>
             <w:vAlign w:val="center"/>
           </w:tcPr>
           <w:p>
             <w:pPr>
-              <w:spacing w:after="0" w:line="340"/>
+              <w:spacing w:before="0" w:after="0" w:line="340"/>
             </w:pPr>
             <w:r>
               <w:rPr>
@@ -587,9 +587,9 @@
               <w:right w:val="nil" w:color="FFFFFF" w:sz="0"/>
             </w:tcBorders>
             <w:tcMar>
-              <w:top w:type="dxa" w:w="32"/>
+              <w:top w:type="dxa" w:w="80"/>
               <w:left w:type="dxa" w:w="115"/>
-              <w:bottom w:type="dxa" w:w="32"/>
+              <w:bottom w:type="dxa" w:w="80"/>
               <w:right w:type="dxa" w:w="115"/>
             </w:tcMar>
             <w:vAlign w:val="center"/>
@@ -628,16 +628,16 @@
               <w:right w:val="nil" w:color="FFFFFF" w:sz="0"/>
             </w:tcBorders>
             <w:tcMar>
-              <w:top w:type="dxa" w:w="32"/>
+              <w:top w:type="dxa" w:w="80"/>
               <w:left w:type="dxa" w:w="115"/>
-              <w:bottom w:type="dxa" w:w="32"/>
+              <w:bottom w:type="dxa" w:w="80"/>
               <w:right w:type="dxa" w:w="115"/>
             </w:tcMar>
             <w:vAlign w:val="center"/>
           </w:tcPr>
           <w:p>
             <w:pPr>
-              <w:spacing w:after="0" w:line="340"/>
+              <w:spacing w:before="0" w:after="0" w:line="340"/>
             </w:pPr>
             <w:r>
               <w:rPr>
@@ -663,9 +663,9 @@
               <w:right w:val="nil" w:color="FFFFFF" w:sz="0"/>
             </w:tcBorders>
             <w:tcMar>
-              <w:top w:type="dxa" w:w="32"/>
+              <w:top w:type="dxa" w:w="80"/>
               <w:left w:type="dxa" w:w="115"/>
-              <w:bottom w:type="dxa" w:w="32"/>
+              <w:bottom w:type="dxa" w:w="80"/>
               <w:right w:type="dxa" w:w="115"/>
             </w:tcMar>
             <w:vAlign w:val="center"/>
@@ -704,16 +704,16 @@
               <w:right w:val="nil" w:color="FFFFFF" w:sz="0"/>
             </w:tcBorders>
             <w:tcMar>
-              <w:top w:type="dxa" w:w="32"/>
+              <w:top w:type="dxa" w:w="80"/>
               <w:left w:type="dxa" w:w="115"/>
-              <w:bottom w:type="dxa" w:w="32"/>
+              <w:bottom w:type="dxa" w:w="80"/>
               <w:right w:type="dxa" w:w="115"/>
             </w:tcMar>
             <w:vAlign w:val="center"/>
           </w:tcPr>
           <w:p>
             <w:pPr>
-              <w:spacing w:after="0" w:line="340"/>
+              <w:spacing w:before="0" w:after="0" w:line="340"/>
             </w:pPr>
             <w:r>
               <w:rPr>
@@ -739,9 +739,9 @@
               <w:right w:val="nil" w:color="FFFFFF" w:sz="0"/>
             </w:tcBorders>
             <w:tcMar>
-              <w:top w:type="dxa" w:w="32"/>
+              <w:top w:type="dxa" w:w="80"/>
               <w:left w:type="dxa" w:w="115"/>
-              <w:bottom w:type="dxa" w:w="32"/>
+              <w:bottom w:type="dxa" w:w="80"/>
               <w:right w:type="dxa" w:w="115"/>
             </w:tcMar>
             <w:vAlign w:val="center"/>
@@ -780,16 +780,16 @@
               <w:right w:val="nil" w:color="FFFFFF" w:sz="0"/>
             </w:tcBorders>
             <w:tcMar>
-              <w:top w:type="dxa" w:w="32"/>
+              <w:top w:type="dxa" w:w="80"/>
               <w:left w:type="dxa" w:w="115"/>
-              <w:bottom w:type="dxa" w:w="32"/>
+              <w:bottom w:type="dxa" w:w="80"/>
               <w:right w:type="dxa" w:w="115"/>
             </w:tcMar>
             <w:vAlign w:val="center"/>
           </w:tcPr>
           <w:p>
             <w:pPr>
-              <w:spacing w:after="0" w:line="340"/>
+              <w:spacing w:before="0" w:after="0" w:line="340"/>
             </w:pPr>
             <w:r>
               <w:rPr>
@@ -815,9 +815,9 @@
               <w:right w:val="nil" w:color="FFFFFF" w:sz="0"/>
             </w:tcBorders>
             <w:tcMar>
-              <w:top w:type="dxa" w:w="32"/>
+              <w:top w:type="dxa" w:w="80"/>
               <w:left w:type="dxa" w:w="115"/>
-              <w:bottom w:type="dxa" w:w="32"/>
+              <w:bottom w:type="dxa" w:w="80"/>
               <w:right w:type="dxa" w:w="115"/>
             </w:tcMar>
             <w:vAlign w:val="center"/>

</xml_diff>

<commit_message>
Migrate employee IP assignment template to canonical markdown
</commit_message>
<xml_diff>
--- a/content/templates/openagreements-employee-ip-inventions-assignment/template.docx
+++ b/content/templates/openagreements-employee-ip-inventions-assignment/template.docx
@@ -4,7 +4,7 @@
   <w:body>
     <w:p>
       <w:pPr>
-        <w:spacing w:before="240" w:after="210"/>
+        <w:spacing w:after="210" w:before="240"/>
       </w:pPr>
       <w:r>
         <w:rPr>
@@ -105,7 +105,7 @@
           </w:tcPr>
           <w:p>
             <w:pPr>
-              <w:spacing w:before="0" w:after="0" w:line="340"/>
+              <w:spacing w:after="0" w:before="0" w:line="340"/>
             </w:pPr>
             <w:r>
               <w:rPr>
@@ -140,7 +140,7 @@
           </w:tcPr>
           <w:p>
             <w:pPr>
-              <w:spacing w:before="0" w:after="0" w:line="340" w:beforeAutospacing="false" w:afterAutospacing="false"/>
+              <w:spacing w:after="0" w:before="0" w:line="340" w:beforeAutospacing="false" w:afterAutospacing="false"/>
               <w:contextualSpacing w:val="false"/>
             </w:pPr>
             <w:r>
@@ -181,7 +181,7 @@
           </w:tcPr>
           <w:p>
             <w:pPr>
-              <w:spacing w:before="0" w:after="0" w:line="340"/>
+              <w:spacing w:after="0" w:before="0" w:line="340"/>
             </w:pPr>
             <w:r>
               <w:rPr>
@@ -216,7 +216,7 @@
           </w:tcPr>
           <w:p>
             <w:pPr>
-              <w:spacing w:before="0" w:after="0" w:line="340" w:beforeAutospacing="false" w:afterAutospacing="false"/>
+              <w:spacing w:after="0" w:before="0" w:line="340" w:beforeAutospacing="false" w:afterAutospacing="false"/>
               <w:contextualSpacing w:val="false"/>
             </w:pPr>
             <w:r>
@@ -257,7 +257,7 @@
           </w:tcPr>
           <w:p>
             <w:pPr>
-              <w:spacing w:before="0" w:after="0" w:line="340"/>
+              <w:spacing w:after="0" w:before="0" w:line="340"/>
             </w:pPr>
             <w:r>
               <w:rPr>
@@ -292,7 +292,7 @@
           </w:tcPr>
           <w:p>
             <w:pPr>
-              <w:spacing w:before="0" w:after="0" w:line="340" w:beforeAutospacing="false" w:afterAutospacing="false"/>
+              <w:spacing w:after="0" w:before="0" w:line="340" w:beforeAutospacing="false" w:afterAutospacing="false"/>
               <w:contextualSpacing w:val="false"/>
             </w:pPr>
             <w:r>
@@ -333,7 +333,7 @@
           </w:tcPr>
           <w:p>
             <w:pPr>
-              <w:spacing w:before="0" w:after="0" w:line="340"/>
+              <w:spacing w:after="0" w:before="0" w:line="340"/>
             </w:pPr>
             <w:r>
               <w:rPr>
@@ -368,7 +368,7 @@
           </w:tcPr>
           <w:p>
             <w:pPr>
-              <w:spacing w:before="0" w:after="0" w:line="340" w:beforeAutospacing="false" w:afterAutospacing="false"/>
+              <w:spacing w:after="0" w:before="0" w:line="340" w:beforeAutospacing="false" w:afterAutospacing="false"/>
               <w:contextualSpacing w:val="false"/>
             </w:pPr>
             <w:r>
@@ -409,7 +409,7 @@
           </w:tcPr>
           <w:p>
             <w:pPr>
-              <w:spacing w:before="0" w:after="0" w:line="340"/>
+              <w:spacing w:after="0" w:before="0" w:line="340"/>
             </w:pPr>
             <w:r>
               <w:rPr>
@@ -444,7 +444,7 @@
           </w:tcPr>
           <w:p>
             <w:pPr>
-              <w:spacing w:before="0" w:after="0" w:line="340" w:beforeAutospacing="false" w:afterAutospacing="false"/>
+              <w:spacing w:after="0" w:before="0" w:line="340" w:beforeAutospacing="false" w:afterAutospacing="false"/>
               <w:contextualSpacing w:val="false"/>
             </w:pPr>
             <w:r>
@@ -485,7 +485,7 @@
           </w:tcPr>
           <w:p>
             <w:pPr>
-              <w:spacing w:before="0" w:after="0" w:line="340"/>
+              <w:spacing w:after="0" w:before="0" w:line="340"/>
             </w:pPr>
             <w:r>
               <w:rPr>
@@ -520,7 +520,7 @@
           </w:tcPr>
           <w:p>
             <w:pPr>
-              <w:spacing w:before="0" w:after="0" w:line="340" w:beforeAutospacing="false" w:afterAutospacing="false"/>
+              <w:spacing w:after="0" w:before="0" w:line="340" w:beforeAutospacing="false" w:afterAutospacing="false"/>
               <w:contextualSpacing w:val="false"/>
             </w:pPr>
             <w:r>
@@ -561,7 +561,7 @@
           </w:tcPr>
           <w:p>
             <w:pPr>
-              <w:spacing w:before="0" w:after="0" w:line="340"/>
+              <w:spacing w:after="0" w:before="0" w:line="340"/>
             </w:pPr>
             <w:r>
               <w:rPr>
@@ -596,7 +596,7 @@
           </w:tcPr>
           <w:p>
             <w:pPr>
-              <w:spacing w:before="0" w:after="0" w:line="340" w:beforeAutospacing="false" w:afterAutospacing="false"/>
+              <w:spacing w:after="0" w:before="0" w:line="340" w:beforeAutospacing="false" w:afterAutospacing="false"/>
               <w:contextualSpacing w:val="false"/>
             </w:pPr>
             <w:r>
@@ -637,7 +637,7 @@
           </w:tcPr>
           <w:p>
             <w:pPr>
-              <w:spacing w:before="0" w:after="0" w:line="340"/>
+              <w:spacing w:after="0" w:before="0" w:line="340"/>
             </w:pPr>
             <w:r>
               <w:rPr>
@@ -672,7 +672,7 @@
           </w:tcPr>
           <w:p>
             <w:pPr>
-              <w:spacing w:before="0" w:after="0" w:line="340" w:beforeAutospacing="false" w:afterAutospacing="false"/>
+              <w:spacing w:after="0" w:before="0" w:line="340" w:beforeAutospacing="false" w:afterAutospacing="false"/>
               <w:contextualSpacing w:val="false"/>
             </w:pPr>
             <w:r>
@@ -713,7 +713,7 @@
           </w:tcPr>
           <w:p>
             <w:pPr>
-              <w:spacing w:before="0" w:after="0" w:line="340"/>
+              <w:spacing w:after="0" w:before="0" w:line="340"/>
             </w:pPr>
             <w:r>
               <w:rPr>
@@ -748,7 +748,7 @@
           </w:tcPr>
           <w:p>
             <w:pPr>
-              <w:spacing w:before="0" w:after="0" w:line="340" w:beforeAutospacing="false" w:afterAutospacing="false"/>
+              <w:spacing w:after="0" w:before="0" w:line="340" w:beforeAutospacing="false" w:afterAutospacing="false"/>
               <w:contextualSpacing w:val="false"/>
             </w:pPr>
             <w:r>
@@ -789,7 +789,7 @@
           </w:tcPr>
           <w:p>
             <w:pPr>
-              <w:spacing w:before="0" w:after="0" w:line="340"/>
+              <w:spacing w:after="0" w:before="0" w:line="340"/>
             </w:pPr>
             <w:r>
               <w:rPr>
@@ -824,7 +824,7 @@
           </w:tcPr>
           <w:p>
             <w:pPr>
-              <w:spacing w:before="0" w:after="0" w:line="340" w:beforeAutospacing="false" w:afterAutospacing="false"/>
+              <w:spacing w:after="0" w:before="0" w:line="340" w:beforeAutospacing="false" w:afterAutospacing="false"/>
               <w:contextualSpacing w:val="false"/>
             </w:pPr>
             <w:r>
@@ -847,8 +847,8 @@
     <w:p>
       <w:pPr>
         <w:sectPr>
-          <w:headerReference w:type="default" r:id="rId6"/>
-          <w:footerReference w:type="default" r:id="rId7"/>
+          <w:headerReference w:type="default" r:id="rId7"/>
+          <w:footerReference w:type="default" r:id="rId8"/>
           <w:pgSz w:w="11906" w:h="16838" w:orient="portrait"/>
           <w:pgMar w:top="936" w:right="1080" w:bottom="720" w:left="1080" w:header="360" w:footer="432" w:gutter="0"/>
           <w:pgNumType/>
@@ -858,7 +858,7 @@
     </w:p>
     <w:p>
       <w:pPr>
-        <w:spacing w:before="0" w:after="240" w:line="340" w:beforeAutospacing="false" w:afterAutospacing="false"/>
+        <w:spacing w:after="240" w:before="0" w:line="340" w:beforeAutospacing="false" w:afterAutospacing="false"/>
         <w:contextualSpacing w:val="false"/>
       </w:pPr>
       <w:r>
@@ -876,7 +876,7 @@
     <w:p>
       <w:pPr>
         <w:pStyle w:val="OAClauseHeading"/>
-        <w:spacing w:before="320" w:after="120" w:line="340" w:beforeAutospacing="false" w:afterAutospacing="false"/>
+        <w:spacing w:after="120" w:before="320" w:line="340" w:beforeAutospacing="false" w:afterAutospacing="false"/>
         <w:contextualSpacing w:val="false"/>
       </w:pPr>
       <w:r>
@@ -894,7 +894,7 @@
     <w:p>
       <w:pPr>
         <w:pStyle w:val="OAClauseBody"/>
-        <w:spacing w:before="0" w:after="280" w:line="340" w:beforeAutospacing="false" w:afterAutospacing="false"/>
+        <w:spacing w:after="280" w:before="0" w:line="340" w:beforeAutospacing="false" w:afterAutospacing="false"/>
         <w:contextualSpacing w:val="false"/>
       </w:pPr>
       <w:r>
@@ -1031,7 +1031,7 @@
     <w:p>
       <w:pPr>
         <w:pStyle w:val="OAClauseHeading"/>
-        <w:spacing w:before="320" w:after="120" w:line="340" w:beforeAutospacing="false" w:afterAutospacing="false"/>
+        <w:spacing w:after="120" w:before="320" w:line="340" w:beforeAutospacing="false" w:afterAutospacing="false"/>
         <w:contextualSpacing w:val="false"/>
       </w:pPr>
       <w:r>
@@ -1049,7 +1049,7 @@
     <w:p>
       <w:pPr>
         <w:pStyle w:val="OAClauseBody"/>
-        <w:spacing w:before="0" w:after="280" w:line="340" w:beforeAutospacing="false" w:afterAutospacing="false"/>
+        <w:spacing w:after="280" w:before="0" w:line="340" w:beforeAutospacing="false" w:afterAutospacing="false"/>
         <w:contextualSpacing w:val="false"/>
       </w:pPr>
       <w:r>
@@ -1147,7 +1147,7 @@
     <w:p>
       <w:pPr>
         <w:pStyle w:val="OAClauseHeading"/>
-        <w:spacing w:before="320" w:after="120" w:line="340" w:beforeAutospacing="false" w:afterAutospacing="false"/>
+        <w:spacing w:after="120" w:before="320" w:line="340" w:beforeAutospacing="false" w:afterAutospacing="false"/>
         <w:contextualSpacing w:val="false"/>
       </w:pPr>
       <w:r>
@@ -1165,7 +1165,7 @@
     <w:p>
       <w:pPr>
         <w:pStyle w:val="OAClauseBody"/>
-        <w:spacing w:before="0" w:after="280" w:line="340" w:beforeAutospacing="false" w:afterAutospacing="false"/>
+        <w:spacing w:after="280" w:before="0" w:line="340" w:beforeAutospacing="false" w:afterAutospacing="false"/>
         <w:contextualSpacing w:val="false"/>
       </w:pPr>
       <w:r>
@@ -1224,7 +1224,7 @@
     <w:p>
       <w:pPr>
         <w:pStyle w:val="OAClauseHeading"/>
-        <w:spacing w:before="320" w:after="120" w:line="340" w:beforeAutospacing="false" w:afterAutospacing="false"/>
+        <w:spacing w:after="120" w:before="320" w:line="340" w:beforeAutospacing="false" w:afterAutospacing="false"/>
         <w:contextualSpacing w:val="false"/>
       </w:pPr>
       <w:r>
@@ -1242,7 +1242,7 @@
     <w:p>
       <w:pPr>
         <w:pStyle w:val="OAClauseBody"/>
-        <w:spacing w:before="0" w:after="280" w:line="340" w:beforeAutospacing="false" w:afterAutospacing="false"/>
+        <w:spacing w:after="280" w:before="0" w:line="340" w:beforeAutospacing="false" w:afterAutospacing="false"/>
         <w:contextualSpacing w:val="false"/>
       </w:pPr>
       <w:r>
@@ -1366,7 +1366,7 @@
     <w:p>
       <w:pPr>
         <w:pStyle w:val="OAClauseHeading"/>
-        <w:spacing w:before="320" w:after="120" w:line="340" w:beforeAutospacing="false" w:afterAutospacing="false"/>
+        <w:spacing w:after="120" w:before="320" w:line="340" w:beforeAutospacing="false" w:afterAutospacing="false"/>
         <w:contextualSpacing w:val="false"/>
       </w:pPr>
       <w:r>
@@ -1384,7 +1384,7 @@
     <w:p>
       <w:pPr>
         <w:pStyle w:val="OAClauseBody"/>
-        <w:spacing w:before="0" w:after="280" w:line="340" w:beforeAutospacing="false" w:afterAutospacing="false"/>
+        <w:spacing w:after="280" w:before="0" w:line="340" w:beforeAutospacing="false" w:afterAutospacing="false"/>
         <w:contextualSpacing w:val="false"/>
       </w:pPr>
       <w:r>
@@ -1495,7 +1495,7 @@
     <w:p>
       <w:pPr>
         <w:pStyle w:val="OAClauseHeading"/>
-        <w:spacing w:before="320" w:after="120" w:line="340" w:beforeAutospacing="false" w:afterAutospacing="false"/>
+        <w:spacing w:after="120" w:before="320" w:line="340" w:beforeAutospacing="false" w:afterAutospacing="false"/>
         <w:contextualSpacing w:val="false"/>
       </w:pPr>
       <w:r>
@@ -1513,7 +1513,7 @@
     <w:p>
       <w:pPr>
         <w:pStyle w:val="OAClauseBody"/>
-        <w:spacing w:before="0" w:after="280" w:line="340" w:beforeAutospacing="false" w:afterAutospacing="false"/>
+        <w:spacing w:after="280" w:before="0" w:line="340" w:beforeAutospacing="false" w:afterAutospacing="false"/>
         <w:contextualSpacing w:val="false"/>
       </w:pPr>
       <w:r>
@@ -1650,7 +1650,7 @@
     <w:p>
       <w:pPr>
         <w:pStyle w:val="OAClauseHeading"/>
-        <w:spacing w:before="320" w:after="120" w:line="340" w:beforeAutospacing="false" w:afterAutospacing="false"/>
+        <w:spacing w:after="120" w:before="320" w:line="340" w:beforeAutospacing="false" w:afterAutospacing="false"/>
         <w:contextualSpacing w:val="false"/>
       </w:pPr>
       <w:r>
@@ -1668,7 +1668,7 @@
     <w:p>
       <w:pPr>
         <w:pStyle w:val="OAClauseBody"/>
-        <w:spacing w:before="0" w:after="280" w:line="340" w:beforeAutospacing="false" w:afterAutospacing="false"/>
+        <w:spacing w:after="280" w:before="0" w:line="340" w:beforeAutospacing="false" w:afterAutospacing="false"/>
         <w:contextualSpacing w:val="false"/>
       </w:pPr>
       <w:r>
@@ -1753,7 +1753,7 @@
     <w:p>
       <w:pPr>
         <w:pStyle w:val="OAClauseHeading"/>
-        <w:spacing w:before="320" w:after="120" w:line="340" w:beforeAutospacing="false" w:afterAutospacing="false"/>
+        <w:spacing w:after="120" w:before="320" w:line="340" w:beforeAutospacing="false" w:afterAutospacing="false"/>
         <w:contextualSpacing w:val="false"/>
       </w:pPr>
       <w:r>
@@ -1771,7 +1771,7 @@
     <w:p>
       <w:pPr>
         <w:pStyle w:val="OAClauseBody"/>
-        <w:spacing w:before="0" w:after="280" w:line="340" w:beforeAutospacing="false" w:afterAutospacing="false"/>
+        <w:spacing w:after="280" w:before="0" w:line="340" w:beforeAutospacing="false" w:afterAutospacing="false"/>
         <w:contextualSpacing w:val="false"/>
       </w:pPr>
       <w:r>
@@ -1882,7 +1882,7 @@
     <w:p>
       <w:pPr>
         <w:pStyle w:val="OAClauseHeading"/>
-        <w:spacing w:before="320" w:after="120" w:line="340" w:beforeAutospacing="false" w:afterAutospacing="false"/>
+        <w:spacing w:after="120" w:before="320" w:line="340" w:beforeAutospacing="false" w:afterAutospacing="false"/>
         <w:contextualSpacing w:val="false"/>
       </w:pPr>
       <w:r>
@@ -1900,7 +1900,7 @@
     <w:p>
       <w:pPr>
         <w:pStyle w:val="OAClauseBody"/>
-        <w:spacing w:before="0" w:after="280" w:line="340" w:beforeAutospacing="false" w:afterAutospacing="false"/>
+        <w:spacing w:after="280" w:before="0" w:line="340" w:beforeAutospacing="false" w:afterAutospacing="false"/>
         <w:contextualSpacing w:val="false"/>
       </w:pPr>
       <w:r>
@@ -1946,7 +1946,7 @@
     <w:p>
       <w:pPr>
         <w:pStyle w:val="OAClauseHeading"/>
-        <w:spacing w:before="320" w:after="120" w:line="340" w:beforeAutospacing="false" w:afterAutospacing="false"/>
+        <w:spacing w:after="120" w:before="320" w:line="340" w:beforeAutospacing="false" w:afterAutospacing="false"/>
         <w:contextualSpacing w:val="false"/>
       </w:pPr>
       <w:r>
@@ -1964,7 +1964,7 @@
     <w:p>
       <w:pPr>
         <w:pStyle w:val="OAClauseBody"/>
-        <w:spacing w:before="0" w:after="280" w:line="340" w:beforeAutospacing="false" w:afterAutospacing="false"/>
+        <w:spacing w:after="280" w:before="0" w:line="340" w:beforeAutospacing="false" w:afterAutospacing="false"/>
         <w:contextualSpacing w:val="false"/>
       </w:pPr>
       <w:r>
@@ -2036,8 +2036,8 @@
     <w:p>
       <w:pPr>
         <w:sectPr>
-          <w:headerReference w:type="default" r:id="rId8"/>
-          <w:footerReference w:type="default" r:id="rId9"/>
+          <w:headerReference w:type="default" r:id="rId9"/>
+          <w:footerReference w:type="default" r:id="rId10"/>
           <w:pgSz w:w="11906" w:h="16838" w:orient="portrait"/>
           <w:pgMar w:top="936" w:right="1080" w:bottom="720" w:left="1080" w:header="360" w:footer="432" w:gutter="0"/>
           <w:pgNumType/>
@@ -2047,7 +2047,7 @@
     </w:p>
     <w:p>
       <w:pPr>
-        <w:spacing w:before="0" w:after="240" w:line="340" w:beforeAutospacing="false" w:afterAutospacing="false"/>
+        <w:spacing w:after="240" w:before="0" w:line="340" w:beforeAutospacing="false" w:afterAutospacing="false"/>
         <w:contextualSpacing w:val="false"/>
       </w:pPr>
       <w:r>
@@ -2064,7 +2064,7 @@
     </w:p>
     <w:p>
       <w:pPr>
-        <w:spacing w:before="0" w:after="280" w:line="340" w:beforeAutospacing="false" w:afterAutospacing="false"/>
+        <w:spacing w:after="280" w:before="0" w:line="340" w:beforeAutospacing="false" w:afterAutospacing="false"/>
         <w:contextualSpacing w:val="false"/>
       </w:pPr>
       <w:r>
@@ -2715,8 +2715,8 @@
       </w:tr>
     </w:tbl>
     <w:sectPr>
-      <w:headerReference w:type="default" r:id="rId10"/>
-      <w:footerReference w:type="default" r:id="rId11"/>
+      <w:headerReference w:type="default" r:id="rId11"/>
+      <w:footerReference w:type="default" r:id="rId12"/>
       <w:pgSz w:w="11906" w:h="16838" w:orient="portrait"/>
       <w:pgMar w:top="936" w:right="1080" w:bottom="720" w:left="1080" w:header="360" w:footer="432" w:gutter="0"/>
       <w:pgNumType/>
@@ -2728,6 +2728,43 @@
 
 <file path=word/comments.xml><?xml version="1.0" encoding="utf-8"?>
 <w:comments xmlns:cx="http://schemas.microsoft.com/office/drawing/2014/chartex" xmlns:cx1="http://schemas.microsoft.com/office/drawing/2015/9/8/chartex" xmlns:cx2="http://schemas.microsoft.com/office/drawing/2015/10/21/chartex" xmlns:cx3="http://schemas.microsoft.com/office/drawing/2016/5/9/chartex" xmlns:cx4="http://schemas.microsoft.com/office/drawing/2016/5/10/chartex" xmlns:cx5="http://schemas.microsoft.com/office/drawing/2016/5/11/chartex" xmlns:cx6="http://schemas.microsoft.com/office/drawing/2016/5/12/chartex" xmlns:cx7="http://schemas.microsoft.com/office/drawing/2016/5/13/chartex" xmlns:cx8="http://schemas.microsoft.com/office/drawing/2016/5/14/chartex" xmlns:mc="http://schemas.openxmlformats.org/markup-compatibility/2006" xmlns:aink="http://schemas.microsoft.com/office/drawing/2016/ink" xmlns:am3d="http://schemas.microsoft.com/office/drawing/2017/model3d" xmlns:o="urn:schemas-microsoft-com:office:office" xmlns:r="http://schemas.openxmlformats.org/officeDocument/2006/relationships" xmlns:m="http://schemas.openxmlformats.org/officeDocument/2006/math" xmlns:v="urn:schemas-microsoft-com:vml" xmlns:wp14="http://schemas.microsoft.com/office/word/2010/wordprocessingDrawing" xmlns:wp="http://schemas.openxmlformats.org/drawingml/2006/wordprocessingDrawing" xmlns:w10="urn:schemas-microsoft-com:office:word" xmlns:w="http://schemas.openxmlformats.org/wordprocessingml/2006/main" xmlns:w14="http://schemas.microsoft.com/office/word/2010/wordml" xmlns:w15="http://schemas.microsoft.com/office/word/2012/wordml" xmlns:w16cex="http://schemas.microsoft.com/office/word/2018/wordml/cex" xmlns:w16cid="http://schemas.microsoft.com/office/word/2016/wordml/cid" xmlns:w16="http://schemas.microsoft.com/office/word/2018/wordml" xmlns:w16sdtdh="http://schemas.microsoft.com/office/word/2020/wordml/sdtdatahash" xmlns:w16se="http://schemas.microsoft.com/office/word/2015/wordml/symex" xmlns:wpg="http://schemas.microsoft.com/office/word/2010/wordprocessingGroup" xmlns:wpi="http://schemas.microsoft.com/office/word/2010/wordprocessingInk" xmlns:wne="http://schemas.microsoft.com/office/word/2006/wordml" xmlns:wps="http://schemas.microsoft.com/office/word/2010/wordprocessingShape"/>
+</file>
+
+<file path=word/endnotes.xml><?xml version="1.0" encoding="utf-8"?>
+<w:endnotes xmlns:wpc="http://schemas.microsoft.com/office/word/2010/wordprocessingCanvas" xmlns:mc="http://schemas.openxmlformats.org/markup-compatibility/2006" xmlns:o="urn:schemas-microsoft-com:office:office" xmlns:r="http://schemas.openxmlformats.org/officeDocument/2006/relationships" xmlns:m="http://schemas.openxmlformats.org/officeDocument/2006/math" xmlns:v="urn:schemas-microsoft-com:vml" xmlns:wp14="http://schemas.microsoft.com/office/word/2010/wordprocessingDrawing" xmlns:wp="http://schemas.openxmlformats.org/drawingml/2006/wordprocessingDrawing" xmlns:w10="urn:schemas-microsoft-com:office:word" xmlns:w="http://schemas.openxmlformats.org/wordprocessingml/2006/main" xmlns:w14="http://schemas.microsoft.com/office/word/2010/wordml" xmlns:w15="http://schemas.microsoft.com/office/word/2012/wordml" xmlns:wpg="http://schemas.microsoft.com/office/word/2010/wordprocessingGroup" xmlns:wpi="http://schemas.microsoft.com/office/word/2010/wordprocessingInk" xmlns:wne="http://schemas.microsoft.com/office/word/2006/wordml" xmlns:wps="http://schemas.microsoft.com/office/word/2010/wordprocessingShape" mc:Ignorable="w14 w15 wp14">
+  <w:endnote w:type="separator" w:id="-1">
+    <w:p>
+      <w:pPr>
+        <w:spacing w:after="0" w:line="240" w:lineRule="auto"/>
+      </w:pPr>
+      <w:r>
+        <w:rPr>
+          <w:rStyle w:val="EndnoteReference"/>
+        </w:rPr>
+        <w:endnoteRef/>
+      </w:r>
+      <w:r>
+        <w:separator/>
+      </w:r>
+    </w:p>
+  </w:endnote>
+  <w:endnote w:type="continuationSeparator" w:id="0">
+    <w:p>
+      <w:pPr>
+        <w:spacing w:after="0" w:line="240" w:lineRule="auto"/>
+      </w:pPr>
+      <w:r>
+        <w:rPr>
+          <w:rStyle w:val="EndnoteReference"/>
+        </w:rPr>
+        <w:endnoteRef/>
+      </w:r>
+      <w:r>
+        <w:continuationSeparator/>
+      </w:r>
+    </w:p>
+  </w:endnote>
+</w:endnotes>
 </file>
 
 <file path=word/footer1.xml><?xml version="1.0" encoding="utf-8"?>
@@ -2792,7 +2829,7 @@
   </w:p>
   <w:p>
     <w:pPr>
-      <w:spacing w:before="0" w:after="0"/>
+      <w:spacing w:after="0" w:before="0"/>
     </w:pPr>
     <w:r>
       <w:rPr>
@@ -3032,7 +3069,7 @@
         </w:tcPr>
         <w:p>
           <w:pPr>
-            <w:spacing w:before="0" w:after="0"/>
+            <w:spacing w:after="0" w:before="0"/>
             <w:jc w:val="right"/>
           </w:pPr>
           <w:r>
@@ -3123,7 +3160,7 @@
         </w:tcPr>
         <w:p>
           <w:pPr>
-            <w:spacing w:before="0" w:after="0"/>
+            <w:spacing w:after="0" w:before="0"/>
             <w:jc w:val="right"/>
           </w:pPr>
           <w:r>
@@ -3214,7 +3251,7 @@
         </w:tcPr>
         <w:p>
           <w:pPr>
-            <w:spacing w:before="0" w:after="0"/>
+            <w:spacing w:after="0" w:before="0"/>
             <w:jc w:val="right"/>
           </w:pPr>
           <w:r>
@@ -3351,7 +3388,7 @@
     </w:rPrDefault>
     <w:pPrDefault>
       <w:pPr>
-        <w:spacing w:before="0" w:after="0" w:line="340" w:lineRule="auto"/>
+        <w:spacing w:after="0" w:before="0" w:line="340" w:lineRule="auto"/>
       </w:pPr>
     </w:pPrDefault>
   </w:docDefaults>
@@ -3489,12 +3526,49 @@
       <w:szCs w:val="20"/>
     </w:rPr>
   </w:style>
+  <w:style w:type="character" w:styleId="EndnoteReference">
+    <w:name w:val="endnote reference"/>
+    <w:basedOn w:val="DefaultParagraphFont"/>
+    <w:uiPriority w:val="99"/>
+    <w:semiHidden/>
+    <w:unhideWhenUsed/>
+    <w:rPr>
+      <w:vertAlign w:val="superscript"/>
+    </w:rPr>
+  </w:style>
+  <w:style w:type="paragraph" w:styleId="EndnoteText">
+    <w:name w:val="endnote text"/>
+    <w:basedOn w:val="Normal"/>
+    <w:link w:val="EndnoteTextChar"/>
+    <w:uiPriority w:val="99"/>
+    <w:semiHidden/>
+    <w:unhideWhenUsed/>
+    <w:pPr>
+      <w:spacing w:after="0" w:line="240" w:lineRule="auto"/>
+    </w:pPr>
+    <w:rPr>
+      <w:sz w:val="20"/>
+      <w:szCs w:val="20"/>
+    </w:rPr>
+  </w:style>
+  <w:style w:type="character" w:styleId="EndnoteTextChar">
+    <w:name w:val="Endnote Text Char"/>
+    <w:basedOn w:val="DefaultParagraphFont"/>
+    <w:link w:val="EndnoteText"/>
+    <w:uiPriority w:val="99"/>
+    <w:semiHidden/>
+    <w:unhideWhenUsed/>
+    <w:rPr>
+      <w:sz w:val="20"/>
+      <w:szCs w:val="20"/>
+    </w:rPr>
+  </w:style>
   <w:style w:type="paragraph" w:styleId="Normal">
     <w:name w:val="Normal"/>
     <w:next w:val="Normal"/>
     <w:qFormat/>
     <w:pPr>
-      <w:spacing w:before="0" w:after="0" w:line="340" w:lineRule="auto"/>
+      <w:spacing w:after="0" w:before="0" w:line="340" w:lineRule="auto"/>
     </w:pPr>
     <w:rPr>
       <w:rFonts w:ascii="Arial" w:cs="Arial" w:eastAsia="Arial" w:hAnsi="Arial"/>
@@ -3509,7 +3583,7 @@
     <w:next w:val="OAClauseBody"/>
     <w:qFormat/>
     <w:pPr>
-      <w:spacing w:before="320" w:after="120" w:line="340" w:lineRule="auto"/>
+      <w:spacing w:after="120" w:before="320" w:line="340" w:lineRule="auto"/>
     </w:pPr>
     <w:rPr>
       <w:rFonts w:ascii="Arial" w:cs="Arial" w:eastAsia="Arial" w:hAnsi="Arial"/>
@@ -3526,7 +3600,7 @@
     <w:next w:val="OAClauseHeading"/>
     <w:qFormat/>
     <w:pPr>
-      <w:spacing w:before="0" w:after="280" w:line="340" w:lineRule="auto"/>
+      <w:spacing w:after="280" w:before="0" w:line="340" w:lineRule="auto"/>
     </w:pPr>
     <w:rPr>
       <w:rFonts w:ascii="Arial" w:cs="Arial" w:eastAsia="Arial" w:hAnsi="Arial"/>

</xml_diff>

<commit_message>
Align employee IP template with Wyoming canonical pattern
- Add a Defined Terms clause (Company, Employee, Effective Date, Confidential
  Information, Covered Inventions, Prior Inventions, Excluded Inventions)
  matching the Wyoming template's authoring shape
- Switch defined_term_highlight_mode to definition_site_only so brackets
  highlight only at the definition paragraph, not on every prose mention
- Update prose to use defined terms with consistent capitalization
  (Confidential Information, Covered Inventions, Prior Inventions,
  Excluded Inventions)
- Reject output_markdown_path on canonical sources in canonical-source.mjs;
  the canonical template.md is itself the source and there is no separate
  generated preview to write
</commit_message>
<xml_diff>
--- a/content/templates/openagreements-employee-ip-inventions-assignment/template.docx
+++ b/content/templates/openagreements-employee-ip-inventions-assignment/template.docx
@@ -888,7 +888,7 @@
           <w:sz w:val="22"/>
           <w:szCs w:val="22"/>
         </w:rPr>
-        <w:t xml:space="preserve">1. Assignment of Inventions.</w:t>
+        <w:t xml:space="preserve">1. Defined Terms.</w:t>
       </w:r>
     </w:p>
     <w:p>
@@ -900,16 +900,273 @@
       <w:r>
         <w:rPr>
           <w:rFonts w:ascii="Arial" w:cs="Arial" w:eastAsia="Arial" w:hAnsi="Arial"/>
+          <w:color w:val="1D2021"/>
+          <w:sz w:val="22"/>
+          <w:szCs w:val="22"/>
+        </w:rPr>
+        <w:t xml:space="preserve">1.1 </w:t>
+      </w:r>
+      <w:r>
+        <w:rPr>
+          <w:rFonts w:ascii="Arial" w:cs="Arial" w:eastAsia="Arial" w:hAnsi="Arial"/>
           <w:b/>
           <w:bCs/>
-          <w:i w:val="false"/>
-          <w:iCs w:val="false"/>
           <w:color w:val="117086"/>
           <w:sz w:val="22"/>
           <w:szCs w:val="22"/>
         </w:rPr>
-        <w:t xml:space="preserve">Employee</w:t>
-      </w:r>
+        <w:t xml:space="preserve">“Company”</w:t>
+      </w:r>
+      <w:r>
+        <w:rPr>
+          <w:rFonts w:ascii="Arial" w:cs="Arial" w:eastAsia="Arial" w:hAnsi="Arial"/>
+          <w:color w:val="1D2021"/>
+          <w:sz w:val="22"/>
+          <w:szCs w:val="22"/>
+        </w:rPr>
+        <w:t xml:space="preserve"> means the entity identified as Company in Cover Terms.</w:t>
+      </w:r>
+    </w:p>
+    <w:p>
+      <w:pPr>
+        <w:pStyle w:val="OAClauseBody"/>
+        <w:spacing w:after="280" w:before="320" w:line="340" w:beforeAutospacing="false" w:afterAutospacing="false"/>
+        <w:contextualSpacing w:val="false"/>
+      </w:pPr>
+      <w:r>
+        <w:rPr>
+          <w:rFonts w:ascii="Arial" w:cs="Arial" w:eastAsia="Arial" w:hAnsi="Arial"/>
+          <w:color w:val="1D2021"/>
+          <w:sz w:val="22"/>
+          <w:szCs w:val="22"/>
+        </w:rPr>
+        <w:t xml:space="preserve">1.2 </w:t>
+      </w:r>
+      <w:r>
+        <w:rPr>
+          <w:rFonts w:ascii="Arial" w:cs="Arial" w:eastAsia="Arial" w:hAnsi="Arial"/>
+          <w:b/>
+          <w:bCs/>
+          <w:color w:val="117086"/>
+          <w:sz w:val="22"/>
+          <w:szCs w:val="22"/>
+        </w:rPr>
+        <w:t xml:space="preserve">“Confidential Information”</w:t>
+      </w:r>
+      <w:r>
+        <w:rPr>
+          <w:rFonts w:ascii="Arial" w:cs="Arial" w:eastAsia="Arial" w:hAnsi="Arial"/>
+          <w:color w:val="1D2021"/>
+          <w:sz w:val="22"/>
+          <w:szCs w:val="22"/>
+        </w:rPr>
+        <w:t xml:space="preserve"> has the meaning given in Cover Terms under Confidential Information Definition and includes information that Employee learns or develops during employment that is not publicly known.</w:t>
+      </w:r>
+    </w:p>
+    <w:p>
+      <w:pPr>
+        <w:pStyle w:val="OAClauseBody"/>
+        <w:spacing w:after="280" w:before="320" w:line="340" w:beforeAutospacing="false" w:afterAutospacing="false"/>
+        <w:contextualSpacing w:val="false"/>
+      </w:pPr>
+      <w:r>
+        <w:rPr>
+          <w:rFonts w:ascii="Arial" w:cs="Arial" w:eastAsia="Arial" w:hAnsi="Arial"/>
+          <w:color w:val="1D2021"/>
+          <w:sz w:val="22"/>
+          <w:szCs w:val="22"/>
+        </w:rPr>
+        <w:t xml:space="preserve">1.3 </w:t>
+      </w:r>
+      <w:r>
+        <w:rPr>
+          <w:rFonts w:ascii="Arial" w:cs="Arial" w:eastAsia="Arial" w:hAnsi="Arial"/>
+          <w:b/>
+          <w:bCs/>
+          <w:color w:val="117086"/>
+          <w:sz w:val="22"/>
+          <w:szCs w:val="22"/>
+        </w:rPr>
+        <w:t xml:space="preserve">“Covered Inventions”</w:t>
+      </w:r>
+      <w:r>
+        <w:rPr>
+          <w:rFonts w:ascii="Arial" w:cs="Arial" w:eastAsia="Arial" w:hAnsi="Arial"/>
+          <w:color w:val="1D2021"/>
+          <w:sz w:val="22"/>
+          <w:szCs w:val="22"/>
+        </w:rPr>
+        <w:t xml:space="preserve"> means inventions, software, works of authorship, discoveries, designs, data models, and related intellectual property created during employment that arise from Company work, use Company resources, or relate to Company actual or anticipated business.</w:t>
+      </w:r>
+    </w:p>
+    <w:p>
+      <w:pPr>
+        <w:pStyle w:val="OAClauseBody"/>
+        <w:spacing w:after="280" w:before="320" w:line="340" w:beforeAutospacing="false" w:afterAutospacing="false"/>
+        <w:contextualSpacing w:val="false"/>
+      </w:pPr>
+      <w:r>
+        <w:rPr>
+          <w:rFonts w:ascii="Arial" w:cs="Arial" w:eastAsia="Arial" w:hAnsi="Arial"/>
+          <w:color w:val="1D2021"/>
+          <w:sz w:val="22"/>
+          <w:szCs w:val="22"/>
+        </w:rPr>
+        <w:t xml:space="preserve">1.4 </w:t>
+      </w:r>
+      <w:r>
+        <w:rPr>
+          <w:rFonts w:ascii="Arial" w:cs="Arial" w:eastAsia="Arial" w:hAnsi="Arial"/>
+          <w:b/>
+          <w:bCs/>
+          <w:color w:val="117086"/>
+          <w:sz w:val="22"/>
+          <w:szCs w:val="22"/>
+        </w:rPr>
+        <w:t xml:space="preserve">“Effective Date”</w:t>
+      </w:r>
+      <w:r>
+        <w:rPr>
+          <w:rFonts w:ascii="Arial" w:cs="Arial" w:eastAsia="Arial" w:hAnsi="Arial"/>
+          <w:color w:val="1D2021"/>
+          <w:sz w:val="22"/>
+          <w:szCs w:val="22"/>
+        </w:rPr>
+        <w:t xml:space="preserve"> means the date specified in Cover Terms.</w:t>
+      </w:r>
+    </w:p>
+    <w:p>
+      <w:pPr>
+        <w:pStyle w:val="OAClauseBody"/>
+        <w:spacing w:after="280" w:before="320" w:line="340" w:beforeAutospacing="false" w:afterAutospacing="false"/>
+        <w:contextualSpacing w:val="false"/>
+      </w:pPr>
+      <w:r>
+        <w:rPr>
+          <w:rFonts w:ascii="Arial" w:cs="Arial" w:eastAsia="Arial" w:hAnsi="Arial"/>
+          <w:color w:val="1D2021"/>
+          <w:sz w:val="22"/>
+          <w:szCs w:val="22"/>
+        </w:rPr>
+        <w:t xml:space="preserve">1.5 </w:t>
+      </w:r>
+      <w:r>
+        <w:rPr>
+          <w:rFonts w:ascii="Arial" w:cs="Arial" w:eastAsia="Arial" w:hAnsi="Arial"/>
+          <w:b/>
+          <w:bCs/>
+          <w:color w:val="117086"/>
+          <w:sz w:val="22"/>
+          <w:szCs w:val="22"/>
+        </w:rPr>
+        <w:t xml:space="preserve">“Employee”</w:t>
+      </w:r>
+      <w:r>
+        <w:rPr>
+          <w:rFonts w:ascii="Arial" w:cs="Arial" w:eastAsia="Arial" w:hAnsi="Arial"/>
+          <w:color w:val="1D2021"/>
+          <w:sz w:val="22"/>
+          <w:szCs w:val="22"/>
+        </w:rPr>
+        <w:t xml:space="preserve"> means the individual identified as Employee in Cover Terms.</w:t>
+      </w:r>
+    </w:p>
+    <w:p>
+      <w:pPr>
+        <w:pStyle w:val="OAClauseBody"/>
+        <w:spacing w:after="280" w:before="320" w:line="340" w:beforeAutospacing="false" w:afterAutospacing="false"/>
+        <w:contextualSpacing w:val="false"/>
+      </w:pPr>
+      <w:r>
+        <w:rPr>
+          <w:rFonts w:ascii="Arial" w:cs="Arial" w:eastAsia="Arial" w:hAnsi="Arial"/>
+          <w:color w:val="1D2021"/>
+          <w:sz w:val="22"/>
+          <w:szCs w:val="22"/>
+        </w:rPr>
+        <w:t xml:space="preserve">1.6 </w:t>
+      </w:r>
+      <w:r>
+        <w:rPr>
+          <w:rFonts w:ascii="Arial" w:cs="Arial" w:eastAsia="Arial" w:hAnsi="Arial"/>
+          <w:b/>
+          <w:bCs/>
+          <w:color w:val="117086"/>
+          <w:sz w:val="22"/>
+          <w:szCs w:val="22"/>
+        </w:rPr>
+        <w:t xml:space="preserve">“Excluded Inventions”</w:t>
+      </w:r>
+      <w:r>
+        <w:rPr>
+          <w:rFonts w:ascii="Arial" w:cs="Arial" w:eastAsia="Arial" w:hAnsi="Arial"/>
+          <w:color w:val="1D2021"/>
+          <w:sz w:val="22"/>
+          <w:szCs w:val="22"/>
+        </w:rPr>
+        <w:t xml:space="preserve"> means inventions described in Cover Terms under Excluded Inventions Statement.</w:t>
+      </w:r>
+    </w:p>
+    <w:p>
+      <w:pPr>
+        <w:pStyle w:val="OAClauseBody"/>
+        <w:spacing w:after="280" w:before="320" w:line="340" w:beforeAutospacing="false" w:afterAutospacing="false"/>
+        <w:contextualSpacing w:val="false"/>
+      </w:pPr>
+      <w:r>
+        <w:rPr>
+          <w:rFonts w:ascii="Arial" w:cs="Arial" w:eastAsia="Arial" w:hAnsi="Arial"/>
+          <w:color w:val="1D2021"/>
+          <w:sz w:val="22"/>
+          <w:szCs w:val="22"/>
+        </w:rPr>
+        <w:t xml:space="preserve">1.7 </w:t>
+      </w:r>
+      <w:r>
+        <w:rPr>
+          <w:rFonts w:ascii="Arial" w:cs="Arial" w:eastAsia="Arial" w:hAnsi="Arial"/>
+          <w:b/>
+          <w:bCs/>
+          <w:color w:val="117086"/>
+          <w:sz w:val="22"/>
+          <w:szCs w:val="22"/>
+        </w:rPr>
+        <w:t xml:space="preserve">“Prior Inventions”</w:t>
+      </w:r>
+      <w:r>
+        <w:rPr>
+          <w:rFonts w:ascii="Arial" w:cs="Arial" w:eastAsia="Arial" w:hAnsi="Arial"/>
+          <w:color w:val="1D2021"/>
+          <w:sz w:val="22"/>
+          <w:szCs w:val="22"/>
+        </w:rPr>
+        <w:t xml:space="preserve"> means inventions identified in Cover Terms under Prior Inventions Disclosure.</w:t>
+      </w:r>
+    </w:p>
+    <w:p>
+      <w:pPr>
+        <w:pStyle w:val="OAClauseHeading"/>
+        <w:spacing w:after="120" w:before="320" w:line="340" w:beforeAutospacing="false" w:afterAutospacing="false"/>
+        <w:contextualSpacing w:val="false"/>
+      </w:pPr>
+      <w:r>
+        <w:rPr>
+          <w:rFonts w:ascii="Arial" w:cs="Arial" w:eastAsia="Arial" w:hAnsi="Arial"/>
+          <w:b/>
+          <w:bCs/>
+          <w:color w:val="1D2021"/>
+          <w:sz w:val="22"/>
+          <w:szCs w:val="22"/>
+        </w:rPr>
+        <w:t xml:space="preserve">2. Assignment of Inventions.</w:t>
+      </w:r>
+    </w:p>
+    <w:p>
+      <w:pPr>
+        <w:pStyle w:val="OAClauseBody"/>
+        <w:spacing w:after="280" w:before="0" w:line="340" w:beforeAutospacing="false" w:afterAutospacing="false"/>
+        <w:contextualSpacing w:val="false"/>
+      </w:pPr>
       <w:r>
         <w:rPr>
           <w:rFonts w:ascii="Arial" w:cs="Arial" w:eastAsia="Arial" w:hAnsi="Arial"/>
@@ -921,21 +1178,33 @@
           <w:sz w:val="22"/>
           <w:szCs w:val="22"/>
         </w:rPr>
-        <w:t xml:space="preserve"> assigns and agrees to assign to </w:t>
-      </w:r>
+        <w:t xml:space="preserve">Employee assigns and agrees to assign to Company all right, title, and interest in Covered Inventions, to the extent permitted by law.</w:t>
+      </w:r>
+    </w:p>
+    <w:p>
+      <w:pPr>
+        <w:pStyle w:val="OAClauseHeading"/>
+        <w:spacing w:after="120" w:before="320" w:line="340" w:beforeAutospacing="false" w:afterAutospacing="false"/>
+        <w:contextualSpacing w:val="false"/>
+      </w:pPr>
       <w:r>
         <w:rPr>
           <w:rFonts w:ascii="Arial" w:cs="Arial" w:eastAsia="Arial" w:hAnsi="Arial"/>
           <w:b/>
           <w:bCs/>
-          <w:i w:val="false"/>
-          <w:iCs w:val="false"/>
-          <w:color w:val="117086"/>
-          <w:sz w:val="22"/>
-          <w:szCs w:val="22"/>
-        </w:rPr>
-        <w:t xml:space="preserve">Company</w:t>
-      </w:r>
+          <w:color w:val="1D2021"/>
+          <w:sz w:val="22"/>
+          <w:szCs w:val="22"/>
+        </w:rPr>
+        <w:t xml:space="preserve">3. Work Made for Hire and Further Assurances.</w:t>
+      </w:r>
+    </w:p>
+    <w:p>
+      <w:pPr>
+        <w:pStyle w:val="OAClauseBody"/>
+        <w:spacing w:after="280" w:before="0" w:line="340" w:beforeAutospacing="false" w:afterAutospacing="false"/>
+        <w:contextualSpacing w:val="false"/>
+      </w:pPr>
       <w:r>
         <w:rPr>
           <w:rFonts w:ascii="Arial" w:cs="Arial" w:eastAsia="Arial" w:hAnsi="Arial"/>
@@ -947,21 +1216,33 @@
           <w:sz w:val="22"/>
           <w:szCs w:val="22"/>
         </w:rPr>
-        <w:t xml:space="preserve"> all right, title, and interest in inventions, software, works of authorship, discoveries, designs, data models, and related intellectual property created during employment that arise from </w:t>
-      </w:r>
+        <w:t xml:space="preserve">To the extent legally permitted, copyrightable works prepared within the scope of employment are works made for hire for Company. If any rights do not automatically vest in Company, Employee assigns those rights and will sign additional documents reasonably requested to confirm ownership and record assignments.</w:t>
+      </w:r>
+    </w:p>
+    <w:p>
+      <w:pPr>
+        <w:pStyle w:val="OAClauseHeading"/>
+        <w:spacing w:after="120" w:before="320" w:line="340" w:beforeAutospacing="false" w:afterAutospacing="false"/>
+        <w:contextualSpacing w:val="false"/>
+      </w:pPr>
       <w:r>
         <w:rPr>
           <w:rFonts w:ascii="Arial" w:cs="Arial" w:eastAsia="Arial" w:hAnsi="Arial"/>
           <w:b/>
           <w:bCs/>
-          <w:i w:val="false"/>
-          <w:iCs w:val="false"/>
-          <w:color w:val="117086"/>
-          <w:sz w:val="22"/>
-          <w:szCs w:val="22"/>
-        </w:rPr>
-        <w:t xml:space="preserve">Company</w:t>
-      </w:r>
+          <w:color w:val="1D2021"/>
+          <w:sz w:val="22"/>
+          <w:szCs w:val="22"/>
+        </w:rPr>
+        <w:t xml:space="preserve">4. Disclosure and Documentation.</w:t>
+      </w:r>
+    </w:p>
+    <w:p>
+      <w:pPr>
+        <w:pStyle w:val="OAClauseBody"/>
+        <w:spacing w:after="280" w:before="0" w:line="340" w:beforeAutospacing="false" w:afterAutospacing="false"/>
+        <w:contextualSpacing w:val="false"/>
+      </w:pPr>
       <w:r>
         <w:rPr>
           <w:rFonts w:ascii="Arial" w:cs="Arial" w:eastAsia="Arial" w:hAnsi="Arial"/>
@@ -973,21 +1254,33 @@
           <w:sz w:val="22"/>
           <w:szCs w:val="22"/>
         </w:rPr>
-        <w:t xml:space="preserve"> work, use </w:t>
-      </w:r>
+        <w:t xml:space="preserve">Employee will promptly disclose Covered Inventions and maintain reasonably complete records needed to document conception, authorship, development, and transfer of rights for Company business, consistent with lawful policy and confidentiality obligations.</w:t>
+      </w:r>
+    </w:p>
+    <w:p>
+      <w:pPr>
+        <w:pStyle w:val="OAClauseHeading"/>
+        <w:spacing w:after="120" w:before="320" w:line="340" w:beforeAutospacing="false" w:afterAutospacing="false"/>
+        <w:contextualSpacing w:val="false"/>
+      </w:pPr>
       <w:r>
         <w:rPr>
           <w:rFonts w:ascii="Arial" w:cs="Arial" w:eastAsia="Arial" w:hAnsi="Arial"/>
           <w:b/>
           <w:bCs/>
-          <w:i w:val="false"/>
-          <w:iCs w:val="false"/>
-          <w:color w:val="117086"/>
-          <w:sz w:val="22"/>
-          <w:szCs w:val="22"/>
-        </w:rPr>
-        <w:t xml:space="preserve">Company</w:t>
-      </w:r>
+          <w:color w:val="1D2021"/>
+          <w:sz w:val="22"/>
+          <w:szCs w:val="22"/>
+        </w:rPr>
+        <w:t xml:space="preserve">5. Prior and Excluded Inventions.</w:t>
+      </w:r>
+    </w:p>
+    <w:p>
+      <w:pPr>
+        <w:pStyle w:val="OAClauseBody"/>
+        <w:spacing w:after="280" w:before="0" w:line="340" w:beforeAutospacing="false" w:afterAutospacing="false"/>
+        <w:contextualSpacing w:val="false"/>
+      </w:pPr>
       <w:r>
         <w:rPr>
           <w:rFonts w:ascii="Arial" w:cs="Arial" w:eastAsia="Arial" w:hAnsi="Arial"/>
@@ -999,21 +1292,33 @@
           <w:sz w:val="22"/>
           <w:szCs w:val="22"/>
         </w:rPr>
-        <w:t xml:space="preserve"> resources, or relate to </w:t>
-      </w:r>
+        <w:t xml:space="preserve">Prior Inventions and Excluded Inventions remain carved out only to the extent permitted by applicable law. Employee represents that the Prior Inventions disclosure in Cover Terms is complete to Employee knowledge as of the Effective Date.</w:t>
+      </w:r>
+    </w:p>
+    <w:p>
+      <w:pPr>
+        <w:pStyle w:val="OAClauseHeading"/>
+        <w:spacing w:after="120" w:before="320" w:line="340" w:beforeAutospacing="false" w:afterAutospacing="false"/>
+        <w:contextualSpacing w:val="false"/>
+      </w:pPr>
       <w:r>
         <w:rPr>
           <w:rFonts w:ascii="Arial" w:cs="Arial" w:eastAsia="Arial" w:hAnsi="Arial"/>
           <w:b/>
           <w:bCs/>
-          <w:i w:val="false"/>
-          <w:iCs w:val="false"/>
-          <w:color w:val="117086"/>
-          <w:sz w:val="22"/>
-          <w:szCs w:val="22"/>
-        </w:rPr>
-        <w:t xml:space="preserve">Company</w:t>
-      </w:r>
+          <w:color w:val="1D2021"/>
+          <w:sz w:val="22"/>
+          <w:szCs w:val="22"/>
+        </w:rPr>
+        <w:t xml:space="preserve">6. Confidential Information and Trade Secrets.</w:t>
+      </w:r>
+    </w:p>
+    <w:p>
+      <w:pPr>
+        <w:pStyle w:val="OAClauseBody"/>
+        <w:spacing w:after="280" w:before="0" w:line="340" w:beforeAutospacing="false" w:afterAutospacing="false"/>
+        <w:contextualSpacing w:val="false"/>
+      </w:pPr>
       <w:r>
         <w:rPr>
           <w:rFonts w:ascii="Arial" w:cs="Arial" w:eastAsia="Arial" w:hAnsi="Arial"/>
@@ -1025,7 +1330,7 @@
           <w:sz w:val="22"/>
           <w:szCs w:val="22"/>
         </w:rPr>
-        <w:t xml:space="preserve"> actual or anticipated business, to the extent permitted by law.</w:t>
+        <w:t xml:space="preserve">Employee will use and protect Confidential Information solely for authorized Company purposes, will not misuse or disclose Confidential Information except as permitted by Company policy or law, and will follow the Confidential Information definition set out in Cover Terms.</w:t>
       </w:r>
     </w:p>
     <w:p>
@@ -1043,7 +1348,7 @@
           <w:sz w:val="22"/>
           <w:szCs w:val="22"/>
         </w:rPr>
-        <w:t xml:space="preserve">2. Work Made for Hire and Further Assurances.</w:t>
+        <w:t xml:space="preserve">7. No Conflicting Obligations.</w:t>
       </w:r>
     </w:p>
     <w:p>
@@ -1063,21 +1368,33 @@
           <w:sz w:val="22"/>
           <w:szCs w:val="22"/>
         </w:rPr>
-        <w:t xml:space="preserve">To the extent legally permitted, copyrightable works prepared within the scope of employment are works made for hire for </w:t>
-      </w:r>
+        <w:t xml:space="preserve">Employee represents that performing duties for Company does not knowingly conflict with binding obligations to another person or entity. Employee will not bring third-party Confidential Information into Company systems or use it in Company work without written authorization.</w:t>
+      </w:r>
+    </w:p>
+    <w:p>
+      <w:pPr>
+        <w:pStyle w:val="OAClauseHeading"/>
+        <w:spacing w:after="120" w:before="320" w:line="340" w:beforeAutospacing="false" w:afterAutospacing="false"/>
+        <w:contextualSpacing w:val="false"/>
+      </w:pPr>
       <w:r>
         <w:rPr>
           <w:rFonts w:ascii="Arial" w:cs="Arial" w:eastAsia="Arial" w:hAnsi="Arial"/>
           <w:b/>
           <w:bCs/>
-          <w:i w:val="false"/>
-          <w:iCs w:val="false"/>
-          <w:color w:val="117086"/>
-          <w:sz w:val="22"/>
-          <w:szCs w:val="22"/>
-        </w:rPr>
-        <w:t xml:space="preserve">Company</w:t>
-      </w:r>
+          <w:color w:val="1D2021"/>
+          <w:sz w:val="22"/>
+          <w:szCs w:val="22"/>
+        </w:rPr>
+        <w:t xml:space="preserve">8. Records, Cooperation, and Post-Termination Assistance.</w:t>
+      </w:r>
+    </w:p>
+    <w:p>
+      <w:pPr>
+        <w:pStyle w:val="OAClauseBody"/>
+        <w:spacing w:after="280" w:before="0" w:line="340" w:beforeAutospacing="false" w:afterAutospacing="false"/>
+        <w:contextualSpacing w:val="false"/>
+      </w:pPr>
       <w:r>
         <w:rPr>
           <w:rFonts w:ascii="Arial" w:cs="Arial" w:eastAsia="Arial" w:hAnsi="Arial"/>
@@ -1089,21 +1406,33 @@
           <w:sz w:val="22"/>
           <w:szCs w:val="22"/>
         </w:rPr>
-        <w:t xml:space="preserve">. If any rights do not automatically vest in </w:t>
-      </w:r>
+        <w:t xml:space="preserve">Employee will provide the post-termination assistance listed in Cover Terms, including reasonable cooperation with filings, declarations, and assignments needed to confirm or protect Company rights in Covered Inventions, subject to reimbursement of reasonable out-of-pocket expenses when required by policy.</w:t>
+      </w:r>
+    </w:p>
+    <w:p>
+      <w:pPr>
+        <w:pStyle w:val="OAClauseHeading"/>
+        <w:spacing w:after="120" w:before="320" w:line="340" w:beforeAutospacing="false" w:afterAutospacing="false"/>
+        <w:contextualSpacing w:val="false"/>
+      </w:pPr>
       <w:r>
         <w:rPr>
           <w:rFonts w:ascii="Arial" w:cs="Arial" w:eastAsia="Arial" w:hAnsi="Arial"/>
           <w:b/>
           <w:bCs/>
-          <w:i w:val="false"/>
-          <w:iCs w:val="false"/>
-          <w:color w:val="117086"/>
-          <w:sz w:val="22"/>
-          <w:szCs w:val="22"/>
-        </w:rPr>
-        <w:t xml:space="preserve">Company</w:t>
-      </w:r>
+          <w:color w:val="1D2021"/>
+          <w:sz w:val="22"/>
+          <w:szCs w:val="22"/>
+        </w:rPr>
+        <w:t xml:space="preserve">9. Return and Deletion of Materials.</w:t>
+      </w:r>
+    </w:p>
+    <w:p>
+      <w:pPr>
+        <w:pStyle w:val="OAClauseBody"/>
+        <w:spacing w:after="280" w:before="0" w:line="340" w:beforeAutospacing="false" w:afterAutospacing="false"/>
+        <w:contextualSpacing w:val="false"/>
+      </w:pPr>
       <w:r>
         <w:rPr>
           <w:rFonts w:ascii="Arial" w:cs="Arial" w:eastAsia="Arial" w:hAnsi="Arial"/>
@@ -1115,21 +1444,33 @@
           <w:sz w:val="22"/>
           <w:szCs w:val="22"/>
         </w:rPr>
-        <w:t xml:space="preserve">, </w:t>
-      </w:r>
+        <w:t xml:space="preserve">Employee will return, and where permitted delete, Company materials within the timing listed in Cover Terms, including devices, documents, credentials, and confidential files, except for records Employee is required to retain by law.</w:t>
+      </w:r>
+    </w:p>
+    <w:p>
+      <w:pPr>
+        <w:pStyle w:val="OAClauseHeading"/>
+        <w:spacing w:after="120" w:before="320" w:line="340" w:beforeAutospacing="false" w:afterAutospacing="false"/>
+        <w:contextualSpacing w:val="false"/>
+      </w:pPr>
       <w:r>
         <w:rPr>
           <w:rFonts w:ascii="Arial" w:cs="Arial" w:eastAsia="Arial" w:hAnsi="Arial"/>
           <w:b/>
           <w:bCs/>
-          <w:i w:val="false"/>
-          <w:iCs w:val="false"/>
-          <w:color w:val="117086"/>
-          <w:sz w:val="22"/>
-          <w:szCs w:val="22"/>
-        </w:rPr>
-        <w:t xml:space="preserve">Employee</w:t>
-      </w:r>
+          <w:color w:val="1D2021"/>
+          <w:sz w:val="22"/>
+          <w:szCs w:val="22"/>
+        </w:rPr>
+        <w:t xml:space="preserve">10. Survival and Limited Scope.</w:t>
+      </w:r>
+    </w:p>
+    <w:p>
+      <w:pPr>
+        <w:pStyle w:val="OAClauseBody"/>
+        <w:spacing w:after="280" w:before="0" w:line="340" w:beforeAutospacing="false" w:afterAutospacing="false"/>
+        <w:contextualSpacing w:val="false"/>
+      </w:pPr>
       <w:r>
         <w:rPr>
           <w:rFonts w:ascii="Arial" w:cs="Arial" w:eastAsia="Arial" w:hAnsi="Arial"/>
@@ -1141,7 +1482,7 @@
           <w:sz w:val="22"/>
           <w:szCs w:val="22"/>
         </w:rPr>
-        <w:t xml:space="preserve"> assigns those rights and will sign additional documents reasonably requested to confirm ownership and record assignments.</w:t>
+        <w:t xml:space="preserve">Sections addressing assignment, confidentiality, return of materials, and assistance survive termination to the extent needed to enforce rights that arose during employment. This agreement does not transfer ownership of inventions that applicable law requires to remain with Employee.</w:t>
       </w:r>
     </w:p>
     <w:p>
@@ -1159,7 +1500,7 @@
           <w:sz w:val="22"/>
           <w:szCs w:val="22"/>
         </w:rPr>
-        <w:t xml:space="preserve">3. Disclosure and Documentation.</w:t>
+        <w:t xml:space="preserve">11. Governing Law and Venue.</w:t>
       </w:r>
     </w:p>
     <w:p>
@@ -1168,19 +1509,6 @@
         <w:spacing w:after="280" w:before="0" w:line="340" w:beforeAutospacing="false" w:afterAutospacing="false"/>
         <w:contextualSpacing w:val="false"/>
       </w:pPr>
-      <w:r>
-        <w:rPr>
-          <w:rFonts w:ascii="Arial" w:cs="Arial" w:eastAsia="Arial" w:hAnsi="Arial"/>
-          <w:b/>
-          <w:bCs/>
-          <w:i w:val="false"/>
-          <w:iCs w:val="false"/>
-          <w:color w:val="117086"/>
-          <w:sz w:val="22"/>
-          <w:szCs w:val="22"/>
-        </w:rPr>
-        <w:t xml:space="preserve">Employee</w:t>
-      </w:r>
       <w:r>
         <w:rPr>
           <w:rFonts w:ascii="Arial" w:cs="Arial" w:eastAsia="Arial" w:hAnsi="Arial"/>
@@ -1192,845 +1520,7 @@
           <w:sz w:val="22"/>
           <w:szCs w:val="22"/>
         </w:rPr>
-        <w:t xml:space="preserve"> will promptly disclose covered inventions and maintain reasonably complete records needed to document conception, authorship, development, and transfer of rights for </w:t>
-      </w:r>
-      <w:r>
-        <w:rPr>
-          <w:rFonts w:ascii="Arial" w:cs="Arial" w:eastAsia="Arial" w:hAnsi="Arial"/>
-          <w:b/>
-          <w:bCs/>
-          <w:i w:val="false"/>
-          <w:iCs w:val="false"/>
-          <w:color w:val="117086"/>
-          <w:sz w:val="22"/>
-          <w:szCs w:val="22"/>
-        </w:rPr>
-        <w:t xml:space="preserve">Company</w:t>
-      </w:r>
-      <w:r>
-        <w:rPr>
-          <w:rFonts w:ascii="Arial" w:cs="Arial" w:eastAsia="Arial" w:hAnsi="Arial"/>
-          <w:b w:val="false"/>
-          <w:bCs w:val="false"/>
-          <w:i w:val="false"/>
-          <w:iCs w:val="false"/>
-          <w:color w:val="1D2021"/>
-          <w:sz w:val="22"/>
-          <w:szCs w:val="22"/>
-        </w:rPr>
-        <w:t xml:space="preserve"> business, consistent with lawful policy and confidentiality obligations.</w:t>
-      </w:r>
-    </w:p>
-    <w:p>
-      <w:pPr>
-        <w:pStyle w:val="OAClauseHeading"/>
-        <w:spacing w:after="120" w:before="320" w:line="340" w:beforeAutospacing="false" w:afterAutospacing="false"/>
-        <w:contextualSpacing w:val="false"/>
-      </w:pPr>
-      <w:r>
-        <w:rPr>
-          <w:rFonts w:ascii="Arial" w:cs="Arial" w:eastAsia="Arial" w:hAnsi="Arial"/>
-          <w:b/>
-          <w:bCs/>
-          <w:color w:val="1D2021"/>
-          <w:sz w:val="22"/>
-          <w:szCs w:val="22"/>
-        </w:rPr>
-        <w:t xml:space="preserve">4. Prior and Excluded Inventions.</w:t>
-      </w:r>
-    </w:p>
-    <w:p>
-      <w:pPr>
-        <w:pStyle w:val="OAClauseBody"/>
-        <w:spacing w:after="280" w:before="0" w:line="340" w:beforeAutospacing="false" w:afterAutospacing="false"/>
-        <w:contextualSpacing w:val="false"/>
-      </w:pPr>
-      <w:r>
-        <w:rPr>
-          <w:rFonts w:ascii="Arial" w:cs="Arial" w:eastAsia="Arial" w:hAnsi="Arial"/>
-          <w:b w:val="false"/>
-          <w:bCs w:val="false"/>
-          <w:i w:val="false"/>
-          <w:iCs w:val="false"/>
-          <w:color w:val="1D2021"/>
-          <w:sz w:val="22"/>
-          <w:szCs w:val="22"/>
-        </w:rPr>
-        <w:t xml:space="preserve">Inventions identified in </w:t>
-      </w:r>
-      <w:r>
-        <w:rPr>
-          <w:rFonts w:ascii="Arial" w:cs="Arial" w:eastAsia="Arial" w:hAnsi="Arial"/>
-          <w:b/>
-          <w:bCs/>
-          <w:i w:val="false"/>
-          <w:iCs w:val="false"/>
-          <w:color w:val="117086"/>
-          <w:sz w:val="22"/>
-          <w:szCs w:val="22"/>
-        </w:rPr>
-        <w:t xml:space="preserve">Cover Terms</w:t>
-      </w:r>
-      <w:r>
-        <w:rPr>
-          <w:rFonts w:ascii="Arial" w:cs="Arial" w:eastAsia="Arial" w:hAnsi="Arial"/>
-          <w:b w:val="false"/>
-          <w:bCs w:val="false"/>
-          <w:i w:val="false"/>
-          <w:iCs w:val="false"/>
-          <w:color w:val="1D2021"/>
-          <w:sz w:val="22"/>
-          <w:szCs w:val="22"/>
-        </w:rPr>
-        <w:t xml:space="preserve"> as prior or excluded remain carved out only to the extent permitted by applicable law. </w:t>
-      </w:r>
-      <w:r>
-        <w:rPr>
-          <w:rFonts w:ascii="Arial" w:cs="Arial" w:eastAsia="Arial" w:hAnsi="Arial"/>
-          <w:b/>
-          <w:bCs/>
-          <w:i w:val="false"/>
-          <w:iCs w:val="false"/>
-          <w:color w:val="117086"/>
-          <w:sz w:val="22"/>
-          <w:szCs w:val="22"/>
-        </w:rPr>
-        <w:t xml:space="preserve">Employee</w:t>
-      </w:r>
-      <w:r>
-        <w:rPr>
-          <w:rFonts w:ascii="Arial" w:cs="Arial" w:eastAsia="Arial" w:hAnsi="Arial"/>
-          <w:b w:val="false"/>
-          <w:bCs w:val="false"/>
-          <w:i w:val="false"/>
-          <w:iCs w:val="false"/>
-          <w:color w:val="1D2021"/>
-          <w:sz w:val="22"/>
-          <w:szCs w:val="22"/>
-        </w:rPr>
-        <w:t xml:space="preserve"> represents that the prior inventions disclosure in </w:t>
-      </w:r>
-      <w:r>
-        <w:rPr>
-          <w:rFonts w:ascii="Arial" w:cs="Arial" w:eastAsia="Arial" w:hAnsi="Arial"/>
-          <w:b/>
-          <w:bCs/>
-          <w:i w:val="false"/>
-          <w:iCs w:val="false"/>
-          <w:color w:val="117086"/>
-          <w:sz w:val="22"/>
-          <w:szCs w:val="22"/>
-        </w:rPr>
-        <w:t xml:space="preserve">Cover Terms</w:t>
-      </w:r>
-      <w:r>
-        <w:rPr>
-          <w:rFonts w:ascii="Arial" w:cs="Arial" w:eastAsia="Arial" w:hAnsi="Arial"/>
-          <w:b w:val="false"/>
-          <w:bCs w:val="false"/>
-          <w:i w:val="false"/>
-          <w:iCs w:val="false"/>
-          <w:color w:val="1D2021"/>
-          <w:sz w:val="22"/>
-          <w:szCs w:val="22"/>
-        </w:rPr>
-        <w:t xml:space="preserve"> is complete to </w:t>
-      </w:r>
-      <w:r>
-        <w:rPr>
-          <w:rFonts w:ascii="Arial" w:cs="Arial" w:eastAsia="Arial" w:hAnsi="Arial"/>
-          <w:b/>
-          <w:bCs/>
-          <w:i w:val="false"/>
-          <w:iCs w:val="false"/>
-          <w:color w:val="117086"/>
-          <w:sz w:val="22"/>
-          <w:szCs w:val="22"/>
-        </w:rPr>
-        <w:t xml:space="preserve">Employee</w:t>
-      </w:r>
-      <w:r>
-        <w:rPr>
-          <w:rFonts w:ascii="Arial" w:cs="Arial" w:eastAsia="Arial" w:hAnsi="Arial"/>
-          <w:b w:val="false"/>
-          <w:bCs w:val="false"/>
-          <w:i w:val="false"/>
-          <w:iCs w:val="false"/>
-          <w:color w:val="1D2021"/>
-          <w:sz w:val="22"/>
-          <w:szCs w:val="22"/>
-        </w:rPr>
-        <w:t xml:space="preserve"> knowledge as of the Effective Date.</w:t>
-      </w:r>
-    </w:p>
-    <w:p>
-      <w:pPr>
-        <w:pStyle w:val="OAClauseHeading"/>
-        <w:spacing w:after="120" w:before="320" w:line="340" w:beforeAutospacing="false" w:afterAutospacing="false"/>
-        <w:contextualSpacing w:val="false"/>
-      </w:pPr>
-      <w:r>
-        <w:rPr>
-          <w:rFonts w:ascii="Arial" w:cs="Arial" w:eastAsia="Arial" w:hAnsi="Arial"/>
-          <w:b/>
-          <w:bCs/>
-          <w:color w:val="1D2021"/>
-          <w:sz w:val="22"/>
-          <w:szCs w:val="22"/>
-        </w:rPr>
-        <w:t xml:space="preserve">5. Confidential Information and Trade Secrets.</w:t>
-      </w:r>
-    </w:p>
-    <w:p>
-      <w:pPr>
-        <w:pStyle w:val="OAClauseBody"/>
-        <w:spacing w:after="280" w:before="0" w:line="340" w:beforeAutospacing="false" w:afterAutospacing="false"/>
-        <w:contextualSpacing w:val="false"/>
-      </w:pPr>
-      <w:r>
-        <w:rPr>
-          <w:rFonts w:ascii="Arial" w:cs="Arial" w:eastAsia="Arial" w:hAnsi="Arial"/>
-          <w:b/>
-          <w:bCs/>
-          <w:i w:val="false"/>
-          <w:iCs w:val="false"/>
-          <w:color w:val="117086"/>
-          <w:sz w:val="22"/>
-          <w:szCs w:val="22"/>
-        </w:rPr>
-        <w:t xml:space="preserve">Employee</w:t>
-      </w:r>
-      <w:r>
-        <w:rPr>
-          <w:rFonts w:ascii="Arial" w:cs="Arial" w:eastAsia="Arial" w:hAnsi="Arial"/>
-          <w:b w:val="false"/>
-          <w:bCs w:val="false"/>
-          <w:i w:val="false"/>
-          <w:iCs w:val="false"/>
-          <w:color w:val="1D2021"/>
-          <w:sz w:val="22"/>
-          <w:szCs w:val="22"/>
-        </w:rPr>
-        <w:t xml:space="preserve"> will use and protect confidential information solely for authorized </w:t>
-      </w:r>
-      <w:r>
-        <w:rPr>
-          <w:rFonts w:ascii="Arial" w:cs="Arial" w:eastAsia="Arial" w:hAnsi="Arial"/>
-          <w:b/>
-          <w:bCs/>
-          <w:i w:val="false"/>
-          <w:iCs w:val="false"/>
-          <w:color w:val="117086"/>
-          <w:sz w:val="22"/>
-          <w:szCs w:val="22"/>
-        </w:rPr>
-        <w:t xml:space="preserve">Company</w:t>
-      </w:r>
-      <w:r>
-        <w:rPr>
-          <w:rFonts w:ascii="Arial" w:cs="Arial" w:eastAsia="Arial" w:hAnsi="Arial"/>
-          <w:b w:val="false"/>
-          <w:bCs w:val="false"/>
-          <w:i w:val="false"/>
-          <w:iCs w:val="false"/>
-          <w:color w:val="1D2021"/>
-          <w:sz w:val="22"/>
-          <w:szCs w:val="22"/>
-        </w:rPr>
-        <w:t xml:space="preserve"> purposes, will not misuse or disclose confidential information except as permitted by </w:t>
-      </w:r>
-      <w:r>
-        <w:rPr>
-          <w:rFonts w:ascii="Arial" w:cs="Arial" w:eastAsia="Arial" w:hAnsi="Arial"/>
-          <w:b/>
-          <w:bCs/>
-          <w:i w:val="false"/>
-          <w:iCs w:val="false"/>
-          <w:color w:val="117086"/>
-          <w:sz w:val="22"/>
-          <w:szCs w:val="22"/>
-        </w:rPr>
-        <w:t xml:space="preserve">Company</w:t>
-      </w:r>
-      <w:r>
-        <w:rPr>
-          <w:rFonts w:ascii="Arial" w:cs="Arial" w:eastAsia="Arial" w:hAnsi="Arial"/>
-          <w:b w:val="false"/>
-          <w:bCs w:val="false"/>
-          <w:i w:val="false"/>
-          <w:iCs w:val="false"/>
-          <w:color w:val="1D2021"/>
-          <w:sz w:val="22"/>
-          <w:szCs w:val="22"/>
-        </w:rPr>
-        <w:t xml:space="preserve"> policy or law, and will follow the confidential information definition set out in </w:t>
-      </w:r>
-      <w:r>
-        <w:rPr>
-          <w:rFonts w:ascii="Arial" w:cs="Arial" w:eastAsia="Arial" w:hAnsi="Arial"/>
-          <w:b/>
-          <w:bCs/>
-          <w:i w:val="false"/>
-          <w:iCs w:val="false"/>
-          <w:color w:val="117086"/>
-          <w:sz w:val="22"/>
-          <w:szCs w:val="22"/>
-        </w:rPr>
-        <w:t xml:space="preserve">Cover Terms</w:t>
-      </w:r>
-      <w:r>
-        <w:rPr>
-          <w:rFonts w:ascii="Arial" w:cs="Arial" w:eastAsia="Arial" w:hAnsi="Arial"/>
-          <w:b w:val="false"/>
-          <w:bCs w:val="false"/>
-          <w:i w:val="false"/>
-          <w:iCs w:val="false"/>
-          <w:color w:val="1D2021"/>
-          <w:sz w:val="22"/>
-          <w:szCs w:val="22"/>
-        </w:rPr>
-        <w:t xml:space="preserve">.</w:t>
-      </w:r>
-    </w:p>
-    <w:p>
-      <w:pPr>
-        <w:pStyle w:val="OAClauseHeading"/>
-        <w:spacing w:after="120" w:before="320" w:line="340" w:beforeAutospacing="false" w:afterAutospacing="false"/>
-        <w:contextualSpacing w:val="false"/>
-      </w:pPr>
-      <w:r>
-        <w:rPr>
-          <w:rFonts w:ascii="Arial" w:cs="Arial" w:eastAsia="Arial" w:hAnsi="Arial"/>
-          <w:b/>
-          <w:bCs/>
-          <w:color w:val="1D2021"/>
-          <w:sz w:val="22"/>
-          <w:szCs w:val="22"/>
-        </w:rPr>
-        <w:t xml:space="preserve">6. No Conflicting Obligations.</w:t>
-      </w:r>
-    </w:p>
-    <w:p>
-      <w:pPr>
-        <w:pStyle w:val="OAClauseBody"/>
-        <w:spacing w:after="280" w:before="0" w:line="340" w:beforeAutospacing="false" w:afterAutospacing="false"/>
-        <w:contextualSpacing w:val="false"/>
-      </w:pPr>
-      <w:r>
-        <w:rPr>
-          <w:rFonts w:ascii="Arial" w:cs="Arial" w:eastAsia="Arial" w:hAnsi="Arial"/>
-          <w:b/>
-          <w:bCs/>
-          <w:i w:val="false"/>
-          <w:iCs w:val="false"/>
-          <w:color w:val="117086"/>
-          <w:sz w:val="22"/>
-          <w:szCs w:val="22"/>
-        </w:rPr>
-        <w:t xml:space="preserve">Employee</w:t>
-      </w:r>
-      <w:r>
-        <w:rPr>
-          <w:rFonts w:ascii="Arial" w:cs="Arial" w:eastAsia="Arial" w:hAnsi="Arial"/>
-          <w:b w:val="false"/>
-          <w:bCs w:val="false"/>
-          <w:i w:val="false"/>
-          <w:iCs w:val="false"/>
-          <w:color w:val="1D2021"/>
-          <w:sz w:val="22"/>
-          <w:szCs w:val="22"/>
-        </w:rPr>
-        <w:t xml:space="preserve"> represents that performing duties for </w:t>
-      </w:r>
-      <w:r>
-        <w:rPr>
-          <w:rFonts w:ascii="Arial" w:cs="Arial" w:eastAsia="Arial" w:hAnsi="Arial"/>
-          <w:b/>
-          <w:bCs/>
-          <w:i w:val="false"/>
-          <w:iCs w:val="false"/>
-          <w:color w:val="117086"/>
-          <w:sz w:val="22"/>
-          <w:szCs w:val="22"/>
-        </w:rPr>
-        <w:t xml:space="preserve">Company</w:t>
-      </w:r>
-      <w:r>
-        <w:rPr>
-          <w:rFonts w:ascii="Arial" w:cs="Arial" w:eastAsia="Arial" w:hAnsi="Arial"/>
-          <w:b w:val="false"/>
-          <w:bCs w:val="false"/>
-          <w:i w:val="false"/>
-          <w:iCs w:val="false"/>
-          <w:color w:val="1D2021"/>
-          <w:sz w:val="22"/>
-          <w:szCs w:val="22"/>
-        </w:rPr>
-        <w:t xml:space="preserve"> does not knowingly conflict with binding obligations to another person or entity. </w:t>
-      </w:r>
-      <w:r>
-        <w:rPr>
-          <w:rFonts w:ascii="Arial" w:cs="Arial" w:eastAsia="Arial" w:hAnsi="Arial"/>
-          <w:b/>
-          <w:bCs/>
-          <w:i w:val="false"/>
-          <w:iCs w:val="false"/>
-          <w:color w:val="117086"/>
-          <w:sz w:val="22"/>
-          <w:szCs w:val="22"/>
-        </w:rPr>
-        <w:t xml:space="preserve">Employee</w:t>
-      </w:r>
-      <w:r>
-        <w:rPr>
-          <w:rFonts w:ascii="Arial" w:cs="Arial" w:eastAsia="Arial" w:hAnsi="Arial"/>
-          <w:b w:val="false"/>
-          <w:bCs w:val="false"/>
-          <w:i w:val="false"/>
-          <w:iCs w:val="false"/>
-          <w:color w:val="1D2021"/>
-          <w:sz w:val="22"/>
-          <w:szCs w:val="22"/>
-        </w:rPr>
-        <w:t xml:space="preserve"> will not bring third-party confidential information into </w:t>
-      </w:r>
-      <w:r>
-        <w:rPr>
-          <w:rFonts w:ascii="Arial" w:cs="Arial" w:eastAsia="Arial" w:hAnsi="Arial"/>
-          <w:b/>
-          <w:bCs/>
-          <w:i w:val="false"/>
-          <w:iCs w:val="false"/>
-          <w:color w:val="117086"/>
-          <w:sz w:val="22"/>
-          <w:szCs w:val="22"/>
-        </w:rPr>
-        <w:t xml:space="preserve">Company</w:t>
-      </w:r>
-      <w:r>
-        <w:rPr>
-          <w:rFonts w:ascii="Arial" w:cs="Arial" w:eastAsia="Arial" w:hAnsi="Arial"/>
-          <w:b w:val="false"/>
-          <w:bCs w:val="false"/>
-          <w:i w:val="false"/>
-          <w:iCs w:val="false"/>
-          <w:color w:val="1D2021"/>
-          <w:sz w:val="22"/>
-          <w:szCs w:val="22"/>
-        </w:rPr>
-        <w:t xml:space="preserve"> systems or use it in </w:t>
-      </w:r>
-      <w:r>
-        <w:rPr>
-          <w:rFonts w:ascii="Arial" w:cs="Arial" w:eastAsia="Arial" w:hAnsi="Arial"/>
-          <w:b/>
-          <w:bCs/>
-          <w:i w:val="false"/>
-          <w:iCs w:val="false"/>
-          <w:color w:val="117086"/>
-          <w:sz w:val="22"/>
-          <w:szCs w:val="22"/>
-        </w:rPr>
-        <w:t xml:space="preserve">Company</w:t>
-      </w:r>
-      <w:r>
-        <w:rPr>
-          <w:rFonts w:ascii="Arial" w:cs="Arial" w:eastAsia="Arial" w:hAnsi="Arial"/>
-          <w:b w:val="false"/>
-          <w:bCs w:val="false"/>
-          <w:i w:val="false"/>
-          <w:iCs w:val="false"/>
-          <w:color w:val="1D2021"/>
-          <w:sz w:val="22"/>
-          <w:szCs w:val="22"/>
-        </w:rPr>
-        <w:t xml:space="preserve"> work without written authorization.</w:t>
-      </w:r>
-    </w:p>
-    <w:p>
-      <w:pPr>
-        <w:pStyle w:val="OAClauseHeading"/>
-        <w:spacing w:after="120" w:before="320" w:line="340" w:beforeAutospacing="false" w:afterAutospacing="false"/>
-        <w:contextualSpacing w:val="false"/>
-      </w:pPr>
-      <w:r>
-        <w:rPr>
-          <w:rFonts w:ascii="Arial" w:cs="Arial" w:eastAsia="Arial" w:hAnsi="Arial"/>
-          <w:b/>
-          <w:bCs/>
-          <w:color w:val="1D2021"/>
-          <w:sz w:val="22"/>
-          <w:szCs w:val="22"/>
-        </w:rPr>
-        <w:t xml:space="preserve">7. Records, Cooperation, and Post-Termination Assistance.</w:t>
-      </w:r>
-    </w:p>
-    <w:p>
-      <w:pPr>
-        <w:pStyle w:val="OAClauseBody"/>
-        <w:spacing w:after="280" w:before="0" w:line="340" w:beforeAutospacing="false" w:afterAutospacing="false"/>
-        <w:contextualSpacing w:val="false"/>
-      </w:pPr>
-      <w:r>
-        <w:rPr>
-          <w:rFonts w:ascii="Arial" w:cs="Arial" w:eastAsia="Arial" w:hAnsi="Arial"/>
-          <w:b/>
-          <w:bCs/>
-          <w:i w:val="false"/>
-          <w:iCs w:val="false"/>
-          <w:color w:val="117086"/>
-          <w:sz w:val="22"/>
-          <w:szCs w:val="22"/>
-        </w:rPr>
-        <w:t xml:space="preserve">Employee</w:t>
-      </w:r>
-      <w:r>
-        <w:rPr>
-          <w:rFonts w:ascii="Arial" w:cs="Arial" w:eastAsia="Arial" w:hAnsi="Arial"/>
-          <w:b w:val="false"/>
-          <w:bCs w:val="false"/>
-          <w:i w:val="false"/>
-          <w:iCs w:val="false"/>
-          <w:color w:val="1D2021"/>
-          <w:sz w:val="22"/>
-          <w:szCs w:val="22"/>
-        </w:rPr>
-        <w:t xml:space="preserve"> will provide the post-termination assistance listed in </w:t>
-      </w:r>
-      <w:r>
-        <w:rPr>
-          <w:rFonts w:ascii="Arial" w:cs="Arial" w:eastAsia="Arial" w:hAnsi="Arial"/>
-          <w:b/>
-          <w:bCs/>
-          <w:i w:val="false"/>
-          <w:iCs w:val="false"/>
-          <w:color w:val="117086"/>
-          <w:sz w:val="22"/>
-          <w:szCs w:val="22"/>
-        </w:rPr>
-        <w:t xml:space="preserve">Cover Terms</w:t>
-      </w:r>
-      <w:r>
-        <w:rPr>
-          <w:rFonts w:ascii="Arial" w:cs="Arial" w:eastAsia="Arial" w:hAnsi="Arial"/>
-          <w:b w:val="false"/>
-          <w:bCs w:val="false"/>
-          <w:i w:val="false"/>
-          <w:iCs w:val="false"/>
-          <w:color w:val="1D2021"/>
-          <w:sz w:val="22"/>
-          <w:szCs w:val="22"/>
-        </w:rPr>
-        <w:t xml:space="preserve">, including reasonable cooperation with filings, declarations, and assignments needed to confirm or protect </w:t>
-      </w:r>
-      <w:r>
-        <w:rPr>
-          <w:rFonts w:ascii="Arial" w:cs="Arial" w:eastAsia="Arial" w:hAnsi="Arial"/>
-          <w:b/>
-          <w:bCs/>
-          <w:i w:val="false"/>
-          <w:iCs w:val="false"/>
-          <w:color w:val="117086"/>
-          <w:sz w:val="22"/>
-          <w:szCs w:val="22"/>
-        </w:rPr>
-        <w:t xml:space="preserve">Company</w:t>
-      </w:r>
-      <w:r>
-        <w:rPr>
-          <w:rFonts w:ascii="Arial" w:cs="Arial" w:eastAsia="Arial" w:hAnsi="Arial"/>
-          <w:b w:val="false"/>
-          <w:bCs w:val="false"/>
-          <w:i w:val="false"/>
-          <w:iCs w:val="false"/>
-          <w:color w:val="1D2021"/>
-          <w:sz w:val="22"/>
-          <w:szCs w:val="22"/>
-        </w:rPr>
-        <w:t xml:space="preserve"> rights in covered inventions, subject to reimbursement of reasonable out-of-pocket expenses when required by policy.</w:t>
-      </w:r>
-    </w:p>
-    <w:p>
-      <w:pPr>
-        <w:pStyle w:val="OAClauseHeading"/>
-        <w:spacing w:after="120" w:before="320" w:line="340" w:beforeAutospacing="false" w:afterAutospacing="false"/>
-        <w:contextualSpacing w:val="false"/>
-      </w:pPr>
-      <w:r>
-        <w:rPr>
-          <w:rFonts w:ascii="Arial" w:cs="Arial" w:eastAsia="Arial" w:hAnsi="Arial"/>
-          <w:b/>
-          <w:bCs/>
-          <w:color w:val="1D2021"/>
-          <w:sz w:val="22"/>
-          <w:szCs w:val="22"/>
-        </w:rPr>
-        <w:t xml:space="preserve">8. Return and Deletion of Materials.</w:t>
-      </w:r>
-    </w:p>
-    <w:p>
-      <w:pPr>
-        <w:pStyle w:val="OAClauseBody"/>
-        <w:spacing w:after="280" w:before="0" w:line="340" w:beforeAutospacing="false" w:afterAutospacing="false"/>
-        <w:contextualSpacing w:val="false"/>
-      </w:pPr>
-      <w:r>
-        <w:rPr>
-          <w:rFonts w:ascii="Arial" w:cs="Arial" w:eastAsia="Arial" w:hAnsi="Arial"/>
-          <w:b/>
-          <w:bCs/>
-          <w:i w:val="false"/>
-          <w:iCs w:val="false"/>
-          <w:color w:val="117086"/>
-          <w:sz w:val="22"/>
-          <w:szCs w:val="22"/>
-        </w:rPr>
-        <w:t xml:space="preserve">Employee</w:t>
-      </w:r>
-      <w:r>
-        <w:rPr>
-          <w:rFonts w:ascii="Arial" w:cs="Arial" w:eastAsia="Arial" w:hAnsi="Arial"/>
-          <w:b w:val="false"/>
-          <w:bCs w:val="false"/>
-          <w:i w:val="false"/>
-          <w:iCs w:val="false"/>
-          <w:color w:val="1D2021"/>
-          <w:sz w:val="22"/>
-          <w:szCs w:val="22"/>
-        </w:rPr>
-        <w:t xml:space="preserve"> will return, and where permitted delete, </w:t>
-      </w:r>
-      <w:r>
-        <w:rPr>
-          <w:rFonts w:ascii="Arial" w:cs="Arial" w:eastAsia="Arial" w:hAnsi="Arial"/>
-          <w:b/>
-          <w:bCs/>
-          <w:i w:val="false"/>
-          <w:iCs w:val="false"/>
-          <w:color w:val="117086"/>
-          <w:sz w:val="22"/>
-          <w:szCs w:val="22"/>
-        </w:rPr>
-        <w:t xml:space="preserve">Company</w:t>
-      </w:r>
-      <w:r>
-        <w:rPr>
-          <w:rFonts w:ascii="Arial" w:cs="Arial" w:eastAsia="Arial" w:hAnsi="Arial"/>
-          <w:b w:val="false"/>
-          <w:bCs w:val="false"/>
-          <w:i w:val="false"/>
-          <w:iCs w:val="false"/>
-          <w:color w:val="1D2021"/>
-          <w:sz w:val="22"/>
-          <w:szCs w:val="22"/>
-        </w:rPr>
-        <w:t xml:space="preserve"> materials within the timing listed in </w:t>
-      </w:r>
-      <w:r>
-        <w:rPr>
-          <w:rFonts w:ascii="Arial" w:cs="Arial" w:eastAsia="Arial" w:hAnsi="Arial"/>
-          <w:b/>
-          <w:bCs/>
-          <w:i w:val="false"/>
-          <w:iCs w:val="false"/>
-          <w:color w:val="117086"/>
-          <w:sz w:val="22"/>
-          <w:szCs w:val="22"/>
-        </w:rPr>
-        <w:t xml:space="preserve">Cover Terms</w:t>
-      </w:r>
-      <w:r>
-        <w:rPr>
-          <w:rFonts w:ascii="Arial" w:cs="Arial" w:eastAsia="Arial" w:hAnsi="Arial"/>
-          <w:b w:val="false"/>
-          <w:bCs w:val="false"/>
-          <w:i w:val="false"/>
-          <w:iCs w:val="false"/>
-          <w:color w:val="1D2021"/>
-          <w:sz w:val="22"/>
-          <w:szCs w:val="22"/>
-        </w:rPr>
-        <w:t xml:space="preserve">, including devices, documents, credentials, and confidential files, except for records </w:t>
-      </w:r>
-      <w:r>
-        <w:rPr>
-          <w:rFonts w:ascii="Arial" w:cs="Arial" w:eastAsia="Arial" w:hAnsi="Arial"/>
-          <w:b/>
-          <w:bCs/>
-          <w:i w:val="false"/>
-          <w:iCs w:val="false"/>
-          <w:color w:val="117086"/>
-          <w:sz w:val="22"/>
-          <w:szCs w:val="22"/>
-        </w:rPr>
-        <w:t xml:space="preserve">Employee</w:t>
-      </w:r>
-      <w:r>
-        <w:rPr>
-          <w:rFonts w:ascii="Arial" w:cs="Arial" w:eastAsia="Arial" w:hAnsi="Arial"/>
-          <w:b w:val="false"/>
-          <w:bCs w:val="false"/>
-          <w:i w:val="false"/>
-          <w:iCs w:val="false"/>
-          <w:color w:val="1D2021"/>
-          <w:sz w:val="22"/>
-          <w:szCs w:val="22"/>
-        </w:rPr>
-        <w:t xml:space="preserve"> is required to retain by law.</w:t>
-      </w:r>
-    </w:p>
-    <w:p>
-      <w:pPr>
-        <w:pStyle w:val="OAClauseHeading"/>
-        <w:spacing w:after="120" w:before="320" w:line="340" w:beforeAutospacing="false" w:afterAutospacing="false"/>
-        <w:contextualSpacing w:val="false"/>
-      </w:pPr>
-      <w:r>
-        <w:rPr>
-          <w:rFonts w:ascii="Arial" w:cs="Arial" w:eastAsia="Arial" w:hAnsi="Arial"/>
-          <w:b/>
-          <w:bCs/>
-          <w:color w:val="1D2021"/>
-          <w:sz w:val="22"/>
-          <w:szCs w:val="22"/>
-        </w:rPr>
-        <w:t xml:space="preserve">9. Survival and Limited Scope.</w:t>
-      </w:r>
-    </w:p>
-    <w:p>
-      <w:pPr>
-        <w:pStyle w:val="OAClauseBody"/>
-        <w:spacing w:after="280" w:before="0" w:line="340" w:beforeAutospacing="false" w:afterAutospacing="false"/>
-        <w:contextualSpacing w:val="false"/>
-      </w:pPr>
-      <w:r>
-        <w:rPr>
-          <w:rFonts w:ascii="Arial" w:cs="Arial" w:eastAsia="Arial" w:hAnsi="Arial"/>
-          <w:b w:val="false"/>
-          <w:bCs w:val="false"/>
-          <w:i w:val="false"/>
-          <w:iCs w:val="false"/>
-          <w:color w:val="1D2021"/>
-          <w:sz w:val="22"/>
-          <w:szCs w:val="22"/>
-        </w:rPr>
-        <w:t xml:space="preserve">Sections addressing assignment, confidentiality, return of materials, and assistance survive termination to the extent needed to enforce rights that arose during employment. This agreement does not transfer ownership of inventions that applicable law requires to remain with </w:t>
-      </w:r>
-      <w:r>
-        <w:rPr>
-          <w:rFonts w:ascii="Arial" w:cs="Arial" w:eastAsia="Arial" w:hAnsi="Arial"/>
-          <w:b/>
-          <w:bCs/>
-          <w:i w:val="false"/>
-          <w:iCs w:val="false"/>
-          <w:color w:val="117086"/>
-          <w:sz w:val="22"/>
-          <w:szCs w:val="22"/>
-        </w:rPr>
-        <w:t xml:space="preserve">Employee</w:t>
-      </w:r>
-      <w:r>
-        <w:rPr>
-          <w:rFonts w:ascii="Arial" w:cs="Arial" w:eastAsia="Arial" w:hAnsi="Arial"/>
-          <w:b w:val="false"/>
-          <w:bCs w:val="false"/>
-          <w:i w:val="false"/>
-          <w:iCs w:val="false"/>
-          <w:color w:val="1D2021"/>
-          <w:sz w:val="22"/>
-          <w:szCs w:val="22"/>
-        </w:rPr>
-        <w:t xml:space="preserve">.</w:t>
-      </w:r>
-    </w:p>
-    <w:p>
-      <w:pPr>
-        <w:pStyle w:val="OAClauseHeading"/>
-        <w:spacing w:after="120" w:before="320" w:line="340" w:beforeAutospacing="false" w:afterAutospacing="false"/>
-        <w:contextualSpacing w:val="false"/>
-      </w:pPr>
-      <w:r>
-        <w:rPr>
-          <w:rFonts w:ascii="Arial" w:cs="Arial" w:eastAsia="Arial" w:hAnsi="Arial"/>
-          <w:b/>
-          <w:bCs/>
-          <w:color w:val="1D2021"/>
-          <w:sz w:val="22"/>
-          <w:szCs w:val="22"/>
-        </w:rPr>
-        <w:t xml:space="preserve">10. Governing Law and Venue.</w:t>
-      </w:r>
-    </w:p>
-    <w:p>
-      <w:pPr>
-        <w:pStyle w:val="OAClauseBody"/>
-        <w:spacing w:after="280" w:before="0" w:line="340" w:beforeAutospacing="false" w:afterAutospacing="false"/>
-        <w:contextualSpacing w:val="false"/>
-      </w:pPr>
-      <w:r>
-        <w:rPr>
-          <w:rFonts w:ascii="Arial" w:cs="Arial" w:eastAsia="Arial" w:hAnsi="Arial"/>
-          <w:b w:val="false"/>
-          <w:bCs w:val="false"/>
-          <w:i w:val="false"/>
-          <w:iCs w:val="false"/>
-          <w:color w:val="1D2021"/>
-          <w:sz w:val="22"/>
-          <w:szCs w:val="22"/>
-        </w:rPr>
-        <w:t xml:space="preserve">This agreement is governed by the law listed in </w:t>
-      </w:r>
-      <w:r>
-        <w:rPr>
-          <w:rFonts w:ascii="Arial" w:cs="Arial" w:eastAsia="Arial" w:hAnsi="Arial"/>
-          <w:b/>
-          <w:bCs/>
-          <w:i w:val="false"/>
-          <w:iCs w:val="false"/>
-          <w:color w:val="117086"/>
-          <w:sz w:val="22"/>
-          <w:szCs w:val="22"/>
-        </w:rPr>
-        <w:t xml:space="preserve">Cover Terms</w:t>
-      </w:r>
-      <w:r>
-        <w:rPr>
-          <w:rFonts w:ascii="Arial" w:cs="Arial" w:eastAsia="Arial" w:hAnsi="Arial"/>
-          <w:b w:val="false"/>
-          <w:bCs w:val="false"/>
-          <w:i w:val="false"/>
-          <w:iCs w:val="false"/>
-          <w:color w:val="1D2021"/>
-          <w:sz w:val="22"/>
-          <w:szCs w:val="22"/>
-        </w:rPr>
-        <w:t xml:space="preserve">, and disputes will be resolved in the venue listed in </w:t>
-      </w:r>
-      <w:r>
-        <w:rPr>
-          <w:rFonts w:ascii="Arial" w:cs="Arial" w:eastAsia="Arial" w:hAnsi="Arial"/>
-          <w:b/>
-          <w:bCs/>
-          <w:i w:val="false"/>
-          <w:iCs w:val="false"/>
-          <w:color w:val="117086"/>
-          <w:sz w:val="22"/>
-          <w:szCs w:val="22"/>
-        </w:rPr>
-        <w:t xml:space="preserve">Cover Terms</w:t>
-      </w:r>
-      <w:r>
-        <w:rPr>
-          <w:rFonts w:ascii="Arial" w:cs="Arial" w:eastAsia="Arial" w:hAnsi="Arial"/>
-          <w:b w:val="false"/>
-          <w:bCs w:val="false"/>
-          <w:i w:val="false"/>
-          <w:iCs w:val="false"/>
-          <w:color w:val="1D2021"/>
-          <w:sz w:val="22"/>
-          <w:szCs w:val="22"/>
-        </w:rPr>
-        <w:t xml:space="preserve">, subject to non-waivable rights under applicable law.</w:t>
+        <w:t xml:space="preserve">This agreement is governed by the law listed in Cover Terms, and disputes will be resolved in the venue listed in Cover Terms, subject to non-waivable rights under applicable law.</w:t>
       </w:r>
     </w:p>
     <w:p>

</xml_diff>

<commit_message>
Strengthen Confidential Information and Prior/Excluded anchors
Resolves Codex round-3 WEAK findings on the legal-text edits:

- Confidential Information now has a substantive body definition with
  standard exclusions (publicly known, independently developed, etc.),
  inspired by Common Paper / Bonterms NDA practice but adapted for the
  employment context. The Cover Terms slot now supplements the body
  definition with company-specific categories rather than acting as the
  sole substantive source. If a deployment leaves the cover-terms slot
  blank, the body definition still provides full default protection.

- Prior and Excluded Inventions clause adds an explicit "identified in
  Cover Terms" anchor: "The Prior Inventions and Excluded Inventions
  identified in Cover Terms remain carved out..." This preserves the
  brevity of the prior wording while resolving Codex's
  pseudo-defined-term concern.
</commit_message>
<xml_diff>
--- a/content/templates/openagreements-employee-ip-inventions-assignment/template.docx
+++ b/content/templates/openagreements-employee-ip-inventions-assignment/template.docx
@@ -924,7 +924,7 @@
           <w:sz w:val="22"/>
           <w:szCs w:val="22"/>
         </w:rPr>
-        <w:t xml:space="preserve"> has the meaning given in Cover Terms under Confidential Information Definition.</w:t>
+        <w:t xml:space="preserve"> means non-public information that Employee learns, accesses, or develops during employment, including business strategies, customer and prospect data, trade secrets, technical and product information, financial information, personnel information, and any additional information described in Cover Terms under Confidential Information Definition. Confidential Information does not include information that (a) was publicly known when Employee learned it, (b) becomes publicly known through no fault of Employee, (c) was lawfully known to Employee before employment without confidentiality restriction, or (d) Employee independently develops outside the scope of employment without using Confidential Information.</w:t>
       </w:r>
     </w:p>
     <w:p>
@@ -1112,7 +1112,7 @@
           <w:sz w:val="22"/>
           <w:szCs w:val="22"/>
         </w:rPr>
-        <w:t xml:space="preserve">Prior Inventions and Excluded Inventions remain carved out only to the extent permitted by applicable law. Employee represents that the Prior Inventions disclosure in Cover Terms is complete to Employee knowledge as of the Effective Date.</w:t>
+        <w:t xml:space="preserve">The Prior Inventions and Excluded Inventions identified in Cover Terms remain carved out only to the extent permitted by applicable law. Employee represents that the Prior Inventions disclosure in Cover Terms is complete to Employee knowledge as of the Effective Date.</w:t>
       </w:r>
     </w:p>
     <w:p>

</xml_diff>

<commit_message>
feat(renderer): finish employment signer arrangement cleanup
</commit_message>
<xml_diff>
--- a/content/templates/openagreements-employee-ip-inventions-assignment/template.docx
+++ b/content/templates/openagreements-employee-ip-inventions-assignment/template.docx
@@ -1507,7 +1507,7 @@
     </w:p>
     <w:tbl>
       <w:tblPr>
-        <w:tblW w:type="dxa" w:w="10075"/>
+        <w:tblW w:type="dxa" w:w="10070"/>
         <w:tblBorders>
           <w:top w:val="nil" w:color="FFFFFF" w:sz="0"/>
           <w:left w:val="nil" w:color="FFFFFF" w:sz="0"/>
@@ -1520,9 +1520,7 @@
       </w:tblPr>
       <w:tblGrid>
         <w:gridCol w:w="2605"/>
-        <w:gridCol w:w="3600"/>
-        <w:gridCol w:w="250"/>
-        <w:gridCol w:w="3620"/>
+        <w:gridCol w:w="7465"/>
       </w:tblGrid>
       <w:tr>
         <w:tc>
@@ -1592,6 +1590,11 @@
             </w:r>
           </w:p>
         </w:tc>
+      </w:tr>
+      <w:tr>
+        <w:trPr>
+          <w:trHeight w:val="690" w:hRule="atLeast"/>
+        </w:trPr>
         <w:tc>
           <w:tcPr>
             <w:tcBorders>
@@ -1602,14 +1605,324 @@
             </w:tcBorders>
             <w:tcMar>
               <w:top w:type="dxa" w:w="216"/>
-              <w:left w:type="dxa" w:w="0"/>
+              <w:left w:type="dxa" w:w="115"/>
               <w:bottom w:type="dxa" w:w="216"/>
-              <w:right w:type="dxa" w:w="0"/>
-            </w:tcMar>
-            <w:vAlign w:val="center"/>
-          </w:tcPr>
-          <w:p>
-            <w:r>
+              <w:right w:type="dxa" w:w="115"/>
+            </w:tcMar>
+            <w:vAlign w:val="center"/>
+          </w:tcPr>
+          <w:p>
+            <w:pPr>
+              <w:spacing w:after="0" w:line="340"/>
+            </w:pPr>
+            <w:r>
+              <w:rPr>
+                <w:rFonts w:ascii="Arial" w:cs="Arial" w:eastAsia="Arial" w:hAnsi="Arial"/>
+                <w:b/>
+                <w:bCs/>
+                <w:color w:val="1D2021"/>
+                <w:sz w:val="18"/>
+                <w:szCs w:val="18"/>
+              </w:rPr>
+              <w:t xml:space="preserve">Signature</w:t>
+            </w:r>
+          </w:p>
+        </w:tc>
+        <w:tc>
+          <w:tcPr>
+            <w:tcBorders>
+              <w:top w:val="single" w:color="C7C7C7" w:sz="4"/>
+              <w:left w:val="nil" w:color="FFFFFF" w:sz="0"/>
+              <w:bottom w:val="single" w:color="C7C7C7" w:sz="4"/>
+              <w:right w:val="nil" w:color="FFFFFF" w:sz="0"/>
+            </w:tcBorders>
+            <w:tcMar>
+              <w:top w:type="dxa" w:w="216"/>
+              <w:left w:type="dxa" w:w="115"/>
+              <w:bottom w:type="dxa" w:w="216"/>
+              <w:right w:type="dxa" w:w="115"/>
+            </w:tcMar>
+            <w:vAlign w:val="center"/>
+          </w:tcPr>
+          <w:p>
+            <w:pPr>
+              <w:spacing w:after="0" w:line="340"/>
+            </w:pPr>
+            <w:r>
+              <w:rPr>
+                <w:rFonts w:ascii="Arial" w:cs="Arial" w:eastAsia="Arial" w:hAnsi="Arial"/>
+                <w:color w:val="1D2021"/>
+                <w:sz w:val="18"/>
+                <w:szCs w:val="18"/>
+              </w:rPr>
+              <w:t xml:space="preserve"/>
+            </w:r>
+          </w:p>
+        </w:tc>
+      </w:tr>
+      <w:tr>
+        <w:trPr>
+          <w:trHeight w:val="690" w:hRule="atLeast"/>
+        </w:trPr>
+        <w:tc>
+          <w:tcPr>
+            <w:tcBorders>
+              <w:top w:val="nil" w:color="FFFFFF" w:sz="0"/>
+              <w:left w:val="nil" w:color="FFFFFF" w:sz="0"/>
+              <w:bottom w:val="nil" w:color="FFFFFF" w:sz="0"/>
+              <w:right w:val="nil" w:color="FFFFFF" w:sz="0"/>
+            </w:tcBorders>
+            <w:tcMar>
+              <w:top w:type="dxa" w:w="216"/>
+              <w:left w:type="dxa" w:w="115"/>
+              <w:bottom w:type="dxa" w:w="216"/>
+              <w:right w:type="dxa" w:w="115"/>
+            </w:tcMar>
+            <w:vAlign w:val="center"/>
+          </w:tcPr>
+          <w:p>
+            <w:pPr>
+              <w:spacing w:after="0" w:line="340"/>
+            </w:pPr>
+            <w:r>
+              <w:rPr>
+                <w:rFonts w:ascii="Arial" w:cs="Arial" w:eastAsia="Arial" w:hAnsi="Arial"/>
+                <w:b/>
+                <w:bCs/>
+                <w:color w:val="1D2021"/>
+                <w:sz w:val="18"/>
+                <w:szCs w:val="18"/>
+              </w:rPr>
+              <w:t xml:space="preserve">Print Name</w:t>
+            </w:r>
+          </w:p>
+        </w:tc>
+        <w:tc>
+          <w:tcPr>
+            <w:tcBorders>
+              <w:top w:val="single" w:color="C7C7C7" w:sz="4"/>
+              <w:left w:val="nil" w:color="FFFFFF" w:sz="0"/>
+              <w:bottom w:val="single" w:color="C7C7C7" w:sz="4"/>
+              <w:right w:val="nil" w:color="FFFFFF" w:sz="0"/>
+            </w:tcBorders>
+            <w:tcMar>
+              <w:top w:type="dxa" w:w="216"/>
+              <w:left w:type="dxa" w:w="115"/>
+              <w:bottom w:type="dxa" w:w="216"/>
+              <w:right w:type="dxa" w:w="115"/>
+            </w:tcMar>
+            <w:vAlign w:val="center"/>
+          </w:tcPr>
+          <w:p>
+            <w:pPr>
+              <w:spacing w:after="0" w:line="340"/>
+            </w:pPr>
+            <w:r>
+              <w:rPr>
+                <w:rFonts w:ascii="Arial" w:cs="Arial" w:eastAsia="Arial" w:hAnsi="Arial"/>
+                <w:color w:val="1D2021"/>
+                <w:sz w:val="18"/>
+                <w:szCs w:val="18"/>
+              </w:rPr>
+              <w:t xml:space="preserve">{company_name}</w:t>
+            </w:r>
+          </w:p>
+        </w:tc>
+      </w:tr>
+      <w:tr>
+        <w:trPr>
+          <w:trHeight w:val="690" w:hRule="atLeast"/>
+        </w:trPr>
+        <w:tc>
+          <w:tcPr>
+            <w:tcBorders>
+              <w:top w:val="nil" w:color="FFFFFF" w:sz="0"/>
+              <w:left w:val="nil" w:color="FFFFFF" w:sz="0"/>
+              <w:bottom w:val="nil" w:color="FFFFFF" w:sz="0"/>
+              <w:right w:val="nil" w:color="FFFFFF" w:sz="0"/>
+            </w:tcBorders>
+            <w:tcMar>
+              <w:top w:type="dxa" w:w="216"/>
+              <w:left w:type="dxa" w:w="115"/>
+              <w:bottom w:type="dxa" w:w="216"/>
+              <w:right w:type="dxa" w:w="115"/>
+            </w:tcMar>
+            <w:vAlign w:val="center"/>
+          </w:tcPr>
+          <w:p>
+            <w:pPr>
+              <w:spacing w:after="0" w:line="340"/>
+            </w:pPr>
+            <w:r>
+              <w:rPr>
+                <w:rFonts w:ascii="Arial" w:cs="Arial" w:eastAsia="Arial" w:hAnsi="Arial"/>
+                <w:b/>
+                <w:bCs/>
+                <w:color w:val="1D2021"/>
+                <w:sz w:val="18"/>
+                <w:szCs w:val="18"/>
+              </w:rPr>
+              <w:t xml:space="preserve">Title</w:t>
+            </w:r>
+          </w:p>
+        </w:tc>
+        <w:tc>
+          <w:tcPr>
+            <w:tcBorders>
+              <w:top w:val="single" w:color="C7C7C7" w:sz="4"/>
+              <w:left w:val="nil" w:color="FFFFFF" w:sz="0"/>
+              <w:bottom w:val="single" w:color="C7C7C7" w:sz="4"/>
+              <w:right w:val="nil" w:color="FFFFFF" w:sz="0"/>
+            </w:tcBorders>
+            <w:tcMar>
+              <w:top w:type="dxa" w:w="216"/>
+              <w:left w:type="dxa" w:w="115"/>
+              <w:bottom w:type="dxa" w:w="216"/>
+              <w:right w:type="dxa" w:w="115"/>
+            </w:tcMar>
+            <w:vAlign w:val="center"/>
+          </w:tcPr>
+          <w:p>
+            <w:pPr>
+              <w:spacing w:after="0" w:line="340"/>
+            </w:pPr>
+            <w:r>
+              <w:rPr>
+                <w:rFonts w:ascii="Arial" w:cs="Arial" w:eastAsia="Arial" w:hAnsi="Arial"/>
+                <w:color w:val="1D2021"/>
+                <w:sz w:val="18"/>
+                <w:szCs w:val="18"/>
+              </w:rPr>
+              <w:t xml:space="preserve"/>
+            </w:r>
+          </w:p>
+        </w:tc>
+      </w:tr>
+      <w:tr>
+        <w:trPr>
+          <w:trHeight w:val="690" w:hRule="atLeast"/>
+        </w:trPr>
+        <w:tc>
+          <w:tcPr>
+            <w:tcBorders>
+              <w:top w:val="nil" w:color="FFFFFF" w:sz="0"/>
+              <w:left w:val="nil" w:color="FFFFFF" w:sz="0"/>
+              <w:bottom w:val="nil" w:color="FFFFFF" w:sz="0"/>
+              <w:right w:val="nil" w:color="FFFFFF" w:sz="0"/>
+            </w:tcBorders>
+            <w:tcMar>
+              <w:top w:type="dxa" w:w="216"/>
+              <w:left w:type="dxa" w:w="115"/>
+              <w:bottom w:type="dxa" w:w="216"/>
+              <w:right w:type="dxa" w:w="115"/>
+            </w:tcMar>
+            <w:vAlign w:val="center"/>
+          </w:tcPr>
+          <w:p>
+            <w:pPr>
+              <w:spacing w:after="0" w:line="340"/>
+            </w:pPr>
+            <w:r>
+              <w:rPr>
+                <w:rFonts w:ascii="Arial" w:cs="Arial" w:eastAsia="Arial" w:hAnsi="Arial"/>
+                <w:b/>
+                <w:bCs/>
+                <w:color w:val="1D2021"/>
+                <w:sz w:val="18"/>
+                <w:szCs w:val="18"/>
+              </w:rPr>
+              <w:t xml:space="preserve">Date</w:t>
+            </w:r>
+          </w:p>
+        </w:tc>
+        <w:tc>
+          <w:tcPr>
+            <w:tcBorders>
+              <w:top w:val="single" w:color="C7C7C7" w:sz="4"/>
+              <w:left w:val="nil" w:color="FFFFFF" w:sz="0"/>
+              <w:bottom w:val="single" w:color="C7C7C7" w:sz="4"/>
+              <w:right w:val="nil" w:color="FFFFFF" w:sz="0"/>
+            </w:tcBorders>
+            <w:tcMar>
+              <w:top w:type="dxa" w:w="216"/>
+              <w:left w:type="dxa" w:w="115"/>
+              <w:bottom w:type="dxa" w:w="216"/>
+              <w:right w:type="dxa" w:w="115"/>
+            </w:tcMar>
+            <w:vAlign w:val="center"/>
+          </w:tcPr>
+          <w:p>
+            <w:pPr>
+              <w:spacing w:after="0" w:line="340"/>
+            </w:pPr>
+            <w:r>
+              <w:rPr>
+                <w:rFonts w:ascii="Arial" w:cs="Arial" w:eastAsia="Arial" w:hAnsi="Arial"/>
+                <w:color w:val="1D2021"/>
+                <w:sz w:val="18"/>
+                <w:szCs w:val="18"/>
+              </w:rPr>
+              <w:t xml:space="preserve"/>
+            </w:r>
+          </w:p>
+        </w:tc>
+      </w:tr>
+    </w:tbl>
+    <w:p>
+      <w:pPr>
+        <w:spacing w:after="280" w:before="0" w:line="340"/>
+      </w:pPr>
+      <w:r>
+        <w:t xml:space="preserve"/>
+      </w:r>
+    </w:p>
+    <w:tbl>
+      <w:tblPr>
+        <w:tblW w:type="dxa" w:w="10070"/>
+        <w:tblBorders>
+          <w:top w:val="nil" w:color="FFFFFF" w:sz="0"/>
+          <w:left w:val="nil" w:color="FFFFFF" w:sz="0"/>
+          <w:bottom w:val="nil" w:color="FFFFFF" w:sz="0"/>
+          <w:right w:val="nil" w:color="FFFFFF" w:sz="0"/>
+          <w:insideH w:val="single" w:color="auto" w:sz="4"/>
+          <w:insideV w:val="single" w:color="auto" w:sz="4"/>
+        </w:tblBorders>
+        <w:tblLayout w:type="fixed"/>
+      </w:tblPr>
+      <w:tblGrid>
+        <w:gridCol w:w="2605"/>
+        <w:gridCol w:w="7465"/>
+      </w:tblGrid>
+      <w:tr>
+        <w:tc>
+          <w:tcPr>
+            <w:tcBorders>
+              <w:top w:val="nil" w:color="FFFFFF" w:sz="0"/>
+              <w:left w:val="nil" w:color="FFFFFF" w:sz="0"/>
+              <w:bottom w:val="nil" w:color="FFFFFF" w:sz="0"/>
+              <w:right w:val="nil" w:color="FFFFFF" w:sz="0"/>
+            </w:tcBorders>
+            <w:tcMar>
+              <w:top w:type="dxa" w:w="216"/>
+              <w:left w:type="dxa" w:w="115"/>
+              <w:bottom w:type="dxa" w:w="216"/>
+              <w:right w:type="dxa" w:w="115"/>
+            </w:tcMar>
+            <w:vAlign w:val="center"/>
+          </w:tcPr>
+          <w:p>
+            <w:pPr>
+              <w:spacing w:after="0" w:line="340"/>
+            </w:pPr>
+            <w:r>
+              <w:rPr>
+                <w:rFonts w:ascii="Arial" w:cs="Arial" w:eastAsia="Arial" w:hAnsi="Arial"/>
+                <w:b/>
+                <w:bCs/>
+                <w:color w:val="1D2021"/>
+                <w:sz w:val="18"/>
+                <w:szCs w:val="18"/>
+              </w:rPr>
               <w:t xml:space="preserve"/>
             </w:r>
           </w:p>
@@ -1717,59 +2030,6 @@
             </w:r>
           </w:p>
         </w:tc>
-        <w:tc>
-          <w:tcPr>
-            <w:tcBorders>
-              <w:top w:val="nil" w:color="FFFFFF" w:sz="0"/>
-              <w:left w:val="nil" w:color="FFFFFF" w:sz="0"/>
-              <w:bottom w:val="nil" w:color="FFFFFF" w:sz="0"/>
-              <w:right w:val="nil" w:color="FFFFFF" w:sz="0"/>
-            </w:tcBorders>
-            <w:tcMar>
-              <w:top w:type="dxa" w:w="216"/>
-              <w:left w:type="dxa" w:w="0"/>
-              <w:bottom w:type="dxa" w:w="216"/>
-              <w:right w:type="dxa" w:w="0"/>
-            </w:tcMar>
-            <w:vAlign w:val="center"/>
-          </w:tcPr>
-          <w:p>
-            <w:r>
-              <w:t xml:space="preserve"/>
-            </w:r>
-          </w:p>
-        </w:tc>
-        <w:tc>
-          <w:tcPr>
-            <w:tcBorders>
-              <w:top w:val="single" w:color="C7C7C7" w:sz="4"/>
-              <w:left w:val="nil" w:color="FFFFFF" w:sz="0"/>
-              <w:bottom w:val="single" w:color="C7C7C7" w:sz="4"/>
-              <w:right w:val="nil" w:color="FFFFFF" w:sz="0"/>
-            </w:tcBorders>
-            <w:tcMar>
-              <w:top w:type="dxa" w:w="216"/>
-              <w:left w:type="dxa" w:w="115"/>
-              <w:bottom w:type="dxa" w:w="216"/>
-              <w:right w:type="dxa" w:w="115"/>
-            </w:tcMar>
-            <w:vAlign w:val="center"/>
-          </w:tcPr>
-          <w:p>
-            <w:pPr>
-              <w:spacing w:after="0" w:line="340"/>
-            </w:pPr>
-            <w:r>
-              <w:rPr>
-                <w:rFonts w:ascii="Arial" w:cs="Arial" w:eastAsia="Arial" w:hAnsi="Arial"/>
-                <w:color w:val="1D2021"/>
-                <w:sz w:val="18"/>
-                <w:szCs w:val="18"/>
-              </w:rPr>
-              <w:t xml:space="preserve"/>
-            </w:r>
-          </w:p>
-        </w:tc>
       </w:tr>
       <w:tr>
         <w:trPr>
@@ -1835,59 +2095,6 @@
                 <w:sz w:val="18"/>
                 <w:szCs w:val="18"/>
               </w:rPr>
-              <w:t xml:space="preserve">{company_name}</w:t>
-            </w:r>
-          </w:p>
-        </w:tc>
-        <w:tc>
-          <w:tcPr>
-            <w:tcBorders>
-              <w:top w:val="nil" w:color="FFFFFF" w:sz="0"/>
-              <w:left w:val="nil" w:color="FFFFFF" w:sz="0"/>
-              <w:bottom w:val="nil" w:color="FFFFFF" w:sz="0"/>
-              <w:right w:val="nil" w:color="FFFFFF" w:sz="0"/>
-            </w:tcBorders>
-            <w:tcMar>
-              <w:top w:type="dxa" w:w="216"/>
-              <w:left w:type="dxa" w:w="0"/>
-              <w:bottom w:type="dxa" w:w="216"/>
-              <w:right w:type="dxa" w:w="0"/>
-            </w:tcMar>
-            <w:vAlign w:val="center"/>
-          </w:tcPr>
-          <w:p>
-            <w:r>
-              <w:t xml:space="preserve"/>
-            </w:r>
-          </w:p>
-        </w:tc>
-        <w:tc>
-          <w:tcPr>
-            <w:tcBorders>
-              <w:top w:val="single" w:color="C7C7C7" w:sz="4"/>
-              <w:left w:val="nil" w:color="FFFFFF" w:sz="0"/>
-              <w:bottom w:val="single" w:color="C7C7C7" w:sz="4"/>
-              <w:right w:val="nil" w:color="FFFFFF" w:sz="0"/>
-            </w:tcBorders>
-            <w:tcMar>
-              <w:top w:type="dxa" w:w="216"/>
-              <w:left w:type="dxa" w:w="115"/>
-              <w:bottom w:type="dxa" w:w="216"/>
-              <w:right w:type="dxa" w:w="115"/>
-            </w:tcMar>
-            <w:vAlign w:val="center"/>
-          </w:tcPr>
-          <w:p>
-            <w:pPr>
-              <w:spacing w:after="0" w:line="340"/>
-            </w:pPr>
-            <w:r>
-              <w:rPr>
-                <w:rFonts w:ascii="Arial" w:cs="Arial" w:eastAsia="Arial" w:hAnsi="Arial"/>
-                <w:color w:val="1D2021"/>
-                <w:sz w:val="18"/>
-                <w:szCs w:val="18"/>
-              </w:rPr>
               <w:t xml:space="preserve">{employee_name}</w:t>
             </w:r>
           </w:p>
@@ -1926,182 +2133,7 @@
                 <w:sz w:val="18"/>
                 <w:szCs w:val="18"/>
               </w:rPr>
-              <w:t xml:space="preserve">Title</w:t>
-            </w:r>
-          </w:p>
-        </w:tc>
-        <w:tc>
-          <w:tcPr>
-            <w:tcBorders>
-              <w:top w:val="single" w:color="C7C7C7" w:sz="4"/>
-              <w:left w:val="nil" w:color="FFFFFF" w:sz="0"/>
-              <w:bottom w:val="single" w:color="C7C7C7" w:sz="4"/>
-              <w:right w:val="nil" w:color="FFFFFF" w:sz="0"/>
-            </w:tcBorders>
-            <w:tcMar>
-              <w:top w:type="dxa" w:w="216"/>
-              <w:left w:type="dxa" w:w="115"/>
-              <w:bottom w:type="dxa" w:w="216"/>
-              <w:right w:type="dxa" w:w="115"/>
-            </w:tcMar>
-            <w:vAlign w:val="center"/>
-          </w:tcPr>
-          <w:p>
-            <w:pPr>
-              <w:spacing w:after="0" w:line="340"/>
-            </w:pPr>
-            <w:r>
-              <w:rPr>
-                <w:rFonts w:ascii="Arial" w:cs="Arial" w:eastAsia="Arial" w:hAnsi="Arial"/>
-                <w:color w:val="1D2021"/>
-                <w:sz w:val="18"/>
-                <w:szCs w:val="18"/>
-              </w:rPr>
-              <w:t xml:space="preserve"/>
-            </w:r>
-          </w:p>
-        </w:tc>
-        <w:tc>
-          <w:tcPr>
-            <w:tcBorders>
-              <w:top w:val="nil" w:color="FFFFFF" w:sz="0"/>
-              <w:left w:val="nil" w:color="FFFFFF" w:sz="0"/>
-              <w:bottom w:val="nil" w:color="FFFFFF" w:sz="0"/>
-              <w:right w:val="nil" w:color="FFFFFF" w:sz="0"/>
-            </w:tcBorders>
-            <w:tcMar>
-              <w:top w:type="dxa" w:w="216"/>
-              <w:left w:type="dxa" w:w="0"/>
-              <w:bottom w:type="dxa" w:w="216"/>
-              <w:right w:type="dxa" w:w="0"/>
-            </w:tcMar>
-            <w:vAlign w:val="center"/>
-          </w:tcPr>
-          <w:p>
-            <w:r>
-              <w:t xml:space="preserve"/>
-            </w:r>
-          </w:p>
-        </w:tc>
-        <w:tc>
-          <w:tcPr>
-            <w:tcBorders>
-              <w:top w:val="single" w:color="C7C7C7" w:sz="4"/>
-              <w:left w:val="nil" w:color="FFFFFF" w:sz="0"/>
-              <w:bottom w:val="single" w:color="C7C7C7" w:sz="4"/>
-              <w:right w:val="nil" w:color="FFFFFF" w:sz="0"/>
-            </w:tcBorders>
-            <w:tcMar>
-              <w:top w:type="dxa" w:w="216"/>
-              <w:left w:type="dxa" w:w="115"/>
-              <w:bottom w:type="dxa" w:w="216"/>
-              <w:right w:type="dxa" w:w="115"/>
-            </w:tcMar>
-            <w:vAlign w:val="center"/>
-          </w:tcPr>
-          <w:p>
-            <w:pPr>
-              <w:spacing w:after="0" w:line="340"/>
-            </w:pPr>
-            <w:r>
-              <w:rPr>
-                <w:rFonts w:ascii="Arial" w:cs="Arial" w:eastAsia="Arial" w:hAnsi="Arial"/>
-                <w:color w:val="1D2021"/>
-                <w:sz w:val="18"/>
-                <w:szCs w:val="18"/>
-              </w:rPr>
-              <w:t xml:space="preserve"/>
-            </w:r>
-          </w:p>
-        </w:tc>
-      </w:tr>
-      <w:tr>
-        <w:trPr>
-          <w:trHeight w:val="690" w:hRule="atLeast"/>
-        </w:trPr>
-        <w:tc>
-          <w:tcPr>
-            <w:tcBorders>
-              <w:top w:val="nil" w:color="FFFFFF" w:sz="0"/>
-              <w:left w:val="nil" w:color="FFFFFF" w:sz="0"/>
-              <w:bottom w:val="nil" w:color="FFFFFF" w:sz="0"/>
-              <w:right w:val="nil" w:color="FFFFFF" w:sz="0"/>
-            </w:tcBorders>
-            <w:tcMar>
-              <w:top w:type="dxa" w:w="216"/>
-              <w:left w:type="dxa" w:w="115"/>
-              <w:bottom w:type="dxa" w:w="216"/>
-              <w:right w:type="dxa" w:w="115"/>
-            </w:tcMar>
-            <w:vAlign w:val="center"/>
-          </w:tcPr>
-          <w:p>
-            <w:pPr>
-              <w:spacing w:after="0" w:line="340"/>
-            </w:pPr>
-            <w:r>
-              <w:rPr>
-                <w:rFonts w:ascii="Arial" w:cs="Arial" w:eastAsia="Arial" w:hAnsi="Arial"/>
-                <w:b/>
-                <w:bCs/>
-                <w:color w:val="1D2021"/>
-                <w:sz w:val="18"/>
-                <w:szCs w:val="18"/>
-              </w:rPr>
               <w:t xml:space="preserve">Date</w:t>
-            </w:r>
-          </w:p>
-        </w:tc>
-        <w:tc>
-          <w:tcPr>
-            <w:tcBorders>
-              <w:top w:val="single" w:color="C7C7C7" w:sz="4"/>
-              <w:left w:val="nil" w:color="FFFFFF" w:sz="0"/>
-              <w:bottom w:val="single" w:color="C7C7C7" w:sz="4"/>
-              <w:right w:val="nil" w:color="FFFFFF" w:sz="0"/>
-            </w:tcBorders>
-            <w:tcMar>
-              <w:top w:type="dxa" w:w="216"/>
-              <w:left w:type="dxa" w:w="115"/>
-              <w:bottom w:type="dxa" w:w="216"/>
-              <w:right w:type="dxa" w:w="115"/>
-            </w:tcMar>
-            <w:vAlign w:val="center"/>
-          </w:tcPr>
-          <w:p>
-            <w:pPr>
-              <w:spacing w:after="0" w:line="340"/>
-            </w:pPr>
-            <w:r>
-              <w:rPr>
-                <w:rFonts w:ascii="Arial" w:cs="Arial" w:eastAsia="Arial" w:hAnsi="Arial"/>
-                <w:color w:val="1D2021"/>
-                <w:sz w:val="18"/>
-                <w:szCs w:val="18"/>
-              </w:rPr>
-              <w:t xml:space="preserve"/>
-            </w:r>
-          </w:p>
-        </w:tc>
-        <w:tc>
-          <w:tcPr>
-            <w:tcBorders>
-              <w:top w:val="nil" w:color="FFFFFF" w:sz="0"/>
-              <w:left w:val="nil" w:color="FFFFFF" w:sz="0"/>
-              <w:bottom w:val="nil" w:color="FFFFFF" w:sz="0"/>
-              <w:right w:val="nil" w:color="FFFFFF" w:sz="0"/>
-            </w:tcBorders>
-            <w:tcMar>
-              <w:top w:type="dxa" w:w="216"/>
-              <w:left w:type="dxa" w:w="0"/>
-              <w:bottom w:type="dxa" w:w="216"/>
-              <w:right w:type="dxa" w:w="0"/>
-            </w:tcMar>
-            <w:vAlign w:val="center"/>
-          </w:tcPr>
-          <w:p>
-            <w:r>
-              <w:t xml:space="preserve"/>
             </w:r>
           </w:p>
         </w:tc>

</xml_diff>

<commit_message>
feat(renderer): finish employment signer arrangement cleanup (#246)
* feat(renderer): finish employment signer arrangement cleanup

* chore(readme): regenerate template source links
</commit_message>
<xml_diff>
--- a/content/templates/openagreements-employee-ip-inventions-assignment/template.docx
+++ b/content/templates/openagreements-employee-ip-inventions-assignment/template.docx
@@ -1507,7 +1507,7 @@
     </w:p>
     <w:tbl>
       <w:tblPr>
-        <w:tblW w:type="dxa" w:w="10075"/>
+        <w:tblW w:type="dxa" w:w="10070"/>
         <w:tblBorders>
           <w:top w:val="nil" w:color="FFFFFF" w:sz="0"/>
           <w:left w:val="nil" w:color="FFFFFF" w:sz="0"/>
@@ -1520,9 +1520,7 @@
       </w:tblPr>
       <w:tblGrid>
         <w:gridCol w:w="2605"/>
-        <w:gridCol w:w="3600"/>
-        <w:gridCol w:w="250"/>
-        <w:gridCol w:w="3620"/>
+        <w:gridCol w:w="7465"/>
       </w:tblGrid>
       <w:tr>
         <w:tc>
@@ -1592,6 +1590,11 @@
             </w:r>
           </w:p>
         </w:tc>
+      </w:tr>
+      <w:tr>
+        <w:trPr>
+          <w:trHeight w:val="690" w:hRule="atLeast"/>
+        </w:trPr>
         <w:tc>
           <w:tcPr>
             <w:tcBorders>
@@ -1602,14 +1605,324 @@
             </w:tcBorders>
             <w:tcMar>
               <w:top w:type="dxa" w:w="216"/>
-              <w:left w:type="dxa" w:w="0"/>
+              <w:left w:type="dxa" w:w="115"/>
               <w:bottom w:type="dxa" w:w="216"/>
-              <w:right w:type="dxa" w:w="0"/>
-            </w:tcMar>
-            <w:vAlign w:val="center"/>
-          </w:tcPr>
-          <w:p>
-            <w:r>
+              <w:right w:type="dxa" w:w="115"/>
+            </w:tcMar>
+            <w:vAlign w:val="center"/>
+          </w:tcPr>
+          <w:p>
+            <w:pPr>
+              <w:spacing w:after="0" w:line="340"/>
+            </w:pPr>
+            <w:r>
+              <w:rPr>
+                <w:rFonts w:ascii="Arial" w:cs="Arial" w:eastAsia="Arial" w:hAnsi="Arial"/>
+                <w:b/>
+                <w:bCs/>
+                <w:color w:val="1D2021"/>
+                <w:sz w:val="18"/>
+                <w:szCs w:val="18"/>
+              </w:rPr>
+              <w:t xml:space="preserve">Signature</w:t>
+            </w:r>
+          </w:p>
+        </w:tc>
+        <w:tc>
+          <w:tcPr>
+            <w:tcBorders>
+              <w:top w:val="single" w:color="C7C7C7" w:sz="4"/>
+              <w:left w:val="nil" w:color="FFFFFF" w:sz="0"/>
+              <w:bottom w:val="single" w:color="C7C7C7" w:sz="4"/>
+              <w:right w:val="nil" w:color="FFFFFF" w:sz="0"/>
+            </w:tcBorders>
+            <w:tcMar>
+              <w:top w:type="dxa" w:w="216"/>
+              <w:left w:type="dxa" w:w="115"/>
+              <w:bottom w:type="dxa" w:w="216"/>
+              <w:right w:type="dxa" w:w="115"/>
+            </w:tcMar>
+            <w:vAlign w:val="center"/>
+          </w:tcPr>
+          <w:p>
+            <w:pPr>
+              <w:spacing w:after="0" w:line="340"/>
+            </w:pPr>
+            <w:r>
+              <w:rPr>
+                <w:rFonts w:ascii="Arial" w:cs="Arial" w:eastAsia="Arial" w:hAnsi="Arial"/>
+                <w:color w:val="1D2021"/>
+                <w:sz w:val="18"/>
+                <w:szCs w:val="18"/>
+              </w:rPr>
+              <w:t xml:space="preserve"/>
+            </w:r>
+          </w:p>
+        </w:tc>
+      </w:tr>
+      <w:tr>
+        <w:trPr>
+          <w:trHeight w:val="690" w:hRule="atLeast"/>
+        </w:trPr>
+        <w:tc>
+          <w:tcPr>
+            <w:tcBorders>
+              <w:top w:val="nil" w:color="FFFFFF" w:sz="0"/>
+              <w:left w:val="nil" w:color="FFFFFF" w:sz="0"/>
+              <w:bottom w:val="nil" w:color="FFFFFF" w:sz="0"/>
+              <w:right w:val="nil" w:color="FFFFFF" w:sz="0"/>
+            </w:tcBorders>
+            <w:tcMar>
+              <w:top w:type="dxa" w:w="216"/>
+              <w:left w:type="dxa" w:w="115"/>
+              <w:bottom w:type="dxa" w:w="216"/>
+              <w:right w:type="dxa" w:w="115"/>
+            </w:tcMar>
+            <w:vAlign w:val="center"/>
+          </w:tcPr>
+          <w:p>
+            <w:pPr>
+              <w:spacing w:after="0" w:line="340"/>
+            </w:pPr>
+            <w:r>
+              <w:rPr>
+                <w:rFonts w:ascii="Arial" w:cs="Arial" w:eastAsia="Arial" w:hAnsi="Arial"/>
+                <w:b/>
+                <w:bCs/>
+                <w:color w:val="1D2021"/>
+                <w:sz w:val="18"/>
+                <w:szCs w:val="18"/>
+              </w:rPr>
+              <w:t xml:space="preserve">Print Name</w:t>
+            </w:r>
+          </w:p>
+        </w:tc>
+        <w:tc>
+          <w:tcPr>
+            <w:tcBorders>
+              <w:top w:val="single" w:color="C7C7C7" w:sz="4"/>
+              <w:left w:val="nil" w:color="FFFFFF" w:sz="0"/>
+              <w:bottom w:val="single" w:color="C7C7C7" w:sz="4"/>
+              <w:right w:val="nil" w:color="FFFFFF" w:sz="0"/>
+            </w:tcBorders>
+            <w:tcMar>
+              <w:top w:type="dxa" w:w="216"/>
+              <w:left w:type="dxa" w:w="115"/>
+              <w:bottom w:type="dxa" w:w="216"/>
+              <w:right w:type="dxa" w:w="115"/>
+            </w:tcMar>
+            <w:vAlign w:val="center"/>
+          </w:tcPr>
+          <w:p>
+            <w:pPr>
+              <w:spacing w:after="0" w:line="340"/>
+            </w:pPr>
+            <w:r>
+              <w:rPr>
+                <w:rFonts w:ascii="Arial" w:cs="Arial" w:eastAsia="Arial" w:hAnsi="Arial"/>
+                <w:color w:val="1D2021"/>
+                <w:sz w:val="18"/>
+                <w:szCs w:val="18"/>
+              </w:rPr>
+              <w:t xml:space="preserve">{company_name}</w:t>
+            </w:r>
+          </w:p>
+        </w:tc>
+      </w:tr>
+      <w:tr>
+        <w:trPr>
+          <w:trHeight w:val="690" w:hRule="atLeast"/>
+        </w:trPr>
+        <w:tc>
+          <w:tcPr>
+            <w:tcBorders>
+              <w:top w:val="nil" w:color="FFFFFF" w:sz="0"/>
+              <w:left w:val="nil" w:color="FFFFFF" w:sz="0"/>
+              <w:bottom w:val="nil" w:color="FFFFFF" w:sz="0"/>
+              <w:right w:val="nil" w:color="FFFFFF" w:sz="0"/>
+            </w:tcBorders>
+            <w:tcMar>
+              <w:top w:type="dxa" w:w="216"/>
+              <w:left w:type="dxa" w:w="115"/>
+              <w:bottom w:type="dxa" w:w="216"/>
+              <w:right w:type="dxa" w:w="115"/>
+            </w:tcMar>
+            <w:vAlign w:val="center"/>
+          </w:tcPr>
+          <w:p>
+            <w:pPr>
+              <w:spacing w:after="0" w:line="340"/>
+            </w:pPr>
+            <w:r>
+              <w:rPr>
+                <w:rFonts w:ascii="Arial" w:cs="Arial" w:eastAsia="Arial" w:hAnsi="Arial"/>
+                <w:b/>
+                <w:bCs/>
+                <w:color w:val="1D2021"/>
+                <w:sz w:val="18"/>
+                <w:szCs w:val="18"/>
+              </w:rPr>
+              <w:t xml:space="preserve">Title</w:t>
+            </w:r>
+          </w:p>
+        </w:tc>
+        <w:tc>
+          <w:tcPr>
+            <w:tcBorders>
+              <w:top w:val="single" w:color="C7C7C7" w:sz="4"/>
+              <w:left w:val="nil" w:color="FFFFFF" w:sz="0"/>
+              <w:bottom w:val="single" w:color="C7C7C7" w:sz="4"/>
+              <w:right w:val="nil" w:color="FFFFFF" w:sz="0"/>
+            </w:tcBorders>
+            <w:tcMar>
+              <w:top w:type="dxa" w:w="216"/>
+              <w:left w:type="dxa" w:w="115"/>
+              <w:bottom w:type="dxa" w:w="216"/>
+              <w:right w:type="dxa" w:w="115"/>
+            </w:tcMar>
+            <w:vAlign w:val="center"/>
+          </w:tcPr>
+          <w:p>
+            <w:pPr>
+              <w:spacing w:after="0" w:line="340"/>
+            </w:pPr>
+            <w:r>
+              <w:rPr>
+                <w:rFonts w:ascii="Arial" w:cs="Arial" w:eastAsia="Arial" w:hAnsi="Arial"/>
+                <w:color w:val="1D2021"/>
+                <w:sz w:val="18"/>
+                <w:szCs w:val="18"/>
+              </w:rPr>
+              <w:t xml:space="preserve"/>
+            </w:r>
+          </w:p>
+        </w:tc>
+      </w:tr>
+      <w:tr>
+        <w:trPr>
+          <w:trHeight w:val="690" w:hRule="atLeast"/>
+        </w:trPr>
+        <w:tc>
+          <w:tcPr>
+            <w:tcBorders>
+              <w:top w:val="nil" w:color="FFFFFF" w:sz="0"/>
+              <w:left w:val="nil" w:color="FFFFFF" w:sz="0"/>
+              <w:bottom w:val="nil" w:color="FFFFFF" w:sz="0"/>
+              <w:right w:val="nil" w:color="FFFFFF" w:sz="0"/>
+            </w:tcBorders>
+            <w:tcMar>
+              <w:top w:type="dxa" w:w="216"/>
+              <w:left w:type="dxa" w:w="115"/>
+              <w:bottom w:type="dxa" w:w="216"/>
+              <w:right w:type="dxa" w:w="115"/>
+            </w:tcMar>
+            <w:vAlign w:val="center"/>
+          </w:tcPr>
+          <w:p>
+            <w:pPr>
+              <w:spacing w:after="0" w:line="340"/>
+            </w:pPr>
+            <w:r>
+              <w:rPr>
+                <w:rFonts w:ascii="Arial" w:cs="Arial" w:eastAsia="Arial" w:hAnsi="Arial"/>
+                <w:b/>
+                <w:bCs/>
+                <w:color w:val="1D2021"/>
+                <w:sz w:val="18"/>
+                <w:szCs w:val="18"/>
+              </w:rPr>
+              <w:t xml:space="preserve">Date</w:t>
+            </w:r>
+          </w:p>
+        </w:tc>
+        <w:tc>
+          <w:tcPr>
+            <w:tcBorders>
+              <w:top w:val="single" w:color="C7C7C7" w:sz="4"/>
+              <w:left w:val="nil" w:color="FFFFFF" w:sz="0"/>
+              <w:bottom w:val="single" w:color="C7C7C7" w:sz="4"/>
+              <w:right w:val="nil" w:color="FFFFFF" w:sz="0"/>
+            </w:tcBorders>
+            <w:tcMar>
+              <w:top w:type="dxa" w:w="216"/>
+              <w:left w:type="dxa" w:w="115"/>
+              <w:bottom w:type="dxa" w:w="216"/>
+              <w:right w:type="dxa" w:w="115"/>
+            </w:tcMar>
+            <w:vAlign w:val="center"/>
+          </w:tcPr>
+          <w:p>
+            <w:pPr>
+              <w:spacing w:after="0" w:line="340"/>
+            </w:pPr>
+            <w:r>
+              <w:rPr>
+                <w:rFonts w:ascii="Arial" w:cs="Arial" w:eastAsia="Arial" w:hAnsi="Arial"/>
+                <w:color w:val="1D2021"/>
+                <w:sz w:val="18"/>
+                <w:szCs w:val="18"/>
+              </w:rPr>
+              <w:t xml:space="preserve"/>
+            </w:r>
+          </w:p>
+        </w:tc>
+      </w:tr>
+    </w:tbl>
+    <w:p>
+      <w:pPr>
+        <w:spacing w:after="280" w:before="0" w:line="340"/>
+      </w:pPr>
+      <w:r>
+        <w:t xml:space="preserve"/>
+      </w:r>
+    </w:p>
+    <w:tbl>
+      <w:tblPr>
+        <w:tblW w:type="dxa" w:w="10070"/>
+        <w:tblBorders>
+          <w:top w:val="nil" w:color="FFFFFF" w:sz="0"/>
+          <w:left w:val="nil" w:color="FFFFFF" w:sz="0"/>
+          <w:bottom w:val="nil" w:color="FFFFFF" w:sz="0"/>
+          <w:right w:val="nil" w:color="FFFFFF" w:sz="0"/>
+          <w:insideH w:val="single" w:color="auto" w:sz="4"/>
+          <w:insideV w:val="single" w:color="auto" w:sz="4"/>
+        </w:tblBorders>
+        <w:tblLayout w:type="fixed"/>
+      </w:tblPr>
+      <w:tblGrid>
+        <w:gridCol w:w="2605"/>
+        <w:gridCol w:w="7465"/>
+      </w:tblGrid>
+      <w:tr>
+        <w:tc>
+          <w:tcPr>
+            <w:tcBorders>
+              <w:top w:val="nil" w:color="FFFFFF" w:sz="0"/>
+              <w:left w:val="nil" w:color="FFFFFF" w:sz="0"/>
+              <w:bottom w:val="nil" w:color="FFFFFF" w:sz="0"/>
+              <w:right w:val="nil" w:color="FFFFFF" w:sz="0"/>
+            </w:tcBorders>
+            <w:tcMar>
+              <w:top w:type="dxa" w:w="216"/>
+              <w:left w:type="dxa" w:w="115"/>
+              <w:bottom w:type="dxa" w:w="216"/>
+              <w:right w:type="dxa" w:w="115"/>
+            </w:tcMar>
+            <w:vAlign w:val="center"/>
+          </w:tcPr>
+          <w:p>
+            <w:pPr>
+              <w:spacing w:after="0" w:line="340"/>
+            </w:pPr>
+            <w:r>
+              <w:rPr>
+                <w:rFonts w:ascii="Arial" w:cs="Arial" w:eastAsia="Arial" w:hAnsi="Arial"/>
+                <w:b/>
+                <w:bCs/>
+                <w:color w:val="1D2021"/>
+                <w:sz w:val="18"/>
+                <w:szCs w:val="18"/>
+              </w:rPr>
               <w:t xml:space="preserve"/>
             </w:r>
           </w:p>
@@ -1717,59 +2030,6 @@
             </w:r>
           </w:p>
         </w:tc>
-        <w:tc>
-          <w:tcPr>
-            <w:tcBorders>
-              <w:top w:val="nil" w:color="FFFFFF" w:sz="0"/>
-              <w:left w:val="nil" w:color="FFFFFF" w:sz="0"/>
-              <w:bottom w:val="nil" w:color="FFFFFF" w:sz="0"/>
-              <w:right w:val="nil" w:color="FFFFFF" w:sz="0"/>
-            </w:tcBorders>
-            <w:tcMar>
-              <w:top w:type="dxa" w:w="216"/>
-              <w:left w:type="dxa" w:w="0"/>
-              <w:bottom w:type="dxa" w:w="216"/>
-              <w:right w:type="dxa" w:w="0"/>
-            </w:tcMar>
-            <w:vAlign w:val="center"/>
-          </w:tcPr>
-          <w:p>
-            <w:r>
-              <w:t xml:space="preserve"/>
-            </w:r>
-          </w:p>
-        </w:tc>
-        <w:tc>
-          <w:tcPr>
-            <w:tcBorders>
-              <w:top w:val="single" w:color="C7C7C7" w:sz="4"/>
-              <w:left w:val="nil" w:color="FFFFFF" w:sz="0"/>
-              <w:bottom w:val="single" w:color="C7C7C7" w:sz="4"/>
-              <w:right w:val="nil" w:color="FFFFFF" w:sz="0"/>
-            </w:tcBorders>
-            <w:tcMar>
-              <w:top w:type="dxa" w:w="216"/>
-              <w:left w:type="dxa" w:w="115"/>
-              <w:bottom w:type="dxa" w:w="216"/>
-              <w:right w:type="dxa" w:w="115"/>
-            </w:tcMar>
-            <w:vAlign w:val="center"/>
-          </w:tcPr>
-          <w:p>
-            <w:pPr>
-              <w:spacing w:after="0" w:line="340"/>
-            </w:pPr>
-            <w:r>
-              <w:rPr>
-                <w:rFonts w:ascii="Arial" w:cs="Arial" w:eastAsia="Arial" w:hAnsi="Arial"/>
-                <w:color w:val="1D2021"/>
-                <w:sz w:val="18"/>
-                <w:szCs w:val="18"/>
-              </w:rPr>
-              <w:t xml:space="preserve"/>
-            </w:r>
-          </w:p>
-        </w:tc>
       </w:tr>
       <w:tr>
         <w:trPr>
@@ -1835,59 +2095,6 @@
                 <w:sz w:val="18"/>
                 <w:szCs w:val="18"/>
               </w:rPr>
-              <w:t xml:space="preserve">{company_name}</w:t>
-            </w:r>
-          </w:p>
-        </w:tc>
-        <w:tc>
-          <w:tcPr>
-            <w:tcBorders>
-              <w:top w:val="nil" w:color="FFFFFF" w:sz="0"/>
-              <w:left w:val="nil" w:color="FFFFFF" w:sz="0"/>
-              <w:bottom w:val="nil" w:color="FFFFFF" w:sz="0"/>
-              <w:right w:val="nil" w:color="FFFFFF" w:sz="0"/>
-            </w:tcBorders>
-            <w:tcMar>
-              <w:top w:type="dxa" w:w="216"/>
-              <w:left w:type="dxa" w:w="0"/>
-              <w:bottom w:type="dxa" w:w="216"/>
-              <w:right w:type="dxa" w:w="0"/>
-            </w:tcMar>
-            <w:vAlign w:val="center"/>
-          </w:tcPr>
-          <w:p>
-            <w:r>
-              <w:t xml:space="preserve"/>
-            </w:r>
-          </w:p>
-        </w:tc>
-        <w:tc>
-          <w:tcPr>
-            <w:tcBorders>
-              <w:top w:val="single" w:color="C7C7C7" w:sz="4"/>
-              <w:left w:val="nil" w:color="FFFFFF" w:sz="0"/>
-              <w:bottom w:val="single" w:color="C7C7C7" w:sz="4"/>
-              <w:right w:val="nil" w:color="FFFFFF" w:sz="0"/>
-            </w:tcBorders>
-            <w:tcMar>
-              <w:top w:type="dxa" w:w="216"/>
-              <w:left w:type="dxa" w:w="115"/>
-              <w:bottom w:type="dxa" w:w="216"/>
-              <w:right w:type="dxa" w:w="115"/>
-            </w:tcMar>
-            <w:vAlign w:val="center"/>
-          </w:tcPr>
-          <w:p>
-            <w:pPr>
-              <w:spacing w:after="0" w:line="340"/>
-            </w:pPr>
-            <w:r>
-              <w:rPr>
-                <w:rFonts w:ascii="Arial" w:cs="Arial" w:eastAsia="Arial" w:hAnsi="Arial"/>
-                <w:color w:val="1D2021"/>
-                <w:sz w:val="18"/>
-                <w:szCs w:val="18"/>
-              </w:rPr>
               <w:t xml:space="preserve">{employee_name}</w:t>
             </w:r>
           </w:p>
@@ -1926,182 +2133,7 @@
                 <w:sz w:val="18"/>
                 <w:szCs w:val="18"/>
               </w:rPr>
-              <w:t xml:space="preserve">Title</w:t>
-            </w:r>
-          </w:p>
-        </w:tc>
-        <w:tc>
-          <w:tcPr>
-            <w:tcBorders>
-              <w:top w:val="single" w:color="C7C7C7" w:sz="4"/>
-              <w:left w:val="nil" w:color="FFFFFF" w:sz="0"/>
-              <w:bottom w:val="single" w:color="C7C7C7" w:sz="4"/>
-              <w:right w:val="nil" w:color="FFFFFF" w:sz="0"/>
-            </w:tcBorders>
-            <w:tcMar>
-              <w:top w:type="dxa" w:w="216"/>
-              <w:left w:type="dxa" w:w="115"/>
-              <w:bottom w:type="dxa" w:w="216"/>
-              <w:right w:type="dxa" w:w="115"/>
-            </w:tcMar>
-            <w:vAlign w:val="center"/>
-          </w:tcPr>
-          <w:p>
-            <w:pPr>
-              <w:spacing w:after="0" w:line="340"/>
-            </w:pPr>
-            <w:r>
-              <w:rPr>
-                <w:rFonts w:ascii="Arial" w:cs="Arial" w:eastAsia="Arial" w:hAnsi="Arial"/>
-                <w:color w:val="1D2021"/>
-                <w:sz w:val="18"/>
-                <w:szCs w:val="18"/>
-              </w:rPr>
-              <w:t xml:space="preserve"/>
-            </w:r>
-          </w:p>
-        </w:tc>
-        <w:tc>
-          <w:tcPr>
-            <w:tcBorders>
-              <w:top w:val="nil" w:color="FFFFFF" w:sz="0"/>
-              <w:left w:val="nil" w:color="FFFFFF" w:sz="0"/>
-              <w:bottom w:val="nil" w:color="FFFFFF" w:sz="0"/>
-              <w:right w:val="nil" w:color="FFFFFF" w:sz="0"/>
-            </w:tcBorders>
-            <w:tcMar>
-              <w:top w:type="dxa" w:w="216"/>
-              <w:left w:type="dxa" w:w="0"/>
-              <w:bottom w:type="dxa" w:w="216"/>
-              <w:right w:type="dxa" w:w="0"/>
-            </w:tcMar>
-            <w:vAlign w:val="center"/>
-          </w:tcPr>
-          <w:p>
-            <w:r>
-              <w:t xml:space="preserve"/>
-            </w:r>
-          </w:p>
-        </w:tc>
-        <w:tc>
-          <w:tcPr>
-            <w:tcBorders>
-              <w:top w:val="single" w:color="C7C7C7" w:sz="4"/>
-              <w:left w:val="nil" w:color="FFFFFF" w:sz="0"/>
-              <w:bottom w:val="single" w:color="C7C7C7" w:sz="4"/>
-              <w:right w:val="nil" w:color="FFFFFF" w:sz="0"/>
-            </w:tcBorders>
-            <w:tcMar>
-              <w:top w:type="dxa" w:w="216"/>
-              <w:left w:type="dxa" w:w="115"/>
-              <w:bottom w:type="dxa" w:w="216"/>
-              <w:right w:type="dxa" w:w="115"/>
-            </w:tcMar>
-            <w:vAlign w:val="center"/>
-          </w:tcPr>
-          <w:p>
-            <w:pPr>
-              <w:spacing w:after="0" w:line="340"/>
-            </w:pPr>
-            <w:r>
-              <w:rPr>
-                <w:rFonts w:ascii="Arial" w:cs="Arial" w:eastAsia="Arial" w:hAnsi="Arial"/>
-                <w:color w:val="1D2021"/>
-                <w:sz w:val="18"/>
-                <w:szCs w:val="18"/>
-              </w:rPr>
-              <w:t xml:space="preserve"/>
-            </w:r>
-          </w:p>
-        </w:tc>
-      </w:tr>
-      <w:tr>
-        <w:trPr>
-          <w:trHeight w:val="690" w:hRule="atLeast"/>
-        </w:trPr>
-        <w:tc>
-          <w:tcPr>
-            <w:tcBorders>
-              <w:top w:val="nil" w:color="FFFFFF" w:sz="0"/>
-              <w:left w:val="nil" w:color="FFFFFF" w:sz="0"/>
-              <w:bottom w:val="nil" w:color="FFFFFF" w:sz="0"/>
-              <w:right w:val="nil" w:color="FFFFFF" w:sz="0"/>
-            </w:tcBorders>
-            <w:tcMar>
-              <w:top w:type="dxa" w:w="216"/>
-              <w:left w:type="dxa" w:w="115"/>
-              <w:bottom w:type="dxa" w:w="216"/>
-              <w:right w:type="dxa" w:w="115"/>
-            </w:tcMar>
-            <w:vAlign w:val="center"/>
-          </w:tcPr>
-          <w:p>
-            <w:pPr>
-              <w:spacing w:after="0" w:line="340"/>
-            </w:pPr>
-            <w:r>
-              <w:rPr>
-                <w:rFonts w:ascii="Arial" w:cs="Arial" w:eastAsia="Arial" w:hAnsi="Arial"/>
-                <w:b/>
-                <w:bCs/>
-                <w:color w:val="1D2021"/>
-                <w:sz w:val="18"/>
-                <w:szCs w:val="18"/>
-              </w:rPr>
               <w:t xml:space="preserve">Date</w:t>
-            </w:r>
-          </w:p>
-        </w:tc>
-        <w:tc>
-          <w:tcPr>
-            <w:tcBorders>
-              <w:top w:val="single" w:color="C7C7C7" w:sz="4"/>
-              <w:left w:val="nil" w:color="FFFFFF" w:sz="0"/>
-              <w:bottom w:val="single" w:color="C7C7C7" w:sz="4"/>
-              <w:right w:val="nil" w:color="FFFFFF" w:sz="0"/>
-            </w:tcBorders>
-            <w:tcMar>
-              <w:top w:type="dxa" w:w="216"/>
-              <w:left w:type="dxa" w:w="115"/>
-              <w:bottom w:type="dxa" w:w="216"/>
-              <w:right w:type="dxa" w:w="115"/>
-            </w:tcMar>
-            <w:vAlign w:val="center"/>
-          </w:tcPr>
-          <w:p>
-            <w:pPr>
-              <w:spacing w:after="0" w:line="340"/>
-            </w:pPr>
-            <w:r>
-              <w:rPr>
-                <w:rFonts w:ascii="Arial" w:cs="Arial" w:eastAsia="Arial" w:hAnsi="Arial"/>
-                <w:color w:val="1D2021"/>
-                <w:sz w:val="18"/>
-                <w:szCs w:val="18"/>
-              </w:rPr>
-              <w:t xml:space="preserve"/>
-            </w:r>
-          </w:p>
-        </w:tc>
-        <w:tc>
-          <w:tcPr>
-            <w:tcBorders>
-              <w:top w:val="nil" w:color="FFFFFF" w:sz="0"/>
-              <w:left w:val="nil" w:color="FFFFFF" w:sz="0"/>
-              <w:bottom w:val="nil" w:color="FFFFFF" w:sz="0"/>
-              <w:right w:val="nil" w:color="FFFFFF" w:sz="0"/>
-            </w:tcBorders>
-            <w:tcMar>
-              <w:top w:type="dxa" w:w="216"/>
-              <w:left w:type="dxa" w:w="0"/>
-              <w:bottom w:type="dxa" w:w="216"/>
-              <w:right w:type="dxa" w:w="0"/>
-            </w:tcMar>
-            <w:vAlign w:val="center"/>
-          </w:tcPr>
-          <w:p>
-            <w:r>
-              <w:t xml:space="preserve"/>
             </w:r>
           </w:p>
         </w:tc>

</xml_diff>

<commit_message>
fix(signature): individual signer header — black left-aligned label, single signature line
Make the individual (non-entity) signer block consistent with the entity block
and remove the confusing double rule:

- The party label (e.g. EMPLOYEE) now renders left-aligned, bold, black caps in
  the label column — matching the entity block's header — instead of the old
  centered, muted, right-column treatment.
- Drop the hairline immediately under the party label: the header cell carries
  no rule and the first ruled row (Signature) drops its top border, leaving only
  the single ruled line the party actually signs on.

Renderer-only change (cover-standard-signature-v1.mjs); regenerated the five
cover-standard template.docx + preview PNGs. Entity block unchanged.

Follow-up to #474/#475.
</commit_message>
<xml_diff>
--- a/content/templates/openagreements-employee-ip-inventions-assignment/template.docx
+++ b/content/templates/openagreements-employee-ip-inventions-assignment/template.docx
@@ -1960,42 +1960,39 @@
                 <w:sz w:val="18"/>
                 <w:szCs w:val="18"/>
               </w:rPr>
+              <w:t xml:space="preserve">EMPLOYEE</w:t>
+            </w:r>
+          </w:p>
+        </w:tc>
+        <w:tc>
+          <w:tcPr>
+            <w:tcBorders>
+              <w:top w:val="nil" w:color="FFFFFF" w:sz="0"/>
+              <w:left w:val="nil" w:color="FFFFFF" w:sz="0"/>
+              <w:bottom w:val="nil" w:color="FFFFFF" w:sz="0"/>
+              <w:right w:val="nil" w:color="FFFFFF" w:sz="0"/>
+            </w:tcBorders>
+            <w:tcMar>
+              <w:top w:type="dxa" w:w="216"/>
+              <w:left w:type="dxa" w:w="115"/>
+              <w:bottom w:type="dxa" w:w="216"/>
+              <w:right w:type="dxa" w:w="115"/>
+            </w:tcMar>
+            <w:vAlign w:val="center"/>
+          </w:tcPr>
+          <w:p>
+            <w:pPr>
+              <w:pStyle w:val="Normal"/>
+              <w:spacing w:after="0" w:line="340"/>
+            </w:pPr>
+            <w:r>
+              <w:rPr>
+                <w:rFonts w:ascii="Arial" w:cs="Arial" w:eastAsia="Arial" w:hAnsi="Arial"/>
+                <w:color w:val="1D2021"/>
+                <w:sz w:val="18"/>
+                <w:szCs w:val="18"/>
+              </w:rPr>
               <w:t xml:space="preserve"/>
-            </w:r>
-          </w:p>
-        </w:tc>
-        <w:tc>
-          <w:tcPr>
-            <w:tcBorders>
-              <w:top w:val="nil" w:color="FFFFFF" w:sz="0"/>
-              <w:left w:val="nil" w:color="FFFFFF" w:sz="0"/>
-              <w:bottom w:val="nil" w:color="FFFFFF" w:sz="0"/>
-              <w:right w:val="nil" w:color="FFFFFF" w:sz="0"/>
-            </w:tcBorders>
-            <w:tcMar>
-              <w:top w:type="dxa" w:w="216"/>
-              <w:left w:type="dxa" w:w="115"/>
-              <w:bottom w:type="dxa" w:w="120"/>
-              <w:right w:type="dxa" w:w="115"/>
-            </w:tcMar>
-            <w:vAlign w:val="center"/>
-          </w:tcPr>
-          <w:p>
-            <w:pPr>
-              <w:pStyle w:val="Normal"/>
-              <w:spacing w:after="0" w:line="340"/>
-              <w:jc w:val="center"/>
-            </w:pPr>
-            <w:r>
-              <w:rPr>
-                <w:rFonts w:ascii="Arial" w:cs="Arial" w:eastAsia="Arial" w:hAnsi="Arial"/>
-                <w:b/>
-                <w:bCs/>
-                <w:color w:val="8C8D8E"/>
-                <w:sz w:val="16"/>
-                <w:szCs w:val="16"/>
-              </w:rPr>
-              <w:t xml:space="preserve">EMPLOYEE</w:t>
             </w:r>
           </w:p>
         </w:tc>
@@ -2041,7 +2038,7 @@
         <w:tc>
           <w:tcPr>
             <w:tcBorders>
-              <w:top w:val="single" w:color="C7C7C7" w:sz="4"/>
+              <w:top w:val="nil" w:color="FFFFFF" w:sz="0"/>
               <w:left w:val="nil" w:color="FFFFFF" w:sz="0"/>
               <w:bottom w:val="single" w:color="C7C7C7" w:sz="4"/>
               <w:right w:val="nil" w:color="FFFFFF" w:sz="0"/>

</xml_diff>

<commit_message>
fix(signature): tighten signature-block vertical spacing (was too airy)
The signature rows were loosely spaced — roughly double the intended vertical
rhythm. Halve it via renderer layout constants in cover-standard-signature-v1.mjs
(kept out of the shared style profile so the change doesn't fan the
preview-freshness trigger to non-signature templates):

- cell top/bottom padding 216 -> 80 twips
- in-cell line height 340 -> 264 twips
- non-signing row height 690 -> 340 twips (ATLEAST)
- signing row height 864 -> 500 twips (ATLEAST; still taller than other rows)

Applies to every cover-standard signature block (entity + individual + the
legacy two-party shell). Regenerated the five affected template.docx + preview
PNGs; updated the row-height regression assertion.
</commit_message>
<xml_diff>
--- a/content/templates/openagreements-employee-ip-inventions-assignment/template.docx
+++ b/content/templates/openagreements-employee-ip-inventions-assignment/template.docx
@@ -1558,17 +1558,17 @@
               <w:right w:val="nil" w:color="FFFFFF" w:sz="0"/>
             </w:tcBorders>
             <w:tcMar>
-              <w:top w:type="dxa" w:w="216"/>
-              <w:left w:type="dxa" w:w="115"/>
-              <w:bottom w:type="dxa" w:w="216"/>
-              <w:right w:type="dxa" w:w="115"/>
-            </w:tcMar>
-            <w:vAlign w:val="center"/>
-          </w:tcPr>
-          <w:p>
-            <w:pPr>
-              <w:pStyle w:val="Normal"/>
-              <w:spacing w:after="0" w:line="340"/>
+              <w:top w:type="dxa" w:w="80"/>
+              <w:left w:type="dxa" w:w="115"/>
+              <w:bottom w:type="dxa" w:w="80"/>
+              <w:right w:type="dxa" w:w="115"/>
+            </w:tcMar>
+            <w:vAlign w:val="center"/>
+          </w:tcPr>
+          <w:p>
+            <w:pPr>
+              <w:pStyle w:val="Normal"/>
+              <w:spacing w:after="0" w:line="264"/>
             </w:pPr>
             <w:r>
               <w:rPr>
@@ -1592,17 +1592,17 @@
               <w:right w:val="nil" w:color="FFFFFF" w:sz="0"/>
             </w:tcBorders>
             <w:tcMar>
-              <w:top w:type="dxa" w:w="216"/>
-              <w:left w:type="dxa" w:w="115"/>
-              <w:bottom w:type="dxa" w:w="120"/>
-              <w:right w:type="dxa" w:w="115"/>
-            </w:tcMar>
-            <w:vAlign w:val="center"/>
-          </w:tcPr>
-          <w:p>
-            <w:pPr>
-              <w:pStyle w:val="Normal"/>
-              <w:spacing w:after="0" w:line="340"/>
+              <w:top w:type="dxa" w:w="80"/>
+              <w:left w:type="dxa" w:w="115"/>
+              <w:bottom w:type="dxa" w:w="48"/>
+              <w:right w:type="dxa" w:w="115"/>
+            </w:tcMar>
+            <w:vAlign w:val="center"/>
+          </w:tcPr>
+          <w:p>
+            <w:pPr>
+              <w:pStyle w:val="Normal"/>
+              <w:spacing w:after="0" w:line="264"/>
             </w:pPr>
             <w:r>
               <w:rPr>
@@ -1620,7 +1620,7 @@
       </w:tr>
       <w:tr>
         <w:trPr>
-          <w:trHeight w:val="864" w:hRule="atLeast"/>
+          <w:trHeight w:val="500" w:hRule="atLeast"/>
         </w:trPr>
         <w:tc>
           <w:tcPr>
@@ -1631,17 +1631,17 @@
               <w:right w:val="nil" w:color="FFFFFF" w:sz="0"/>
             </w:tcBorders>
             <w:tcMar>
-              <w:top w:type="dxa" w:w="216"/>
-              <w:left w:type="dxa" w:w="115"/>
-              <w:bottom w:type="dxa" w:w="216"/>
-              <w:right w:type="dxa" w:w="115"/>
-            </w:tcMar>
-            <w:vAlign w:val="center"/>
-          </w:tcPr>
-          <w:p>
-            <w:pPr>
-              <w:pStyle w:val="Normal"/>
-              <w:spacing w:after="0" w:line="340"/>
+              <w:top w:type="dxa" w:w="80"/>
+              <w:left w:type="dxa" w:w="115"/>
+              <w:bottom w:type="dxa" w:w="80"/>
+              <w:right w:type="dxa" w:w="115"/>
+            </w:tcMar>
+            <w:vAlign w:val="center"/>
+          </w:tcPr>
+          <w:p>
+            <w:pPr>
+              <w:pStyle w:val="Normal"/>
+              <w:spacing w:after="0" w:line="264"/>
             </w:pPr>
             <w:r>
               <w:rPr>
@@ -1665,17 +1665,17 @@
               <w:right w:val="nil" w:color="FFFFFF" w:sz="0"/>
             </w:tcBorders>
             <w:tcMar>
-              <w:top w:type="dxa" w:w="216"/>
-              <w:left w:type="dxa" w:w="115"/>
-              <w:bottom w:type="dxa" w:w="216"/>
-              <w:right w:type="dxa" w:w="115"/>
-            </w:tcMar>
-            <w:vAlign w:val="center"/>
-          </w:tcPr>
-          <w:p>
-            <w:pPr>
-              <w:pStyle w:val="Normal"/>
-              <w:spacing w:after="0" w:line="340"/>
+              <w:top w:type="dxa" w:w="80"/>
+              <w:left w:type="dxa" w:w="115"/>
+              <w:bottom w:type="dxa" w:w="80"/>
+              <w:right w:type="dxa" w:w="115"/>
+            </w:tcMar>
+            <w:vAlign w:val="center"/>
+          </w:tcPr>
+          <w:p>
+            <w:pPr>
+              <w:pStyle w:val="Normal"/>
+              <w:spacing w:after="0" w:line="264"/>
             </w:pPr>
             <w:r>
               <w:rPr>
@@ -1691,7 +1691,7 @@
       </w:tr>
       <w:tr>
         <w:trPr>
-          <w:trHeight w:val="690" w:hRule="atLeast"/>
+          <w:trHeight w:val="340" w:hRule="atLeast"/>
         </w:trPr>
         <w:tc>
           <w:tcPr>
@@ -1702,17 +1702,17 @@
               <w:right w:val="nil" w:color="FFFFFF" w:sz="0"/>
             </w:tcBorders>
             <w:tcMar>
-              <w:top w:type="dxa" w:w="216"/>
-              <w:left w:type="dxa" w:w="115"/>
-              <w:bottom w:type="dxa" w:w="216"/>
-              <w:right w:type="dxa" w:w="115"/>
-            </w:tcMar>
-            <w:vAlign w:val="center"/>
-          </w:tcPr>
-          <w:p>
-            <w:pPr>
-              <w:pStyle w:val="Normal"/>
-              <w:spacing w:after="0" w:line="340"/>
+              <w:top w:type="dxa" w:w="80"/>
+              <w:left w:type="dxa" w:w="115"/>
+              <w:bottom w:type="dxa" w:w="80"/>
+              <w:right w:type="dxa" w:w="115"/>
+            </w:tcMar>
+            <w:vAlign w:val="center"/>
+          </w:tcPr>
+          <w:p>
+            <w:pPr>
+              <w:pStyle w:val="Normal"/>
+              <w:spacing w:after="0" w:line="264"/>
             </w:pPr>
             <w:r>
               <w:rPr>
@@ -1736,17 +1736,17 @@
               <w:right w:val="nil" w:color="FFFFFF" w:sz="0"/>
             </w:tcBorders>
             <w:tcMar>
-              <w:top w:type="dxa" w:w="216"/>
-              <w:left w:type="dxa" w:w="115"/>
-              <w:bottom w:type="dxa" w:w="216"/>
-              <w:right w:type="dxa" w:w="115"/>
-            </w:tcMar>
-            <w:vAlign w:val="center"/>
-          </w:tcPr>
-          <w:p>
-            <w:pPr>
-              <w:pStyle w:val="Normal"/>
-              <w:spacing w:after="0" w:line="340"/>
+              <w:top w:type="dxa" w:w="80"/>
+              <w:left w:type="dxa" w:w="115"/>
+              <w:bottom w:type="dxa" w:w="80"/>
+              <w:right w:type="dxa" w:w="115"/>
+            </w:tcMar>
+            <w:vAlign w:val="center"/>
+          </w:tcPr>
+          <w:p>
+            <w:pPr>
+              <w:pStyle w:val="Normal"/>
+              <w:spacing w:after="0" w:line="264"/>
             </w:pPr>
             <w:r>
               <w:rPr>
@@ -1762,7 +1762,7 @@
       </w:tr>
       <w:tr>
         <w:trPr>
-          <w:trHeight w:val="690" w:hRule="atLeast"/>
+          <w:trHeight w:val="340" w:hRule="atLeast"/>
         </w:trPr>
         <w:tc>
           <w:tcPr>
@@ -1773,17 +1773,17 @@
               <w:right w:val="nil" w:color="FFFFFF" w:sz="0"/>
             </w:tcBorders>
             <w:tcMar>
-              <w:top w:type="dxa" w:w="216"/>
-              <w:left w:type="dxa" w:w="115"/>
-              <w:bottom w:type="dxa" w:w="216"/>
-              <w:right w:type="dxa" w:w="115"/>
-            </w:tcMar>
-            <w:vAlign w:val="center"/>
-          </w:tcPr>
-          <w:p>
-            <w:pPr>
-              <w:pStyle w:val="Normal"/>
-              <w:spacing w:after="0" w:line="340"/>
+              <w:top w:type="dxa" w:w="80"/>
+              <w:left w:type="dxa" w:w="115"/>
+              <w:bottom w:type="dxa" w:w="80"/>
+              <w:right w:type="dxa" w:w="115"/>
+            </w:tcMar>
+            <w:vAlign w:val="center"/>
+          </w:tcPr>
+          <w:p>
+            <w:pPr>
+              <w:pStyle w:val="Normal"/>
+              <w:spacing w:after="0" w:line="264"/>
             </w:pPr>
             <w:r>
               <w:rPr>
@@ -1807,17 +1807,17 @@
               <w:right w:val="nil" w:color="FFFFFF" w:sz="0"/>
             </w:tcBorders>
             <w:tcMar>
-              <w:top w:type="dxa" w:w="216"/>
-              <w:left w:type="dxa" w:w="115"/>
-              <w:bottom w:type="dxa" w:w="216"/>
-              <w:right w:type="dxa" w:w="115"/>
-            </w:tcMar>
-            <w:vAlign w:val="center"/>
-          </w:tcPr>
-          <w:p>
-            <w:pPr>
-              <w:pStyle w:val="Normal"/>
-              <w:spacing w:after="0" w:line="340"/>
+              <w:top w:type="dxa" w:w="80"/>
+              <w:left w:type="dxa" w:w="115"/>
+              <w:bottom w:type="dxa" w:w="80"/>
+              <w:right w:type="dxa" w:w="115"/>
+            </w:tcMar>
+            <w:vAlign w:val="center"/>
+          </w:tcPr>
+          <w:p>
+            <w:pPr>
+              <w:pStyle w:val="Normal"/>
+              <w:spacing w:after="0" w:line="264"/>
             </w:pPr>
             <w:r>
               <w:rPr>
@@ -1833,7 +1833,7 @@
       </w:tr>
       <w:tr>
         <w:trPr>
-          <w:trHeight w:val="690" w:hRule="atLeast"/>
+          <w:trHeight w:val="340" w:hRule="atLeast"/>
         </w:trPr>
         <w:tc>
           <w:tcPr>
@@ -1844,17 +1844,17 @@
               <w:right w:val="nil" w:color="FFFFFF" w:sz="0"/>
             </w:tcBorders>
             <w:tcMar>
-              <w:top w:type="dxa" w:w="216"/>
-              <w:left w:type="dxa" w:w="115"/>
-              <w:bottom w:type="dxa" w:w="216"/>
-              <w:right w:type="dxa" w:w="115"/>
-            </w:tcMar>
-            <w:vAlign w:val="center"/>
-          </w:tcPr>
-          <w:p>
-            <w:pPr>
-              <w:pStyle w:val="Normal"/>
-              <w:spacing w:after="0" w:line="340"/>
+              <w:top w:type="dxa" w:w="80"/>
+              <w:left w:type="dxa" w:w="115"/>
+              <w:bottom w:type="dxa" w:w="80"/>
+              <w:right w:type="dxa" w:w="115"/>
+            </w:tcMar>
+            <w:vAlign w:val="center"/>
+          </w:tcPr>
+          <w:p>
+            <w:pPr>
+              <w:pStyle w:val="Normal"/>
+              <w:spacing w:after="0" w:line="264"/>
             </w:pPr>
             <w:r>
               <w:rPr>
@@ -1878,17 +1878,17 @@
               <w:right w:val="nil" w:color="FFFFFF" w:sz="0"/>
             </w:tcBorders>
             <w:tcMar>
-              <w:top w:type="dxa" w:w="216"/>
-              <w:left w:type="dxa" w:w="115"/>
-              <w:bottom w:type="dxa" w:w="216"/>
-              <w:right w:type="dxa" w:w="115"/>
-            </w:tcMar>
-            <w:vAlign w:val="center"/>
-          </w:tcPr>
-          <w:p>
-            <w:pPr>
-              <w:pStyle w:val="Normal"/>
-              <w:spacing w:after="0" w:line="340"/>
+              <w:top w:type="dxa" w:w="80"/>
+              <w:left w:type="dxa" w:w="115"/>
+              <w:bottom w:type="dxa" w:w="80"/>
+              <w:right w:type="dxa" w:w="115"/>
+            </w:tcMar>
+            <w:vAlign w:val="center"/>
+          </w:tcPr>
+          <w:p>
+            <w:pPr>
+              <w:pStyle w:val="Normal"/>
+              <w:spacing w:after="0" w:line="264"/>
             </w:pPr>
             <w:r>
               <w:rPr>
@@ -1939,17 +1939,17 @@
               <w:right w:val="nil" w:color="FFFFFF" w:sz="0"/>
             </w:tcBorders>
             <w:tcMar>
-              <w:top w:type="dxa" w:w="216"/>
-              <w:left w:type="dxa" w:w="115"/>
-              <w:bottom w:type="dxa" w:w="216"/>
-              <w:right w:type="dxa" w:w="115"/>
-            </w:tcMar>
-            <w:vAlign w:val="center"/>
-          </w:tcPr>
-          <w:p>
-            <w:pPr>
-              <w:pStyle w:val="Normal"/>
-              <w:spacing w:after="0" w:line="340"/>
+              <w:top w:type="dxa" w:w="80"/>
+              <w:left w:type="dxa" w:w="115"/>
+              <w:bottom w:type="dxa" w:w="80"/>
+              <w:right w:type="dxa" w:w="115"/>
+            </w:tcMar>
+            <w:vAlign w:val="center"/>
+          </w:tcPr>
+          <w:p>
+            <w:pPr>
+              <w:pStyle w:val="Normal"/>
+              <w:spacing w:after="0" w:line="264"/>
             </w:pPr>
             <w:r>
               <w:rPr>
@@ -1973,17 +1973,17 @@
               <w:right w:val="nil" w:color="FFFFFF" w:sz="0"/>
             </w:tcBorders>
             <w:tcMar>
-              <w:top w:type="dxa" w:w="216"/>
-              <w:left w:type="dxa" w:w="115"/>
-              <w:bottom w:type="dxa" w:w="216"/>
-              <w:right w:type="dxa" w:w="115"/>
-            </w:tcMar>
-            <w:vAlign w:val="center"/>
-          </w:tcPr>
-          <w:p>
-            <w:pPr>
-              <w:pStyle w:val="Normal"/>
-              <w:spacing w:after="0" w:line="340"/>
+              <w:top w:type="dxa" w:w="80"/>
+              <w:left w:type="dxa" w:w="115"/>
+              <w:bottom w:type="dxa" w:w="80"/>
+              <w:right w:type="dxa" w:w="115"/>
+            </w:tcMar>
+            <w:vAlign w:val="center"/>
+          </w:tcPr>
+          <w:p>
+            <w:pPr>
+              <w:pStyle w:val="Normal"/>
+              <w:spacing w:after="0" w:line="264"/>
             </w:pPr>
             <w:r>
               <w:rPr>
@@ -1999,7 +1999,7 @@
       </w:tr>
       <w:tr>
         <w:trPr>
-          <w:trHeight w:val="864" w:hRule="atLeast"/>
+          <w:trHeight w:val="500" w:hRule="atLeast"/>
         </w:trPr>
         <w:tc>
           <w:tcPr>
@@ -2010,17 +2010,17 @@
               <w:right w:val="nil" w:color="FFFFFF" w:sz="0"/>
             </w:tcBorders>
             <w:tcMar>
-              <w:top w:type="dxa" w:w="216"/>
-              <w:left w:type="dxa" w:w="115"/>
-              <w:bottom w:type="dxa" w:w="216"/>
-              <w:right w:type="dxa" w:w="115"/>
-            </w:tcMar>
-            <w:vAlign w:val="center"/>
-          </w:tcPr>
-          <w:p>
-            <w:pPr>
-              <w:pStyle w:val="Normal"/>
-              <w:spacing w:after="0" w:line="340"/>
+              <w:top w:type="dxa" w:w="80"/>
+              <w:left w:type="dxa" w:w="115"/>
+              <w:bottom w:type="dxa" w:w="80"/>
+              <w:right w:type="dxa" w:w="115"/>
+            </w:tcMar>
+            <w:vAlign w:val="center"/>
+          </w:tcPr>
+          <w:p>
+            <w:pPr>
+              <w:pStyle w:val="Normal"/>
+              <w:spacing w:after="0" w:line="264"/>
             </w:pPr>
             <w:r>
               <w:rPr>
@@ -2044,17 +2044,17 @@
               <w:right w:val="nil" w:color="FFFFFF" w:sz="0"/>
             </w:tcBorders>
             <w:tcMar>
-              <w:top w:type="dxa" w:w="216"/>
-              <w:left w:type="dxa" w:w="115"/>
-              <w:bottom w:type="dxa" w:w="216"/>
-              <w:right w:type="dxa" w:w="115"/>
-            </w:tcMar>
-            <w:vAlign w:val="center"/>
-          </w:tcPr>
-          <w:p>
-            <w:pPr>
-              <w:pStyle w:val="Normal"/>
-              <w:spacing w:after="0" w:line="340"/>
+              <w:top w:type="dxa" w:w="80"/>
+              <w:left w:type="dxa" w:w="115"/>
+              <w:bottom w:type="dxa" w:w="80"/>
+              <w:right w:type="dxa" w:w="115"/>
+            </w:tcMar>
+            <w:vAlign w:val="center"/>
+          </w:tcPr>
+          <w:p>
+            <w:pPr>
+              <w:pStyle w:val="Normal"/>
+              <w:spacing w:after="0" w:line="264"/>
             </w:pPr>
             <w:r>
               <w:rPr>
@@ -2070,7 +2070,7 @@
       </w:tr>
       <w:tr>
         <w:trPr>
-          <w:trHeight w:val="690" w:hRule="atLeast"/>
+          <w:trHeight w:val="340" w:hRule="atLeast"/>
         </w:trPr>
         <w:tc>
           <w:tcPr>
@@ -2081,17 +2081,17 @@
               <w:right w:val="nil" w:color="FFFFFF" w:sz="0"/>
             </w:tcBorders>
             <w:tcMar>
-              <w:top w:type="dxa" w:w="216"/>
-              <w:left w:type="dxa" w:w="115"/>
-              <w:bottom w:type="dxa" w:w="216"/>
-              <w:right w:type="dxa" w:w="115"/>
-            </w:tcMar>
-            <w:vAlign w:val="center"/>
-          </w:tcPr>
-          <w:p>
-            <w:pPr>
-              <w:pStyle w:val="Normal"/>
-              <w:spacing w:after="0" w:line="340"/>
+              <w:top w:type="dxa" w:w="80"/>
+              <w:left w:type="dxa" w:w="115"/>
+              <w:bottom w:type="dxa" w:w="80"/>
+              <w:right w:type="dxa" w:w="115"/>
+            </w:tcMar>
+            <w:vAlign w:val="center"/>
+          </w:tcPr>
+          <w:p>
+            <w:pPr>
+              <w:pStyle w:val="Normal"/>
+              <w:spacing w:after="0" w:line="264"/>
             </w:pPr>
             <w:r>
               <w:rPr>
@@ -2115,17 +2115,17 @@
               <w:right w:val="nil" w:color="FFFFFF" w:sz="0"/>
             </w:tcBorders>
             <w:tcMar>
-              <w:top w:type="dxa" w:w="216"/>
-              <w:left w:type="dxa" w:w="115"/>
-              <w:bottom w:type="dxa" w:w="216"/>
-              <w:right w:type="dxa" w:w="115"/>
-            </w:tcMar>
-            <w:vAlign w:val="center"/>
-          </w:tcPr>
-          <w:p>
-            <w:pPr>
-              <w:pStyle w:val="Normal"/>
-              <w:spacing w:after="0" w:line="340"/>
+              <w:top w:type="dxa" w:w="80"/>
+              <w:left w:type="dxa" w:w="115"/>
+              <w:bottom w:type="dxa" w:w="80"/>
+              <w:right w:type="dxa" w:w="115"/>
+            </w:tcMar>
+            <w:vAlign w:val="center"/>
+          </w:tcPr>
+          <w:p>
+            <w:pPr>
+              <w:pStyle w:val="Normal"/>
+              <w:spacing w:after="0" w:line="264"/>
             </w:pPr>
             <w:r>
               <w:rPr>
@@ -2141,7 +2141,7 @@
       </w:tr>
       <w:tr>
         <w:trPr>
-          <w:trHeight w:val="690" w:hRule="atLeast"/>
+          <w:trHeight w:val="340" w:hRule="atLeast"/>
         </w:trPr>
         <w:tc>
           <w:tcPr>
@@ -2152,17 +2152,17 @@
               <w:right w:val="nil" w:color="FFFFFF" w:sz="0"/>
             </w:tcBorders>
             <w:tcMar>
-              <w:top w:type="dxa" w:w="216"/>
-              <w:left w:type="dxa" w:w="115"/>
-              <w:bottom w:type="dxa" w:w="216"/>
-              <w:right w:type="dxa" w:w="115"/>
-            </w:tcMar>
-            <w:vAlign w:val="center"/>
-          </w:tcPr>
-          <w:p>
-            <w:pPr>
-              <w:pStyle w:val="Normal"/>
-              <w:spacing w:after="0" w:line="340"/>
+              <w:top w:type="dxa" w:w="80"/>
+              <w:left w:type="dxa" w:w="115"/>
+              <w:bottom w:type="dxa" w:w="80"/>
+              <w:right w:type="dxa" w:w="115"/>
+            </w:tcMar>
+            <w:vAlign w:val="center"/>
+          </w:tcPr>
+          <w:p>
+            <w:pPr>
+              <w:pStyle w:val="Normal"/>
+              <w:spacing w:after="0" w:line="264"/>
             </w:pPr>
             <w:r>
               <w:rPr>
@@ -2186,17 +2186,17 @@
               <w:right w:val="nil" w:color="FFFFFF" w:sz="0"/>
             </w:tcBorders>
             <w:tcMar>
-              <w:top w:type="dxa" w:w="216"/>
-              <w:left w:type="dxa" w:w="115"/>
-              <w:bottom w:type="dxa" w:w="216"/>
-              <w:right w:type="dxa" w:w="115"/>
-            </w:tcMar>
-            <w:vAlign w:val="center"/>
-          </w:tcPr>
-          <w:p>
-            <w:pPr>
-              <w:pStyle w:val="Normal"/>
-              <w:spacing w:after="0" w:line="340"/>
+              <w:top w:type="dxa" w:w="80"/>
+              <w:left w:type="dxa" w:w="115"/>
+              <w:bottom w:type="dxa" w:w="80"/>
+              <w:right w:type="dxa" w:w="115"/>
+            </w:tcMar>
+            <w:vAlign w:val="center"/>
+          </w:tcPr>
+          <w:p>
+            <w:pPr>
+              <w:pStyle w:val="Normal"/>
+              <w:spacing w:after="0" w:line="264"/>
             </w:pPr>
             <w:r>
               <w:rPr>

</xml_diff>